<commit_message>
Add alternative text for MATC seal
</commit_message>
<xml_diff>
--- a/docassemble/MAPetitionToSealEviction/data/templates/petition_to_seal_eviction.docx
+++ b/docassemble/MAPetitionToSealEviction/data/templates/petition_to_seal_eviction.docx
@@ -1,6 +1,6 @@
 
 <file path=word/document.xml><?xml version="1.0" encoding="utf-8"?>
-<w:document xmlns:wpc="http://schemas.microsoft.com/office/word/2010/wordprocessingCanvas" xmlns:cx="http://schemas.microsoft.com/office/drawing/2014/chartex" xmlns:cx1="http://schemas.microsoft.com/office/drawing/2015/9/8/chartex" xmlns:cx2="http://schemas.microsoft.com/office/drawing/2015/10/21/chartex" xmlns:cx3="http://schemas.microsoft.com/office/drawing/2016/5/9/chartex" xmlns:cx4="http://schemas.microsoft.com/office/drawing/2016/5/10/chartex" xmlns:cx5="http://schemas.microsoft.com/office/drawing/2016/5/11/chartex" xmlns:cx6="http://schemas.microsoft.com/office/drawing/2016/5/12/chartex" xmlns:cx7="http://schemas.microsoft.com/office/drawing/2016/5/13/chartex" xmlns:cx8="http://schemas.microsoft.com/office/drawing/2016/5/14/chartex" xmlns:mc="http://schemas.openxmlformats.org/markup-compatibility/2006" xmlns:aink="http://schemas.microsoft.com/office/drawing/2016/ink" xmlns:am3d="http://schemas.microsoft.com/office/drawing/2017/model3d" xmlns:o="urn:schemas-microsoft-com:office:office" xmlns:oel="http://schemas.microsoft.com/office/2019/extlst" xmlns:r="http://schemas.openxmlformats.org/officeDocument/2006/relationships" xmlns:m="http://schemas.openxmlformats.org/officeDocument/2006/math" xmlns:v="urn:schemas-microsoft-com:vml" xmlns:wp14="http://schemas.microsoft.com/office/word/2010/wordprocessingDrawing" xmlns:wp="http://schemas.openxmlformats.org/drawingml/2006/wordprocessingDrawing" xmlns:w10="urn:schemas-microsoft-com:office:word" xmlns:w="http://schemas.openxmlformats.org/wordprocessingml/2006/main" xmlns:w14="http://schemas.microsoft.com/office/word/2010/wordml" xmlns:w15="http://schemas.microsoft.com/office/word/2012/wordml" xmlns:w16cex="http://schemas.microsoft.com/office/word/2018/wordml/cex" xmlns:w16cid="http://schemas.microsoft.com/office/word/2016/wordml/cid" xmlns:w16="http://schemas.microsoft.com/office/word/2018/wordml" xmlns:w16du="http://schemas.microsoft.com/office/word/2023/wordml/word16du" xmlns:w16sdtdh="http://schemas.microsoft.com/office/word/2020/wordml/sdtdatahash" xmlns:w16se="http://schemas.microsoft.com/office/word/2015/wordml/symex" xmlns:wpg="http://schemas.microsoft.com/office/word/2010/wordprocessingGroup" xmlns:wpi="http://schemas.microsoft.com/office/word/2010/wordprocessingInk" xmlns:wne="http://schemas.microsoft.com/office/word/2006/wordml" xmlns:wps="http://schemas.microsoft.com/office/word/2010/wordprocessingShape" mc:Ignorable="w14 w15 w16se w16cid w16 w16cex w16sdtdh w16du wp14">
+<w:document xmlns:wpc="http://schemas.microsoft.com/office/word/2010/wordprocessingCanvas" xmlns:cx="http://schemas.microsoft.com/office/drawing/2014/chartex" xmlns:cx1="http://schemas.microsoft.com/office/drawing/2015/9/8/chartex" xmlns:cx2="http://schemas.microsoft.com/office/drawing/2015/10/21/chartex" xmlns:cx3="http://schemas.microsoft.com/office/drawing/2016/5/9/chartex" xmlns:cx4="http://schemas.microsoft.com/office/drawing/2016/5/10/chartex" xmlns:cx5="http://schemas.microsoft.com/office/drawing/2016/5/11/chartex" xmlns:cx6="http://schemas.microsoft.com/office/drawing/2016/5/12/chartex" xmlns:cx7="http://schemas.microsoft.com/office/drawing/2016/5/13/chartex" xmlns:cx8="http://schemas.microsoft.com/office/drawing/2016/5/14/chartex" xmlns:mc="http://schemas.openxmlformats.org/markup-compatibility/2006" xmlns:aink="http://schemas.microsoft.com/office/drawing/2016/ink" xmlns:am3d="http://schemas.microsoft.com/office/drawing/2017/model3d" xmlns:o="urn:schemas-microsoft-com:office:office" xmlns:oel="http://schemas.microsoft.com/office/2019/extlst" xmlns:r="http://schemas.openxmlformats.org/officeDocument/2006/relationships" xmlns:m="http://schemas.openxmlformats.org/officeDocument/2006/math" xmlns:v="urn:schemas-microsoft-com:vml" xmlns:wp14="http://schemas.microsoft.com/office/word/2010/wordprocessingDrawing" xmlns:wp="http://schemas.openxmlformats.org/drawingml/2006/wordprocessingDrawing" xmlns:w10="urn:schemas-microsoft-com:office:word" xmlns:w="http://schemas.openxmlformats.org/wordprocessingml/2006/main" xmlns:w14="http://schemas.microsoft.com/office/word/2010/wordml" xmlns:w15="http://schemas.microsoft.com/office/word/2012/wordml" xmlns:w16cex="http://schemas.microsoft.com/office/word/2018/wordml/cex" xmlns:w16cid="http://schemas.microsoft.com/office/word/2016/wordml/cid" xmlns:w16="http://schemas.microsoft.com/office/word/2018/wordml" xmlns:w16du="http://schemas.microsoft.com/office/word/2023/wordml/word16du" xmlns:w16sdtdh="http://schemas.microsoft.com/office/word/2020/wordml/sdtdatahash" xmlns:w16sdtfl="http://schemas.microsoft.com/office/word/2024/wordml/sdtformatlock" xmlns:w16se="http://schemas.microsoft.com/office/word/2015/wordml/symex" xmlns:wpg="http://schemas.microsoft.com/office/word/2010/wordprocessingGroup" xmlns:wpi="http://schemas.microsoft.com/office/word/2010/wordprocessingInk" xmlns:wne="http://schemas.microsoft.com/office/word/2006/wordml" xmlns:wps="http://schemas.microsoft.com/office/word/2010/wordprocessingShape" mc:Ignorable="w14 w15 w16se w16cid w16 w16cex w16sdtdh w16sdtfl w16du wp14">
   <w:body>
     <w:tbl>
       <w:tblPr>
@@ -14,10 +14,10 @@
         <w:tblLook w:val="01E0" w:firstRow="1" w:lastRow="1" w:firstColumn="1" w:lastColumn="1" w:noHBand="0" w:noVBand="0"/>
       </w:tblPr>
       <w:tblGrid>
-        <w:gridCol w:w="3930"/>
-        <w:gridCol w:w="1965"/>
-        <w:gridCol w:w="1625"/>
-        <w:gridCol w:w="4270"/>
+        <w:gridCol w:w="3910"/>
+        <w:gridCol w:w="1955"/>
+        <w:gridCol w:w="1617"/>
+        <w:gridCol w:w="4248"/>
       </w:tblGrid>
       <w:tr>
         <w:trPr>
@@ -138,32 +138,108 @@
               <w:rPr>
                 <w:noProof/>
               </w:rPr>
-              <w:pict w14:anchorId="347B8ED9">
-                <v:group id="Group 2" o:spid="_x0000_s2050" style="position:absolute;left:0;text-align:left;margin-left:10.9pt;margin-top:2.2pt;width:38.4pt;height:38.2pt;z-index:-251658240;mso-wrap-distance-left:0;mso-wrap-distance-right:0;mso-position-horizontal-relative:text;mso-position-vertical-relative:text" coordsize="487800,485280" o:gfxdata="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">
-                  <v:shapetype id="_x0000_t75" coordsize="21600,21600" o:spt="75" o:preferrelative="t" path="m@4@5l@4@11@9@11@9@5xe" filled="f" stroked="f">
-                    <v:stroke joinstyle="miter"/>
-                    <v:formulas>
-                      <v:f eqn="if lineDrawn pixelLineWidth 0"/>
-                      <v:f eqn="sum @0 1 0"/>
-                      <v:f eqn="sum 0 0 @1"/>
-                      <v:f eqn="prod @2 1 2"/>
-                      <v:f eqn="prod @3 21600 pixelWidth"/>
-                      <v:f eqn="prod @3 21600 pixelHeight"/>
-                      <v:f eqn="sum @0 0 1"/>
-                      <v:f eqn="prod @6 1 2"/>
-                      <v:f eqn="prod @7 21600 pixelWidth"/>
-                      <v:f eqn="sum @8 21600 0"/>
-                      <v:f eqn="prod @7 21600 pixelHeight"/>
-                      <v:f eqn="sum @10 21600 0"/>
-                    </v:formulas>
-                    <v:path o:extrusionok="f" gradientshapeok="t" o:connecttype="rect"/>
-                    <o:lock v:ext="edit" aspectratio="t"/>
-                  </v:shapetype>
-                  <v:shape id="Image 3" o:spid="_x0000_s2051" type="#_x0000_t75" style="position:absolute;width:487800;height:485280;visibility:visible;mso-wrap-style:square" o:gfxdata="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" strokeweight="0">
-                    <v:imagedata r:id="rId8" o:title=""/>
-                  </v:shape>
-                </v:group>
-              </w:pict>
+              <mc:AlternateContent>
+                <mc:Choice Requires="wpg">
+                  <w:drawing>
+                    <wp:anchor distT="0" distB="0" distL="0" distR="0" simplePos="0" relativeHeight="251658240" behindDoc="1" locked="0" layoutInCell="1" allowOverlap="1" wp14:anchorId="347B8ED9" wp14:editId="269E91B4">
+                      <wp:simplePos x="0" y="0"/>
+                      <wp:positionH relativeFrom="column">
+                        <wp:posOffset>138430</wp:posOffset>
+                      </wp:positionH>
+                      <wp:positionV relativeFrom="paragraph">
+                        <wp:posOffset>27940</wp:posOffset>
+                      </wp:positionV>
+                      <wp:extent cx="487680" cy="485140"/>
+                      <wp:effectExtent l="0" t="0" r="0" b="0"/>
+                      <wp:wrapNone/>
+                      <wp:docPr id="1401327765" name="Group 9" descr="Official Seal of the Massachusetts Trial Court">
+                        <a:extLst xmlns:a="http://schemas.openxmlformats.org/drawingml/2006/main">
+                          <a:ext uri="{C183D7F6-B498-43B3-948B-1728B52AA6E4}">
+                            <adec:decorative xmlns:adec="http://schemas.microsoft.com/office/drawing/2017/decorative" val="0"/>
+                          </a:ext>
+                        </a:extLst>
+                      </wp:docPr>
+                      <wp:cNvGraphicFramePr>
+                        <a:graphicFrameLocks xmlns:a="http://schemas.openxmlformats.org/drawingml/2006/main"/>
+                      </wp:cNvGraphicFramePr>
+                      <a:graphic xmlns:a="http://schemas.openxmlformats.org/drawingml/2006/main">
+                        <a:graphicData uri="http://schemas.microsoft.com/office/word/2010/wordprocessingGroup">
+                          <wpg:wgp>
+                            <wpg:cNvGrpSpPr>
+                              <a:grpSpLocks/>
+                            </wpg:cNvGrpSpPr>
+                            <wpg:grpSpPr>
+                              <a:xfrm>
+                                <a:off x="0" y="0"/>
+                                <a:ext cx="487680" cy="485140"/>
+                                <a:chOff x="0" y="0"/>
+                                <a:chExt cx="487800" cy="485280"/>
+                              </a:xfrm>
+                            </wpg:grpSpPr>
+                            <pic:pic xmlns:pic="http://schemas.openxmlformats.org/drawingml/2006/picture">
+                              <pic:nvPicPr>
+                                <pic:cNvPr id="2" name="Image 3"/>
+                                <pic:cNvPicPr/>
+                              </pic:nvPicPr>
+                              <pic:blipFill>
+                                <a:blip r:embed="rId8"/>
+                                <a:stretch/>
+                              </pic:blipFill>
+                              <pic:spPr>
+                                <a:xfrm>
+                                  <a:off x="0" y="0"/>
+                                  <a:ext cx="487800" cy="485280"/>
+                                </a:xfrm>
+                                <a:prstGeom prst="rect">
+                                  <a:avLst/>
+                                </a:prstGeom>
+                                <a:noFill/>
+                                <a:ln w="0">
+                                  <a:noFill/>
+                                </a:ln>
+                              </pic:spPr>
+                            </pic:pic>
+                          </wpg:wgp>
+                        </a:graphicData>
+                      </a:graphic>
+                      <wp14:sizeRelH relativeFrom="page">
+                        <wp14:pctWidth>0</wp14:pctWidth>
+                      </wp14:sizeRelH>
+                      <wp14:sizeRelV relativeFrom="page">
+                        <wp14:pctHeight>0</wp14:pctHeight>
+                      </wp14:sizeRelV>
+                    </wp:anchor>
+                  </w:drawing>
+                </mc:Choice>
+                <mc:Fallback>
+                  <w:pict>
+                    <v:group w14:anchorId="14522C1D" id="Group 9" o:spid="_x0000_s1026" alt="Official Seal of the Massachusetts Trial Court" style="position:absolute;margin-left:10.9pt;margin-top:2.2pt;width:38.4pt;height:38.2pt;z-index:-251658240;mso-wrap-distance-left:0;mso-wrap-distance-right:0" coordsize="487800,485280" o:gfxdata="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">
+                      <v:shapetype id="_x0000_t75" coordsize="21600,21600" o:spt="75" o:preferrelative="t" path="m@4@5l@4@11@9@11@9@5xe" filled="f" stroked="f">
+                        <v:stroke joinstyle="miter"/>
+                        <v:formulas>
+                          <v:f eqn="if lineDrawn pixelLineWidth 0"/>
+                          <v:f eqn="sum @0 1 0"/>
+                          <v:f eqn="sum 0 0 @1"/>
+                          <v:f eqn="prod @2 1 2"/>
+                          <v:f eqn="prod @3 21600 pixelWidth"/>
+                          <v:f eqn="prod @3 21600 pixelHeight"/>
+                          <v:f eqn="sum @0 0 1"/>
+                          <v:f eqn="prod @6 1 2"/>
+                          <v:f eqn="prod @7 21600 pixelWidth"/>
+                          <v:f eqn="sum @8 21600 0"/>
+                          <v:f eqn="prod @7 21600 pixelHeight"/>
+                          <v:f eqn="sum @10 21600 0"/>
+                        </v:formulas>
+                        <v:path o:extrusionok="f" gradientshapeok="t" o:connecttype="rect"/>
+                        <o:lock v:ext="edit" aspectratio="t"/>
+                      </v:shapetype>
+                      <v:shape id="Image 3" o:spid="_x0000_s1027" type="#_x0000_t75" style="position:absolute;width:487800;height:485280;visibility:visible;mso-wrap-style:square" o:gfxdata="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" strokeweight="0">
+                        <v:imagedata r:id="rId9" o:title=""/>
+                      </v:shape>
+                    </v:group>
+                  </w:pict>
+                </mc:Fallback>
+              </mc:AlternateContent>
             </w:r>
             <w:r>
               <w:rPr>
@@ -240,6 +316,7 @@
                 <w:sz w:val="20"/>
               </w:rPr>
             </w:pPr>
+            <w:proofErr w:type="gramStart"/>
             <w:r>
               <w:rPr>
                 <w:b/>
@@ -247,7 +324,37 @@
                 <w:sz w:val="20"/>
                 <w:szCs w:val="20"/>
               </w:rPr>
-              <w:t>{{ docket_number }}</w:t>
+              <w:t xml:space="preserve">{{ </w:t>
+            </w:r>
+            <w:proofErr w:type="spellStart"/>
+            <w:r>
+              <w:rPr>
+                <w:b/>
+                <w:bCs/>
+                <w:sz w:val="20"/>
+                <w:szCs w:val="20"/>
+              </w:rPr>
+              <w:t>docket</w:t>
+            </w:r>
+            <w:proofErr w:type="gramEnd"/>
+            <w:r>
+              <w:rPr>
+                <w:b/>
+                <w:bCs/>
+                <w:sz w:val="20"/>
+                <w:szCs w:val="20"/>
+              </w:rPr>
+              <w:t>_number</w:t>
+            </w:r>
+            <w:proofErr w:type="spellEnd"/>
+            <w:r>
+              <w:rPr>
+                <w:b/>
+                <w:bCs/>
+                <w:sz w:val="20"/>
+                <w:szCs w:val="20"/>
+              </w:rPr>
+              <w:t xml:space="preserve"> }}</w:t>
             </w:r>
           </w:p>
         </w:tc>
@@ -305,6 +412,7 @@
                 <w:sz w:val="20"/>
               </w:rPr>
             </w:pPr>
+            <w:proofErr w:type="gramStart"/>
             <w:r>
               <w:rPr>
                 <w:b/>
@@ -312,7 +420,48 @@
                 <w:sz w:val="20"/>
                 <w:szCs w:val="20"/>
               </w:rPr>
-              <w:t>{{ trial_court.department }}</w:t>
+              <w:t xml:space="preserve">{{ </w:t>
+            </w:r>
+            <w:proofErr w:type="spellStart"/>
+            <w:r>
+              <w:rPr>
+                <w:b/>
+                <w:bCs/>
+                <w:sz w:val="20"/>
+                <w:szCs w:val="20"/>
+              </w:rPr>
+              <w:t>trial</w:t>
+            </w:r>
+            <w:proofErr w:type="gramEnd"/>
+            <w:r>
+              <w:rPr>
+                <w:b/>
+                <w:bCs/>
+                <w:sz w:val="20"/>
+                <w:szCs w:val="20"/>
+              </w:rPr>
+              <w:t>_</w:t>
+            </w:r>
+            <w:proofErr w:type="gramStart"/>
+            <w:r>
+              <w:rPr>
+                <w:b/>
+                <w:bCs/>
+                <w:sz w:val="20"/>
+                <w:szCs w:val="20"/>
+              </w:rPr>
+              <w:t>court.department</w:t>
+            </w:r>
+            <w:proofErr w:type="spellEnd"/>
+            <w:proofErr w:type="gramEnd"/>
+            <w:r>
+              <w:rPr>
+                <w:b/>
+                <w:bCs/>
+                <w:sz w:val="20"/>
+                <w:szCs w:val="20"/>
+              </w:rPr>
+              <w:t xml:space="preserve"> }}</w:t>
             </w:r>
           </w:p>
         </w:tc>
@@ -368,6 +517,7 @@
                 <w:sz w:val="20"/>
               </w:rPr>
             </w:pPr>
+            <w:proofErr w:type="gramStart"/>
             <w:r>
               <w:rPr>
                 <w:b/>
@@ -375,7 +525,48 @@
                 <w:sz w:val="20"/>
                 <w:szCs w:val="20"/>
               </w:rPr>
-              <w:t>{{ trial_court.division }}</w:t>
+              <w:t xml:space="preserve">{{ </w:t>
+            </w:r>
+            <w:proofErr w:type="spellStart"/>
+            <w:r>
+              <w:rPr>
+                <w:b/>
+                <w:bCs/>
+                <w:sz w:val="20"/>
+                <w:szCs w:val="20"/>
+              </w:rPr>
+              <w:t>trial</w:t>
+            </w:r>
+            <w:proofErr w:type="gramEnd"/>
+            <w:r>
+              <w:rPr>
+                <w:b/>
+                <w:bCs/>
+                <w:sz w:val="20"/>
+                <w:szCs w:val="20"/>
+              </w:rPr>
+              <w:t>_</w:t>
+            </w:r>
+            <w:proofErr w:type="gramStart"/>
+            <w:r>
+              <w:rPr>
+                <w:b/>
+                <w:bCs/>
+                <w:sz w:val="20"/>
+                <w:szCs w:val="20"/>
+              </w:rPr>
+              <w:t>court.division</w:t>
+            </w:r>
+            <w:proofErr w:type="spellEnd"/>
+            <w:proofErr w:type="gramEnd"/>
+            <w:r>
+              <w:rPr>
+                <w:b/>
+                <w:bCs/>
+                <w:sz w:val="20"/>
+                <w:szCs w:val="20"/>
+              </w:rPr>
+              <w:t xml:space="preserve"> }}</w:t>
             </w:r>
           </w:p>
         </w:tc>
@@ -444,6 +635,7 @@
                 <w:sz w:val="15"/>
               </w:rPr>
             </w:pPr>
+            <w:proofErr w:type="gramStart"/>
             <w:r>
               <w:rPr>
                 <w:b/>
@@ -451,7 +643,77 @@
                 <w:sz w:val="19"/>
                 <w:szCs w:val="19"/>
               </w:rPr>
-              <w:t>{{ other_parties.full_names() }}</w:t>
+              <w:t xml:space="preserve">{{ </w:t>
+            </w:r>
+            <w:proofErr w:type="spellStart"/>
+            <w:r>
+              <w:rPr>
+                <w:b/>
+                <w:bCs/>
+                <w:sz w:val="19"/>
+                <w:szCs w:val="19"/>
+              </w:rPr>
+              <w:t>other</w:t>
+            </w:r>
+            <w:proofErr w:type="gramEnd"/>
+            <w:r>
+              <w:rPr>
+                <w:b/>
+                <w:bCs/>
+                <w:sz w:val="19"/>
+                <w:szCs w:val="19"/>
+              </w:rPr>
+              <w:t>_</w:t>
+            </w:r>
+            <w:proofErr w:type="gramStart"/>
+            <w:r>
+              <w:rPr>
+                <w:b/>
+                <w:bCs/>
+                <w:sz w:val="19"/>
+                <w:szCs w:val="19"/>
+              </w:rPr>
+              <w:t>parties.full</w:t>
+            </w:r>
+            <w:proofErr w:type="gramEnd"/>
+            <w:r>
+              <w:rPr>
+                <w:b/>
+                <w:bCs/>
+                <w:sz w:val="19"/>
+                <w:szCs w:val="19"/>
+              </w:rPr>
+              <w:t>_</w:t>
+            </w:r>
+            <w:proofErr w:type="gramStart"/>
+            <w:r>
+              <w:rPr>
+                <w:b/>
+                <w:bCs/>
+                <w:sz w:val="19"/>
+                <w:szCs w:val="19"/>
+              </w:rPr>
+              <w:t>names</w:t>
+            </w:r>
+            <w:proofErr w:type="spellEnd"/>
+            <w:r>
+              <w:rPr>
+                <w:b/>
+                <w:bCs/>
+                <w:sz w:val="19"/>
+                <w:szCs w:val="19"/>
+              </w:rPr>
+              <w:t>(</w:t>
+            </w:r>
+            <w:proofErr w:type="gramEnd"/>
+            <w:r>
+              <w:rPr>
+                <w:b/>
+                <w:bCs/>
+                <w:sz w:val="19"/>
+                <w:szCs w:val="19"/>
+              </w:rPr>
+              <w:t>) }}</w:t>
             </w:r>
           </w:p>
         </w:tc>
@@ -515,6 +777,7 @@
                 <w:sz w:val="15"/>
               </w:rPr>
             </w:pPr>
+            <w:proofErr w:type="gramStart"/>
             <w:r>
               <w:rPr>
                 <w:b/>
@@ -522,7 +785,57 @@
                 <w:sz w:val="19"/>
                 <w:szCs w:val="19"/>
               </w:rPr>
-              <w:t>{{ users.full_names() }}</w:t>
+              <w:t xml:space="preserve">{{ </w:t>
+            </w:r>
+            <w:proofErr w:type="spellStart"/>
+            <w:r>
+              <w:rPr>
+                <w:b/>
+                <w:bCs/>
+                <w:sz w:val="19"/>
+                <w:szCs w:val="19"/>
+              </w:rPr>
+              <w:t>users</w:t>
+            </w:r>
+            <w:proofErr w:type="gramEnd"/>
+            <w:r>
+              <w:rPr>
+                <w:b/>
+                <w:bCs/>
+                <w:sz w:val="19"/>
+                <w:szCs w:val="19"/>
+              </w:rPr>
+              <w:t>.full_</w:t>
+            </w:r>
+            <w:proofErr w:type="gramStart"/>
+            <w:r>
+              <w:rPr>
+                <w:b/>
+                <w:bCs/>
+                <w:sz w:val="19"/>
+                <w:szCs w:val="19"/>
+              </w:rPr>
+              <w:t>names</w:t>
+            </w:r>
+            <w:proofErr w:type="spellEnd"/>
+            <w:r>
+              <w:rPr>
+                <w:b/>
+                <w:bCs/>
+                <w:sz w:val="19"/>
+                <w:szCs w:val="19"/>
+              </w:rPr>
+              <w:t>(</w:t>
+            </w:r>
+            <w:proofErr w:type="gramEnd"/>
+            <w:r>
+              <w:rPr>
+                <w:b/>
+                <w:bCs/>
+                <w:sz w:val="19"/>
+                <w:szCs w:val="19"/>
+              </w:rPr>
+              <w:t>) }}</w:t>
             </w:r>
           </w:p>
         </w:tc>
@@ -1254,6 +1567,7 @@
               </w:rPr>
               <w:t>{{</w:t>
             </w:r>
+            <w:proofErr w:type="spellStart"/>
             <w:r>
               <w:rPr>
                 <w:b/>
@@ -1261,8 +1575,29 @@
                 <w:sz w:val="18"/>
                 <w:szCs w:val="21"/>
               </w:rPr>
-              <w:t>output_checkbox(case_dismissed</w:t>
-            </w:r>
+              <w:t>output_checkbox</w:t>
+            </w:r>
+            <w:proofErr w:type="spellEnd"/>
+            <w:r>
+              <w:rPr>
+                <w:b/>
+                <w:bCs/>
+                <w:sz w:val="18"/>
+                <w:szCs w:val="21"/>
+              </w:rPr>
+              <w:t>(</w:t>
+            </w:r>
+            <w:proofErr w:type="spellStart"/>
+            <w:r>
+              <w:rPr>
+                <w:b/>
+                <w:bCs/>
+                <w:sz w:val="18"/>
+                <w:szCs w:val="21"/>
+              </w:rPr>
+              <w:t>case_dismissed</w:t>
+            </w:r>
+            <w:proofErr w:type="spellEnd"/>
             <w:r>
               <w:rPr>
                 <w:b/>
@@ -1502,6 +1837,7 @@
               </w:rPr>
               <w:t>{{</w:t>
             </w:r>
+            <w:proofErr w:type="spellStart"/>
             <w:r>
               <w:rPr>
                 <w:b/>
@@ -1509,7 +1845,48 @@
                 <w:sz w:val="18"/>
                 <w:szCs w:val="21"/>
               </w:rPr>
-              <w:t>output_checkbox(judgment_outcome == “tenant”</w:t>
+              <w:t>output_</w:t>
+            </w:r>
+            <w:proofErr w:type="gramStart"/>
+            <w:r>
+              <w:rPr>
+                <w:b/>
+                <w:bCs/>
+                <w:sz w:val="18"/>
+                <w:szCs w:val="21"/>
+              </w:rPr>
+              <w:t>checkbox</w:t>
+            </w:r>
+            <w:proofErr w:type="spellEnd"/>
+            <w:r>
+              <w:rPr>
+                <w:b/>
+                <w:bCs/>
+                <w:sz w:val="18"/>
+                <w:szCs w:val="21"/>
+              </w:rPr>
+              <w:t>(</w:t>
+            </w:r>
+            <w:proofErr w:type="spellStart"/>
+            <w:proofErr w:type="gramEnd"/>
+            <w:r>
+              <w:rPr>
+                <w:b/>
+                <w:bCs/>
+                <w:sz w:val="18"/>
+                <w:szCs w:val="21"/>
+              </w:rPr>
+              <w:t>judgment_outcome</w:t>
+            </w:r>
+            <w:proofErr w:type="spellEnd"/>
+            <w:r>
+              <w:rPr>
+                <w:b/>
+                <w:bCs/>
+                <w:sz w:val="18"/>
+                <w:szCs w:val="21"/>
+              </w:rPr>
+              <w:t xml:space="preserve"> == “tenant”</w:t>
             </w:r>
             <w:r>
               <w:rPr>
@@ -1815,6 +2192,7 @@
               </w:rPr>
               <w:t>{{</w:t>
             </w:r>
+            <w:proofErr w:type="spellStart"/>
             <w:r>
               <w:rPr>
                 <w:b/>
@@ -1822,7 +2200,48 @@
                 <w:sz w:val="18"/>
                 <w:szCs w:val="21"/>
               </w:rPr>
-              <w:t>output_checkbox(judgment_outcome == “landlord”</w:t>
+              <w:t>output_</w:t>
+            </w:r>
+            <w:proofErr w:type="gramStart"/>
+            <w:r>
+              <w:rPr>
+                <w:b/>
+                <w:bCs/>
+                <w:sz w:val="18"/>
+                <w:szCs w:val="21"/>
+              </w:rPr>
+              <w:t>checkbox</w:t>
+            </w:r>
+            <w:proofErr w:type="spellEnd"/>
+            <w:r>
+              <w:rPr>
+                <w:b/>
+                <w:bCs/>
+                <w:sz w:val="18"/>
+                <w:szCs w:val="21"/>
+              </w:rPr>
+              <w:t>(</w:t>
+            </w:r>
+            <w:proofErr w:type="spellStart"/>
+            <w:proofErr w:type="gramEnd"/>
+            <w:r>
+              <w:rPr>
+                <w:b/>
+                <w:bCs/>
+                <w:sz w:val="18"/>
+                <w:szCs w:val="21"/>
+              </w:rPr>
+              <w:t>judgment_outcome</w:t>
+            </w:r>
+            <w:proofErr w:type="spellEnd"/>
+            <w:r>
+              <w:rPr>
+                <w:b/>
+                <w:bCs/>
+                <w:sz w:val="18"/>
+                <w:szCs w:val="21"/>
+              </w:rPr>
+              <w:t xml:space="preserve"> == “landlord”</w:t>
             </w:r>
             <w:r>
               <w:rPr>
@@ -1992,7 +2411,21 @@
               <w:rPr>
                 <w:sz w:val="20"/>
               </w:rPr>
-              <w:t>§16(b)(c)(d)(e)&amp;(k).</w:t>
+              <w:t>§16(b)(c)(d)(</w:t>
+            </w:r>
+            <w:proofErr w:type="gramStart"/>
+            <w:r>
+              <w:rPr>
+                <w:sz w:val="20"/>
+              </w:rPr>
+              <w:t>e)&amp;</w:t>
+            </w:r>
+            <w:proofErr w:type="gramEnd"/>
+            <w:r>
+              <w:rPr>
+                <w:sz w:val="20"/>
+              </w:rPr>
+              <w:t>(k).</w:t>
             </w:r>
             <w:r>
               <w:rPr>
@@ -2441,7 +2874,43 @@
                 <w:bCs/>
                 <w:sz w:val="20"/>
               </w:rPr>
-              <w:t>{{output_checkbox(non_payment)}}</w:t>
+              <w:t>{{</w:t>
+            </w:r>
+            <w:proofErr w:type="spellStart"/>
+            <w:r>
+              <w:rPr>
+                <w:b/>
+                <w:bCs/>
+                <w:sz w:val="20"/>
+              </w:rPr>
+              <w:t>output_checkbox</w:t>
+            </w:r>
+            <w:proofErr w:type="spellEnd"/>
+            <w:r>
+              <w:rPr>
+                <w:b/>
+                <w:bCs/>
+                <w:sz w:val="20"/>
+              </w:rPr>
+              <w:t>(</w:t>
+            </w:r>
+            <w:proofErr w:type="spellStart"/>
+            <w:r>
+              <w:rPr>
+                <w:b/>
+                <w:bCs/>
+                <w:sz w:val="20"/>
+              </w:rPr>
+              <w:t>non_payment</w:t>
+            </w:r>
+            <w:proofErr w:type="spellEnd"/>
+            <w:r>
+              <w:rPr>
+                <w:b/>
+                <w:bCs/>
+                <w:sz w:val="20"/>
+              </w:rPr>
+              <w:t>)}}</w:t>
             </w:r>
             <w:r>
               <w:rPr>
@@ -2736,6 +3205,7 @@
               </w:rPr>
               <w:t>{{</w:t>
             </w:r>
+            <w:proofErr w:type="spellStart"/>
             <w:r>
               <w:rPr>
                 <w:b/>
@@ -2743,7 +3213,68 @@
                 <w:sz w:val="18"/>
                 <w:szCs w:val="21"/>
               </w:rPr>
-              <w:t>output_checkbox(non_payment_cured == “landlord_filed_satisfaction”</w:t>
+              <w:t>output_</w:t>
+            </w:r>
+            <w:proofErr w:type="gramStart"/>
+            <w:r>
+              <w:rPr>
+                <w:b/>
+                <w:bCs/>
+                <w:sz w:val="18"/>
+                <w:szCs w:val="21"/>
+              </w:rPr>
+              <w:t>checkbox</w:t>
+            </w:r>
+            <w:proofErr w:type="spellEnd"/>
+            <w:r>
+              <w:rPr>
+                <w:b/>
+                <w:bCs/>
+                <w:sz w:val="18"/>
+                <w:szCs w:val="21"/>
+              </w:rPr>
+              <w:t>(</w:t>
+            </w:r>
+            <w:proofErr w:type="spellStart"/>
+            <w:proofErr w:type="gramEnd"/>
+            <w:r>
+              <w:rPr>
+                <w:b/>
+                <w:bCs/>
+                <w:sz w:val="18"/>
+                <w:szCs w:val="21"/>
+              </w:rPr>
+              <w:t>non_payment_cured</w:t>
+            </w:r>
+            <w:proofErr w:type="spellEnd"/>
+            <w:r>
+              <w:rPr>
+                <w:b/>
+                <w:bCs/>
+                <w:sz w:val="18"/>
+                <w:szCs w:val="21"/>
+              </w:rPr>
+              <w:t xml:space="preserve"> == “</w:t>
+            </w:r>
+            <w:proofErr w:type="spellStart"/>
+            <w:r>
+              <w:rPr>
+                <w:b/>
+                <w:bCs/>
+                <w:sz w:val="18"/>
+                <w:szCs w:val="21"/>
+              </w:rPr>
+              <w:t>landlord_filed_satisfaction</w:t>
+            </w:r>
+            <w:proofErr w:type="spellEnd"/>
+            <w:r>
+              <w:rPr>
+                <w:b/>
+                <w:bCs/>
+                <w:sz w:val="18"/>
+                <w:szCs w:val="21"/>
+              </w:rPr>
+              <w:t>”</w:t>
             </w:r>
             <w:r>
               <w:rPr>
@@ -2911,6 +3442,7 @@
               </w:rPr>
               <w:t>{{</w:t>
             </w:r>
+            <w:proofErr w:type="spellStart"/>
             <w:r>
               <w:rPr>
                 <w:b/>
@@ -2918,7 +3450,68 @@
                 <w:sz w:val="18"/>
                 <w:szCs w:val="21"/>
               </w:rPr>
-              <w:t>output_checkbox(non_payment_cured == “judge_deemed_satisfied”</w:t>
+              <w:t>output_</w:t>
+            </w:r>
+            <w:proofErr w:type="gramStart"/>
+            <w:r>
+              <w:rPr>
+                <w:b/>
+                <w:bCs/>
+                <w:sz w:val="18"/>
+                <w:szCs w:val="21"/>
+              </w:rPr>
+              <w:t>checkbox</w:t>
+            </w:r>
+            <w:proofErr w:type="spellEnd"/>
+            <w:r>
+              <w:rPr>
+                <w:b/>
+                <w:bCs/>
+                <w:sz w:val="18"/>
+                <w:szCs w:val="21"/>
+              </w:rPr>
+              <w:t>(</w:t>
+            </w:r>
+            <w:proofErr w:type="spellStart"/>
+            <w:proofErr w:type="gramEnd"/>
+            <w:r>
+              <w:rPr>
+                <w:b/>
+                <w:bCs/>
+                <w:sz w:val="18"/>
+                <w:szCs w:val="21"/>
+              </w:rPr>
+              <w:t>non_payment_cured</w:t>
+            </w:r>
+            <w:proofErr w:type="spellEnd"/>
+            <w:r>
+              <w:rPr>
+                <w:b/>
+                <w:bCs/>
+                <w:sz w:val="18"/>
+                <w:szCs w:val="21"/>
+              </w:rPr>
+              <w:t xml:space="preserve"> == “</w:t>
+            </w:r>
+            <w:proofErr w:type="spellStart"/>
+            <w:r>
+              <w:rPr>
+                <w:b/>
+                <w:bCs/>
+                <w:sz w:val="18"/>
+                <w:szCs w:val="21"/>
+              </w:rPr>
+              <w:t>judge_deemed_satisfied</w:t>
+            </w:r>
+            <w:proofErr w:type="spellEnd"/>
+            <w:r>
+              <w:rPr>
+                <w:b/>
+                <w:bCs/>
+                <w:sz w:val="18"/>
+                <w:szCs w:val="21"/>
+              </w:rPr>
+              <w:t>”</w:t>
             </w:r>
             <w:r>
               <w:rPr>
@@ -3241,6 +3834,7 @@
               </w:rPr>
               <w:t>{{</w:t>
             </w:r>
+            <w:proofErr w:type="spellStart"/>
             <w:r>
               <w:rPr>
                 <w:b/>
@@ -3248,8 +3842,60 @@
                 <w:sz w:val="18"/>
                 <w:szCs w:val="21"/>
               </w:rPr>
-              <w:t>output_checkbox(eviction_reason_nonpayment and not non_payment</w:t>
-            </w:r>
+              <w:t>output_</w:t>
+            </w:r>
+            <w:proofErr w:type="gramStart"/>
+            <w:r>
+              <w:rPr>
+                <w:b/>
+                <w:bCs/>
+                <w:sz w:val="18"/>
+                <w:szCs w:val="21"/>
+              </w:rPr>
+              <w:t>checkbox</w:t>
+            </w:r>
+            <w:proofErr w:type="spellEnd"/>
+            <w:r>
+              <w:rPr>
+                <w:b/>
+                <w:bCs/>
+                <w:sz w:val="18"/>
+                <w:szCs w:val="21"/>
+              </w:rPr>
+              <w:t>(</w:t>
+            </w:r>
+            <w:proofErr w:type="spellStart"/>
+            <w:proofErr w:type="gramEnd"/>
+            <w:r>
+              <w:rPr>
+                <w:b/>
+                <w:bCs/>
+                <w:sz w:val="18"/>
+                <w:szCs w:val="21"/>
+              </w:rPr>
+              <w:t>eviction_reason_nonpayment</w:t>
+            </w:r>
+            <w:proofErr w:type="spellEnd"/>
+            <w:r>
+              <w:rPr>
+                <w:b/>
+                <w:bCs/>
+                <w:sz w:val="18"/>
+                <w:szCs w:val="21"/>
+              </w:rPr>
+              <w:t xml:space="preserve"> and not </w:t>
+            </w:r>
+            <w:proofErr w:type="spellStart"/>
+            <w:r>
+              <w:rPr>
+                <w:b/>
+                <w:bCs/>
+                <w:sz w:val="18"/>
+                <w:szCs w:val="21"/>
+              </w:rPr>
+              <w:t>non_payment</w:t>
+            </w:r>
+            <w:proofErr w:type="spellEnd"/>
             <w:r>
               <w:rPr>
                 <w:b/>
@@ -3546,6 +4192,7 @@
               </w:rPr>
               <w:t>{{</w:t>
             </w:r>
+            <w:proofErr w:type="spellStart"/>
             <w:r>
               <w:rPr>
                 <w:b/>
@@ -3553,8 +4200,29 @@
                 <w:sz w:val="18"/>
                 <w:szCs w:val="21"/>
               </w:rPr>
-              <w:t>output_checkbox(nonpayment_appl_expired</w:t>
-            </w:r>
+              <w:t>output_checkbox</w:t>
+            </w:r>
+            <w:proofErr w:type="spellEnd"/>
+            <w:r>
+              <w:rPr>
+                <w:b/>
+                <w:bCs/>
+                <w:sz w:val="18"/>
+                <w:szCs w:val="21"/>
+              </w:rPr>
+              <w:t>(</w:t>
+            </w:r>
+            <w:proofErr w:type="spellStart"/>
+            <w:r>
+              <w:rPr>
+                <w:b/>
+                <w:bCs/>
+                <w:sz w:val="18"/>
+                <w:szCs w:val="21"/>
+              </w:rPr>
+              <w:t>nonpayment_appl_expired</w:t>
+            </w:r>
+            <w:proofErr w:type="spellEnd"/>
             <w:r>
               <w:rPr>
                 <w:b/>
@@ -3576,6 +4244,7 @@
               </w:rPr>
               <w:t xml:space="preserve"> </w:t>
             </w:r>
+            <w:proofErr w:type="gramStart"/>
             <w:r>
               <w:rPr>
                 <w:sz w:val="20"/>
@@ -3621,6 +4290,7 @@
               </w:rPr>
               <w:t>to</w:t>
             </w:r>
+            <w:proofErr w:type="gramEnd"/>
             <w:r>
               <w:rPr>
                 <w:spacing w:val="-7"/>
@@ -3888,11 +4558,19 @@
               </w:rPr>
               <w:t xml:space="preserve"> </w:t>
             </w:r>
-            <w:r>
-              <w:rPr>
-                <w:sz w:val="20"/>
-              </w:rPr>
-              <w:t>exhausted;</w:t>
+            <w:proofErr w:type="gramStart"/>
+            <w:r>
+              <w:rPr>
+                <w:sz w:val="20"/>
+              </w:rPr>
+              <w:t>exhausted</w:t>
+            </w:r>
+            <w:proofErr w:type="gramEnd"/>
+            <w:r>
+              <w:rPr>
+                <w:sz w:val="20"/>
+              </w:rPr>
+              <w:t>;</w:t>
             </w:r>
             <w:r>
               <w:rPr>
@@ -3959,6 +4637,7 @@
               </w:rPr>
               <w:t>{{</w:t>
             </w:r>
+            <w:proofErr w:type="spellStart"/>
             <w:r>
               <w:rPr>
                 <w:b/>
@@ -3966,8 +4645,29 @@
                 <w:sz w:val="18"/>
                 <w:szCs w:val="21"/>
               </w:rPr>
-              <w:t>output_checkbox(eviction_reason_fault</w:t>
-            </w:r>
+              <w:t>output_checkbox</w:t>
+            </w:r>
+            <w:proofErr w:type="spellEnd"/>
+            <w:r>
+              <w:rPr>
+                <w:b/>
+                <w:bCs/>
+                <w:sz w:val="18"/>
+                <w:szCs w:val="21"/>
+              </w:rPr>
+              <w:t>(</w:t>
+            </w:r>
+            <w:proofErr w:type="spellStart"/>
+            <w:r>
+              <w:rPr>
+                <w:b/>
+                <w:bCs/>
+                <w:sz w:val="18"/>
+                <w:szCs w:val="21"/>
+              </w:rPr>
+              <w:t>eviction_reason_fault</w:t>
+            </w:r>
+            <w:proofErr w:type="spellEnd"/>
             <w:r>
               <w:rPr>
                 <w:b/>
@@ -4133,6 +4833,7 @@
               </w:rPr>
               <w:t>{{</w:t>
             </w:r>
+            <w:proofErr w:type="spellStart"/>
             <w:r>
               <w:rPr>
                 <w:b/>
@@ -4140,8 +4841,29 @@
                 <w:sz w:val="18"/>
                 <w:szCs w:val="21"/>
               </w:rPr>
-              <w:t>output_checkbox(fe_appl_period_exp</w:t>
-            </w:r>
+              <w:t>output_checkbox</w:t>
+            </w:r>
+            <w:proofErr w:type="spellEnd"/>
+            <w:r>
+              <w:rPr>
+                <w:b/>
+                <w:bCs/>
+                <w:sz w:val="18"/>
+                <w:szCs w:val="21"/>
+              </w:rPr>
+              <w:t>(</w:t>
+            </w:r>
+            <w:proofErr w:type="spellStart"/>
+            <w:r>
+              <w:rPr>
+                <w:b/>
+                <w:bCs/>
+                <w:sz w:val="18"/>
+                <w:szCs w:val="21"/>
+              </w:rPr>
+              <w:t>fe_appl_period_exp</w:t>
+            </w:r>
+            <w:proofErr w:type="spellEnd"/>
             <w:r>
               <w:rPr>
                 <w:b/>
@@ -4442,6 +5164,7 @@
               </w:rPr>
               <w:t>{{</w:t>
             </w:r>
+            <w:proofErr w:type="spellStart"/>
             <w:r>
               <w:rPr>
                 <w:b/>
@@ -4449,8 +5172,29 @@
                 <w:sz w:val="18"/>
                 <w:szCs w:val="21"/>
               </w:rPr>
-              <w:t>output_checkbox(nofault_judgment_period_exp</w:t>
-            </w:r>
+              <w:t>output_checkbox</w:t>
+            </w:r>
+            <w:proofErr w:type="spellEnd"/>
+            <w:r>
+              <w:rPr>
+                <w:b/>
+                <w:bCs/>
+                <w:sz w:val="18"/>
+                <w:szCs w:val="21"/>
+              </w:rPr>
+              <w:t>(</w:t>
+            </w:r>
+            <w:proofErr w:type="spellStart"/>
+            <w:r>
+              <w:rPr>
+                <w:b/>
+                <w:bCs/>
+                <w:sz w:val="18"/>
+                <w:szCs w:val="21"/>
+              </w:rPr>
+              <w:t>nofault_judgment_period_exp</w:t>
+            </w:r>
+            <w:proofErr w:type="spellEnd"/>
             <w:r>
               <w:rPr>
                 <w:b/>
@@ -4543,6 +5287,7 @@
               </w:rPr>
               <w:t xml:space="preserve"> </w:t>
             </w:r>
+            <w:proofErr w:type="gramStart"/>
             <w:r>
               <w:rPr>
                 <w:spacing w:val="-2"/>
@@ -4550,6 +5295,7 @@
               </w:rPr>
               <w:t>fault</w:t>
             </w:r>
+            <w:proofErr w:type="gramEnd"/>
             <w:r>
               <w:rPr>
                 <w:spacing w:val="-7"/>
@@ -4730,6 +5476,7 @@
               </w:rPr>
               <w:t>{{</w:t>
             </w:r>
+            <w:proofErr w:type="spellStart"/>
             <w:r>
               <w:rPr>
                 <w:b/>
@@ -4737,7 +5484,57 @@
                 <w:sz w:val="18"/>
                 <w:szCs w:val="21"/>
               </w:rPr>
-              <w:t>output_checkbox(eviction_reason_139 and judgment_outcome == "landlord"</w:t>
+              <w:t>output_</w:t>
+            </w:r>
+            <w:proofErr w:type="gramStart"/>
+            <w:r>
+              <w:rPr>
+                <w:b/>
+                <w:bCs/>
+                <w:sz w:val="18"/>
+                <w:szCs w:val="21"/>
+              </w:rPr>
+              <w:t>checkbox</w:t>
+            </w:r>
+            <w:proofErr w:type="spellEnd"/>
+            <w:r>
+              <w:rPr>
+                <w:b/>
+                <w:bCs/>
+                <w:sz w:val="18"/>
+                <w:szCs w:val="21"/>
+              </w:rPr>
+              <w:t>(</w:t>
+            </w:r>
+            <w:proofErr w:type="gramEnd"/>
+            <w:r>
+              <w:rPr>
+                <w:b/>
+                <w:bCs/>
+                <w:sz w:val="18"/>
+                <w:szCs w:val="21"/>
+              </w:rPr>
+              <w:t xml:space="preserve">eviction_reason_139 and </w:t>
+            </w:r>
+            <w:proofErr w:type="spellStart"/>
+            <w:r>
+              <w:rPr>
+                <w:b/>
+                <w:bCs/>
+                <w:sz w:val="18"/>
+                <w:szCs w:val="21"/>
+              </w:rPr>
+              <w:t>judgment_outcome</w:t>
+            </w:r>
+            <w:proofErr w:type="spellEnd"/>
+            <w:r>
+              <w:rPr>
+                <w:b/>
+                <w:bCs/>
+                <w:sz w:val="18"/>
+                <w:szCs w:val="21"/>
+              </w:rPr>
+              <w:t xml:space="preserve"> == "landlord"</w:t>
             </w:r>
             <w:r>
               <w:rPr>
@@ -5060,6 +5857,7 @@
               </w:rPr>
               <w:t>{{</w:t>
             </w:r>
+            <w:proofErr w:type="spellStart"/>
             <w:r>
               <w:rPr>
                 <w:b/>
@@ -5067,8 +5865,29 @@
                 <w:sz w:val="18"/>
                 <w:szCs w:val="21"/>
               </w:rPr>
-              <w:t>output_checkbox(ejp_appl_period_exp</w:t>
-            </w:r>
+              <w:t>output_checkbox</w:t>
+            </w:r>
+            <w:proofErr w:type="spellEnd"/>
+            <w:r>
+              <w:rPr>
+                <w:b/>
+                <w:bCs/>
+                <w:sz w:val="18"/>
+                <w:szCs w:val="21"/>
+              </w:rPr>
+              <w:t>(</w:t>
+            </w:r>
+            <w:proofErr w:type="spellStart"/>
+            <w:r>
+              <w:rPr>
+                <w:b/>
+                <w:bCs/>
+                <w:sz w:val="18"/>
+                <w:szCs w:val="21"/>
+              </w:rPr>
+              <w:t>ejp_appl_period_exp</w:t>
+            </w:r>
+            <w:proofErr w:type="spellEnd"/>
             <w:r>
               <w:rPr>
                 <w:b/>
@@ -5403,9 +6222,9 @@
     <w:p>
       <w:pPr>
         <w:sectPr>
-          <w:footerReference w:type="even" r:id="rId9"/>
-          <w:footerReference w:type="default" r:id="rId10"/>
-          <w:footerReference w:type="first" r:id="rId11"/>
+          <w:footerReference w:type="even" r:id="rId10"/>
+          <w:footerReference w:type="default" r:id="rId11"/>
+          <w:footerReference w:type="first" r:id="rId12"/>
           <w:type w:val="continuous"/>
           <w:pgSz w:w="12240" w:h="15840"/>
           <w:pgMar w:top="300" w:right="180" w:bottom="600" w:left="300" w:header="0" w:footer="417" w:gutter="0"/>
@@ -5427,7 +6246,7 @@
         <w:tblLook w:val="01E0" w:firstRow="1" w:lastRow="1" w:firstColumn="1" w:lastColumn="1" w:noHBand="0" w:noVBand="0"/>
       </w:tblPr>
       <w:tblGrid>
-        <w:gridCol w:w="11790"/>
+        <w:gridCol w:w="11730"/>
       </w:tblGrid>
       <w:tr>
         <w:trPr>
@@ -5680,6 +6499,7 @@
               </w:rPr>
               <w:t xml:space="preserve"> </w:t>
             </w:r>
+            <w:proofErr w:type="gramStart"/>
             <w:r>
               <w:rPr>
                 <w:sz w:val="20"/>
@@ -5699,6 +6519,7 @@
               </w:rPr>
               <w:t>eviction</w:t>
             </w:r>
+            <w:proofErr w:type="gramEnd"/>
             <w:r>
               <w:rPr>
                 <w:spacing w:val="-7"/>
@@ -5719,12 +6540,14 @@
               </w:rPr>
               <w:t xml:space="preserve"> </w:t>
             </w:r>
+            <w:proofErr w:type="gramStart"/>
             <w:r>
               <w:rPr>
                 <w:sz w:val="20"/>
               </w:rPr>
               <w:t>was</w:t>
             </w:r>
+            <w:proofErr w:type="gramEnd"/>
             <w:r>
               <w:rPr>
                 <w:spacing w:val="-3"/>
@@ -5762,7 +6585,21 @@
               <w:rPr>
                 <w:sz w:val="20"/>
               </w:rPr>
-              <w:t>judgment was entered in your favor.</w:t>
+              <w:t xml:space="preserve">judgment </w:t>
+            </w:r>
+            <w:proofErr w:type="gramStart"/>
+            <w:r>
+              <w:rPr>
+                <w:sz w:val="20"/>
+              </w:rPr>
+              <w:t>was</w:t>
+            </w:r>
+            <w:proofErr w:type="gramEnd"/>
+            <w:r>
+              <w:rPr>
+                <w:sz w:val="20"/>
+              </w:rPr>
+              <w:t xml:space="preserve"> entered in your favor.</w:t>
             </w:r>
           </w:p>
           <w:p>
@@ -5839,6 +6676,7 @@
               </w:rPr>
               <w:t>{{</w:t>
             </w:r>
+            <w:proofErr w:type="spellStart"/>
             <w:r>
               <w:rPr>
                 <w:b/>
@@ -5846,50 +6684,9 @@
                 <w:sz w:val="18"/>
                 <w:szCs w:val="21"/>
               </w:rPr>
-              <w:t>output_checkbox(notice_required and notice_recipient == “plaintiff”)</w:t>
-            </w:r>
-            <w:r>
-              <w:rPr>
-                <w:b/>
-                <w:bCs/>
-                <w:sz w:val="20"/>
-              </w:rPr>
-              <w:t>}}</w:t>
-            </w:r>
-            <w:r>
-              <w:rPr>
-                <w:sz w:val="20"/>
-              </w:rPr>
-              <w:t xml:space="preserve"> the</w:t>
-            </w:r>
-            <w:r>
-              <w:rPr>
-                <w:spacing w:val="-9"/>
-                <w:sz w:val="20"/>
-              </w:rPr>
-              <w:t xml:space="preserve"> </w:t>
-            </w:r>
-            <w:r>
-              <w:rPr>
-                <w:spacing w:val="-2"/>
-                <w:sz w:val="20"/>
-              </w:rPr>
-              <w:t>plaintiff</w:t>
-            </w:r>
-            <w:r>
-              <w:rPr>
-                <w:sz w:val="20"/>
-              </w:rPr>
-              <w:tab/>
-            </w:r>
-            <w:r>
-              <w:rPr>
-                <w:b/>
-                <w:bCs/>
-                <w:sz w:val="20"/>
-              </w:rPr>
-              <w:t>{{</w:t>
-            </w:r>
+              <w:t>output_</w:t>
+            </w:r>
+            <w:proofErr w:type="gramStart"/>
             <w:r>
               <w:rPr>
                 <w:b/>
@@ -5897,71 +6694,9 @@
                 <w:sz w:val="18"/>
                 <w:szCs w:val="21"/>
               </w:rPr>
-              <w:t>output_checkbox(notice_required and notice_recipient == “plaintiff lawyer”)</w:t>
-            </w:r>
-            <w:r>
-              <w:rPr>
-                <w:b/>
-                <w:bCs/>
-                <w:sz w:val="20"/>
-              </w:rPr>
-              <w:t>}}</w:t>
-            </w:r>
-            <w:r>
-              <w:rPr>
-                <w:sz w:val="20"/>
-              </w:rPr>
-              <w:t xml:space="preserve"> </w:t>
-            </w:r>
-            <w:r>
-              <w:rPr>
-                <w:spacing w:val="-2"/>
-                <w:sz w:val="20"/>
-              </w:rPr>
-              <w:t>the</w:t>
-            </w:r>
-            <w:r>
-              <w:rPr>
-                <w:spacing w:val="-7"/>
-                <w:sz w:val="20"/>
-              </w:rPr>
-              <w:t xml:space="preserve"> </w:t>
-            </w:r>
-            <w:r>
-              <w:rPr>
-                <w:spacing w:val="-2"/>
-                <w:sz w:val="20"/>
-              </w:rPr>
-              <w:t>plaintiff’s</w:t>
-            </w:r>
-            <w:r>
-              <w:rPr>
-                <w:spacing w:val="-6"/>
-                <w:sz w:val="20"/>
-              </w:rPr>
-              <w:t xml:space="preserve"> </w:t>
-            </w:r>
-            <w:r>
-              <w:rPr>
-                <w:spacing w:val="-2"/>
-                <w:sz w:val="20"/>
-              </w:rPr>
-              <w:t>lawyer</w:t>
-            </w:r>
-            <w:r>
-              <w:rPr>
-                <w:sz w:val="20"/>
-              </w:rPr>
-              <w:tab/>
-            </w:r>
-            <w:r>
-              <w:rPr>
-                <w:b/>
-                <w:bCs/>
-                <w:sz w:val="20"/>
-              </w:rPr>
-              <w:t>{{</w:t>
-            </w:r>
+              <w:t>checkbox</w:t>
+            </w:r>
+            <w:proofErr w:type="spellEnd"/>
             <w:r>
               <w:rPr>
                 <w:b/>
@@ -5969,7 +6704,295 @@
                 <w:sz w:val="18"/>
                 <w:szCs w:val="21"/>
               </w:rPr>
-              <w:t>output_checkbox(notice_required and notice_recipient == “other defendant”)</w:t>
+              <w:t>(</w:t>
+            </w:r>
+            <w:proofErr w:type="spellStart"/>
+            <w:proofErr w:type="gramEnd"/>
+            <w:r>
+              <w:rPr>
+                <w:b/>
+                <w:bCs/>
+                <w:sz w:val="18"/>
+                <w:szCs w:val="21"/>
+              </w:rPr>
+              <w:t>notice_required</w:t>
+            </w:r>
+            <w:proofErr w:type="spellEnd"/>
+            <w:r>
+              <w:rPr>
+                <w:b/>
+                <w:bCs/>
+                <w:sz w:val="18"/>
+                <w:szCs w:val="21"/>
+              </w:rPr>
+              <w:t xml:space="preserve"> and </w:t>
+            </w:r>
+            <w:proofErr w:type="spellStart"/>
+            <w:r>
+              <w:rPr>
+                <w:b/>
+                <w:bCs/>
+                <w:sz w:val="18"/>
+                <w:szCs w:val="21"/>
+              </w:rPr>
+              <w:t>notice_recipient</w:t>
+            </w:r>
+            <w:proofErr w:type="spellEnd"/>
+            <w:r>
+              <w:rPr>
+                <w:b/>
+                <w:bCs/>
+                <w:sz w:val="18"/>
+                <w:szCs w:val="21"/>
+              </w:rPr>
+              <w:t xml:space="preserve"> == “plaintiff”)</w:t>
+            </w:r>
+            <w:r>
+              <w:rPr>
+                <w:b/>
+                <w:bCs/>
+                <w:sz w:val="20"/>
+              </w:rPr>
+              <w:t>}}</w:t>
+            </w:r>
+            <w:r>
+              <w:rPr>
+                <w:sz w:val="20"/>
+              </w:rPr>
+              <w:t xml:space="preserve"> the</w:t>
+            </w:r>
+            <w:r>
+              <w:rPr>
+                <w:spacing w:val="-9"/>
+                <w:sz w:val="20"/>
+              </w:rPr>
+              <w:t xml:space="preserve"> </w:t>
+            </w:r>
+            <w:r>
+              <w:rPr>
+                <w:spacing w:val="-2"/>
+                <w:sz w:val="20"/>
+              </w:rPr>
+              <w:t>plaintiff</w:t>
+            </w:r>
+            <w:r>
+              <w:rPr>
+                <w:sz w:val="20"/>
+              </w:rPr>
+              <w:tab/>
+            </w:r>
+            <w:r>
+              <w:rPr>
+                <w:b/>
+                <w:bCs/>
+                <w:sz w:val="20"/>
+              </w:rPr>
+              <w:t>{{</w:t>
+            </w:r>
+            <w:proofErr w:type="spellStart"/>
+            <w:r>
+              <w:rPr>
+                <w:b/>
+                <w:bCs/>
+                <w:sz w:val="18"/>
+                <w:szCs w:val="21"/>
+              </w:rPr>
+              <w:t>output_</w:t>
+            </w:r>
+            <w:proofErr w:type="gramStart"/>
+            <w:r>
+              <w:rPr>
+                <w:b/>
+                <w:bCs/>
+                <w:sz w:val="18"/>
+                <w:szCs w:val="21"/>
+              </w:rPr>
+              <w:t>checkbox</w:t>
+            </w:r>
+            <w:proofErr w:type="spellEnd"/>
+            <w:r>
+              <w:rPr>
+                <w:b/>
+                <w:bCs/>
+                <w:sz w:val="18"/>
+                <w:szCs w:val="21"/>
+              </w:rPr>
+              <w:t>(</w:t>
+            </w:r>
+            <w:proofErr w:type="spellStart"/>
+            <w:proofErr w:type="gramEnd"/>
+            <w:r>
+              <w:rPr>
+                <w:b/>
+                <w:bCs/>
+                <w:sz w:val="18"/>
+                <w:szCs w:val="21"/>
+              </w:rPr>
+              <w:t>notice_required</w:t>
+            </w:r>
+            <w:proofErr w:type="spellEnd"/>
+            <w:r>
+              <w:rPr>
+                <w:b/>
+                <w:bCs/>
+                <w:sz w:val="18"/>
+                <w:szCs w:val="21"/>
+              </w:rPr>
+              <w:t xml:space="preserve"> and </w:t>
+            </w:r>
+            <w:proofErr w:type="spellStart"/>
+            <w:r>
+              <w:rPr>
+                <w:b/>
+                <w:bCs/>
+                <w:sz w:val="18"/>
+                <w:szCs w:val="21"/>
+              </w:rPr>
+              <w:t>notice_recipient</w:t>
+            </w:r>
+            <w:proofErr w:type="spellEnd"/>
+            <w:r>
+              <w:rPr>
+                <w:b/>
+                <w:bCs/>
+                <w:sz w:val="18"/>
+                <w:szCs w:val="21"/>
+              </w:rPr>
+              <w:t xml:space="preserve"> == “plaintiff lawyer”)</w:t>
+            </w:r>
+            <w:r>
+              <w:rPr>
+                <w:b/>
+                <w:bCs/>
+                <w:sz w:val="20"/>
+              </w:rPr>
+              <w:t>}}</w:t>
+            </w:r>
+            <w:r>
+              <w:rPr>
+                <w:sz w:val="20"/>
+              </w:rPr>
+              <w:t xml:space="preserve"> </w:t>
+            </w:r>
+            <w:r>
+              <w:rPr>
+                <w:spacing w:val="-2"/>
+                <w:sz w:val="20"/>
+              </w:rPr>
+              <w:t>the</w:t>
+            </w:r>
+            <w:r>
+              <w:rPr>
+                <w:spacing w:val="-7"/>
+                <w:sz w:val="20"/>
+              </w:rPr>
+              <w:t xml:space="preserve"> </w:t>
+            </w:r>
+            <w:r>
+              <w:rPr>
+                <w:spacing w:val="-2"/>
+                <w:sz w:val="20"/>
+              </w:rPr>
+              <w:t>plaintiff’s</w:t>
+            </w:r>
+            <w:r>
+              <w:rPr>
+                <w:spacing w:val="-6"/>
+                <w:sz w:val="20"/>
+              </w:rPr>
+              <w:t xml:space="preserve"> </w:t>
+            </w:r>
+            <w:r>
+              <w:rPr>
+                <w:spacing w:val="-2"/>
+                <w:sz w:val="20"/>
+              </w:rPr>
+              <w:t>lawyer</w:t>
+            </w:r>
+            <w:r>
+              <w:rPr>
+                <w:sz w:val="20"/>
+              </w:rPr>
+              <w:tab/>
+            </w:r>
+            <w:r>
+              <w:rPr>
+                <w:b/>
+                <w:bCs/>
+                <w:sz w:val="20"/>
+              </w:rPr>
+              <w:t>{{</w:t>
+            </w:r>
+            <w:proofErr w:type="spellStart"/>
+            <w:r>
+              <w:rPr>
+                <w:b/>
+                <w:bCs/>
+                <w:sz w:val="18"/>
+                <w:szCs w:val="21"/>
+              </w:rPr>
+              <w:t>output_</w:t>
+            </w:r>
+            <w:proofErr w:type="gramStart"/>
+            <w:r>
+              <w:rPr>
+                <w:b/>
+                <w:bCs/>
+                <w:sz w:val="18"/>
+                <w:szCs w:val="21"/>
+              </w:rPr>
+              <w:t>checkbox</w:t>
+            </w:r>
+            <w:proofErr w:type="spellEnd"/>
+            <w:r>
+              <w:rPr>
+                <w:b/>
+                <w:bCs/>
+                <w:sz w:val="18"/>
+                <w:szCs w:val="21"/>
+              </w:rPr>
+              <w:t>(</w:t>
+            </w:r>
+            <w:proofErr w:type="spellStart"/>
+            <w:proofErr w:type="gramEnd"/>
+            <w:r>
+              <w:rPr>
+                <w:b/>
+                <w:bCs/>
+                <w:sz w:val="18"/>
+                <w:szCs w:val="21"/>
+              </w:rPr>
+              <w:t>notice_required</w:t>
+            </w:r>
+            <w:proofErr w:type="spellEnd"/>
+            <w:r>
+              <w:rPr>
+                <w:b/>
+                <w:bCs/>
+                <w:sz w:val="18"/>
+                <w:szCs w:val="21"/>
+              </w:rPr>
+              <w:t xml:space="preserve"> and </w:t>
+            </w:r>
+            <w:proofErr w:type="spellStart"/>
+            <w:r>
+              <w:rPr>
+                <w:b/>
+                <w:bCs/>
+                <w:sz w:val="18"/>
+                <w:szCs w:val="21"/>
+              </w:rPr>
+              <w:t>notice_recipient</w:t>
+            </w:r>
+            <w:proofErr w:type="spellEnd"/>
+            <w:r>
+              <w:rPr>
+                <w:b/>
+                <w:bCs/>
+                <w:sz w:val="18"/>
+                <w:szCs w:val="21"/>
+              </w:rPr>
+              <w:t xml:space="preserve"> == “other defendant”)</w:t>
             </w:r>
             <w:r>
               <w:rPr>
@@ -6096,6 +7119,7 @@
               </w:rPr>
               <w:t xml:space="preserve"> </w:t>
             </w:r>
+            <w:proofErr w:type="gramStart"/>
             <w:r>
               <w:rPr>
                 <w:spacing w:val="-6"/>
@@ -6116,8 +7140,18 @@
                 <w:bCs/>
                 <w:sz w:val="20"/>
               </w:rPr>
-              <w:t xml:space="preserve">{% if </w:t>
-            </w:r>
+              <w:t>{%</w:t>
+            </w:r>
+            <w:proofErr w:type="gramEnd"/>
+            <w:r>
+              <w:rPr>
+                <w:b/>
+                <w:bCs/>
+                <w:sz w:val="20"/>
+              </w:rPr>
+              <w:t xml:space="preserve"> if </w:t>
+            </w:r>
+            <w:proofErr w:type="spellStart"/>
             <w:r>
               <w:rPr>
                 <w:b/>
@@ -6125,16 +7159,127 @@
                 <w:sz w:val="18"/>
                 <w:szCs w:val="21"/>
               </w:rPr>
-              <w:t>notice_required %}</w:t>
-            </w:r>
-            <w:r>
-              <w:rPr>
-                <w:b/>
-                <w:bCs/>
-                <w:sz w:val="20"/>
-              </w:rPr>
-              <w:t>{{ notice_date }}{% else %}___________{% endif %}</w:t>
-            </w:r>
+              <w:t>notice_required</w:t>
+            </w:r>
+            <w:proofErr w:type="spellEnd"/>
+            <w:r>
+              <w:rPr>
+                <w:b/>
+                <w:bCs/>
+                <w:sz w:val="18"/>
+                <w:szCs w:val="21"/>
+              </w:rPr>
+              <w:t xml:space="preserve"> </w:t>
+            </w:r>
+            <w:proofErr w:type="gramStart"/>
+            <w:r>
+              <w:rPr>
+                <w:b/>
+                <w:bCs/>
+                <w:sz w:val="18"/>
+                <w:szCs w:val="21"/>
+              </w:rPr>
+              <w:t>%}</w:t>
+            </w:r>
+            <w:r>
+              <w:rPr>
+                <w:b/>
+                <w:bCs/>
+                <w:sz w:val="20"/>
+              </w:rPr>
+              <w:t xml:space="preserve">{{ </w:t>
+            </w:r>
+            <w:proofErr w:type="spellStart"/>
+            <w:r>
+              <w:rPr>
+                <w:b/>
+                <w:bCs/>
+                <w:sz w:val="20"/>
+              </w:rPr>
+              <w:t>notice</w:t>
+            </w:r>
+            <w:proofErr w:type="gramEnd"/>
+            <w:r>
+              <w:rPr>
+                <w:b/>
+                <w:bCs/>
+                <w:sz w:val="20"/>
+              </w:rPr>
+              <w:t>_</w:t>
+            </w:r>
+            <w:proofErr w:type="gramStart"/>
+            <w:r>
+              <w:rPr>
+                <w:b/>
+                <w:bCs/>
+                <w:sz w:val="20"/>
+              </w:rPr>
+              <w:t>date</w:t>
+            </w:r>
+            <w:proofErr w:type="spellEnd"/>
+            <w:r>
+              <w:rPr>
+                <w:b/>
+                <w:bCs/>
+                <w:sz w:val="20"/>
+              </w:rPr>
+              <w:t xml:space="preserve"> }}{</w:t>
+            </w:r>
+            <w:proofErr w:type="gramEnd"/>
+            <w:r>
+              <w:rPr>
+                <w:b/>
+                <w:bCs/>
+                <w:sz w:val="20"/>
+              </w:rPr>
+              <w:t xml:space="preserve">% else </w:t>
+            </w:r>
+            <w:proofErr w:type="gramStart"/>
+            <w:r>
+              <w:rPr>
+                <w:b/>
+                <w:bCs/>
+                <w:sz w:val="20"/>
+              </w:rPr>
+              <w:t>%}_</w:t>
+            </w:r>
+            <w:proofErr w:type="gramEnd"/>
+            <w:r>
+              <w:rPr>
+                <w:b/>
+                <w:bCs/>
+                <w:sz w:val="20"/>
+              </w:rPr>
+              <w:t>_________</w:t>
+            </w:r>
+            <w:proofErr w:type="gramStart"/>
+            <w:r>
+              <w:rPr>
+                <w:b/>
+                <w:bCs/>
+                <w:sz w:val="20"/>
+              </w:rPr>
+              <w:t>_{</w:t>
+            </w:r>
+            <w:proofErr w:type="gramEnd"/>
+            <w:r>
+              <w:rPr>
+                <w:b/>
+                <w:bCs/>
+                <w:sz w:val="20"/>
+              </w:rPr>
+              <w:t xml:space="preserve">% </w:t>
+            </w:r>
+            <w:proofErr w:type="gramStart"/>
+            <w:r>
+              <w:rPr>
+                <w:b/>
+                <w:bCs/>
+                <w:sz w:val="20"/>
+              </w:rPr>
+              <w:t>endif %}</w:t>
+            </w:r>
+            <w:proofErr w:type="gramEnd"/>
             <w:r>
               <w:rPr>
                 <w:i/>
@@ -6252,8 +7397,37 @@
                 <w:bCs/>
                 <w:sz w:val="20"/>
               </w:rPr>
-              <w:t>{{output_checkbox(</w:t>
-            </w:r>
+              <w:t>{{</w:t>
+            </w:r>
+            <w:proofErr w:type="spellStart"/>
+            <w:r>
+              <w:rPr>
+                <w:b/>
+                <w:bCs/>
+                <w:sz w:val="20"/>
+              </w:rPr>
+              <w:t>output_</w:t>
+            </w:r>
+            <w:proofErr w:type="gramStart"/>
+            <w:r>
+              <w:rPr>
+                <w:b/>
+                <w:bCs/>
+                <w:sz w:val="20"/>
+              </w:rPr>
+              <w:t>checkbox</w:t>
+            </w:r>
+            <w:proofErr w:type="spellEnd"/>
+            <w:r>
+              <w:rPr>
+                <w:b/>
+                <w:bCs/>
+                <w:sz w:val="20"/>
+              </w:rPr>
+              <w:t>(</w:t>
+            </w:r>
+            <w:proofErr w:type="spellStart"/>
+            <w:proofErr w:type="gramEnd"/>
             <w:r>
               <w:rPr>
                 <w:b/>
@@ -6261,115 +7435,9 @@
                 <w:sz w:val="18"/>
                 <w:szCs w:val="21"/>
               </w:rPr>
-              <w:t xml:space="preserve">notice_required and </w:t>
-            </w:r>
-            <w:r>
-              <w:rPr>
-                <w:b/>
-                <w:bCs/>
-                <w:sz w:val="20"/>
-              </w:rPr>
-              <w:t xml:space="preserve">notice_type == “mail”)}} </w:t>
-            </w:r>
-            <w:r>
-              <w:rPr>
-                <w:sz w:val="20"/>
-              </w:rPr>
-              <w:t>First</w:t>
-            </w:r>
-            <w:r>
-              <w:rPr>
-                <w:spacing w:val="-4"/>
-                <w:sz w:val="20"/>
-              </w:rPr>
-              <w:t xml:space="preserve"> </w:t>
-            </w:r>
-            <w:r>
-              <w:rPr>
-                <w:sz w:val="20"/>
-              </w:rPr>
-              <w:t>class</w:t>
-            </w:r>
-            <w:r>
-              <w:rPr>
-                <w:spacing w:val="-2"/>
-                <w:sz w:val="20"/>
-              </w:rPr>
-              <w:t xml:space="preserve"> </w:t>
-            </w:r>
-            <w:r>
-              <w:rPr>
-                <w:sz w:val="20"/>
-              </w:rPr>
-              <w:t>mail,</w:t>
-            </w:r>
-            <w:r>
-              <w:rPr>
-                <w:spacing w:val="-4"/>
-                <w:sz w:val="20"/>
-              </w:rPr>
-              <w:t xml:space="preserve"> </w:t>
-            </w:r>
-            <w:r>
-              <w:rPr>
-                <w:sz w:val="20"/>
-              </w:rPr>
-              <w:t>to</w:t>
-            </w:r>
-            <w:r>
-              <w:rPr>
-                <w:spacing w:val="-3"/>
-                <w:sz w:val="20"/>
-              </w:rPr>
-              <w:t xml:space="preserve"> </w:t>
-            </w:r>
-            <w:r>
-              <w:rPr>
-                <w:sz w:val="20"/>
-              </w:rPr>
-              <w:t>this</w:t>
-            </w:r>
-            <w:r>
-              <w:rPr>
-                <w:spacing w:val="-1"/>
-                <w:sz w:val="20"/>
-              </w:rPr>
-              <w:t xml:space="preserve"> </w:t>
-            </w:r>
-            <w:r>
-              <w:rPr>
-                <w:sz w:val="20"/>
-              </w:rPr>
-              <w:t>mailing</w:t>
-            </w:r>
-            <w:r>
-              <w:rPr>
-                <w:spacing w:val="-3"/>
-                <w:sz w:val="20"/>
-              </w:rPr>
-              <w:t xml:space="preserve"> </w:t>
-            </w:r>
-            <w:r>
-              <w:rPr>
-                <w:sz w:val="20"/>
-              </w:rPr>
-              <w:t>address:</w:t>
-            </w:r>
-            <w:r>
-              <w:rPr>
-                <w:spacing w:val="-4"/>
-                <w:sz w:val="20"/>
-              </w:rPr>
-              <w:t xml:space="preserve"> </w:t>
-            </w:r>
-            <w:r>
-              <w:rPr>
-                <w:b/>
-                <w:bCs/>
-                <w:sz w:val="20"/>
-              </w:rPr>
-              <w:t xml:space="preserve">{% if </w:t>
-            </w:r>
+              <w:t>notice_required</w:t>
+            </w:r>
+            <w:proofErr w:type="spellEnd"/>
             <w:r>
               <w:rPr>
                 <w:b/>
@@ -6377,31 +7445,278 @@
                 <w:sz w:val="18"/>
                 <w:szCs w:val="21"/>
               </w:rPr>
-              <w:t xml:space="preserve">notice_required and </w:t>
-            </w:r>
-            <w:r>
-              <w:rPr>
-                <w:b/>
-                <w:bCs/>
-                <w:sz w:val="20"/>
-              </w:rPr>
-              <w:t>notice_type ==”mail” %}{{ service_address</w:t>
-            </w:r>
-            <w:r>
-              <w:rPr>
-                <w:b/>
-                <w:bCs/>
-                <w:sz w:val="20"/>
-              </w:rPr>
-              <w:t xml:space="preserve"> </w:t>
-            </w:r>
-            <w:r>
-              <w:rPr>
-                <w:b/>
-                <w:bCs/>
-                <w:sz w:val="20"/>
-              </w:rPr>
-              <w:t>}}{% else %}___________{% endif %}</w:t>
+              <w:t xml:space="preserve"> and </w:t>
+            </w:r>
+            <w:proofErr w:type="spellStart"/>
+            <w:r>
+              <w:rPr>
+                <w:b/>
+                <w:bCs/>
+                <w:sz w:val="20"/>
+              </w:rPr>
+              <w:t>notice_type</w:t>
+            </w:r>
+            <w:proofErr w:type="spellEnd"/>
+            <w:r>
+              <w:rPr>
+                <w:b/>
+                <w:bCs/>
+                <w:sz w:val="20"/>
+              </w:rPr>
+              <w:t xml:space="preserve"> == “mail”)}} </w:t>
+            </w:r>
+            <w:r>
+              <w:rPr>
+                <w:sz w:val="20"/>
+              </w:rPr>
+              <w:t>First</w:t>
+            </w:r>
+            <w:r>
+              <w:rPr>
+                <w:spacing w:val="-4"/>
+                <w:sz w:val="20"/>
+              </w:rPr>
+              <w:t xml:space="preserve"> </w:t>
+            </w:r>
+            <w:r>
+              <w:rPr>
+                <w:sz w:val="20"/>
+              </w:rPr>
+              <w:t>class</w:t>
+            </w:r>
+            <w:r>
+              <w:rPr>
+                <w:spacing w:val="-2"/>
+                <w:sz w:val="20"/>
+              </w:rPr>
+              <w:t xml:space="preserve"> </w:t>
+            </w:r>
+            <w:r>
+              <w:rPr>
+                <w:sz w:val="20"/>
+              </w:rPr>
+              <w:t>mail,</w:t>
+            </w:r>
+            <w:r>
+              <w:rPr>
+                <w:spacing w:val="-4"/>
+                <w:sz w:val="20"/>
+              </w:rPr>
+              <w:t xml:space="preserve"> </w:t>
+            </w:r>
+            <w:r>
+              <w:rPr>
+                <w:sz w:val="20"/>
+              </w:rPr>
+              <w:t>to</w:t>
+            </w:r>
+            <w:r>
+              <w:rPr>
+                <w:spacing w:val="-3"/>
+                <w:sz w:val="20"/>
+              </w:rPr>
+              <w:t xml:space="preserve"> </w:t>
+            </w:r>
+            <w:r>
+              <w:rPr>
+                <w:sz w:val="20"/>
+              </w:rPr>
+              <w:t>this</w:t>
+            </w:r>
+            <w:r>
+              <w:rPr>
+                <w:spacing w:val="-1"/>
+                <w:sz w:val="20"/>
+              </w:rPr>
+              <w:t xml:space="preserve"> </w:t>
+            </w:r>
+            <w:r>
+              <w:rPr>
+                <w:sz w:val="20"/>
+              </w:rPr>
+              <w:t>mailing</w:t>
+            </w:r>
+            <w:r>
+              <w:rPr>
+                <w:spacing w:val="-3"/>
+                <w:sz w:val="20"/>
+              </w:rPr>
+              <w:t xml:space="preserve"> </w:t>
+            </w:r>
+            <w:r>
+              <w:rPr>
+                <w:sz w:val="20"/>
+              </w:rPr>
+              <w:t>address:</w:t>
+            </w:r>
+            <w:r>
+              <w:rPr>
+                <w:spacing w:val="-4"/>
+                <w:sz w:val="20"/>
+              </w:rPr>
+              <w:t xml:space="preserve"> </w:t>
+            </w:r>
+            <w:r>
+              <w:rPr>
+                <w:b/>
+                <w:bCs/>
+                <w:sz w:val="20"/>
+              </w:rPr>
+              <w:t xml:space="preserve">{% if </w:t>
+            </w:r>
+            <w:proofErr w:type="spellStart"/>
+            <w:r>
+              <w:rPr>
+                <w:b/>
+                <w:bCs/>
+                <w:sz w:val="18"/>
+                <w:szCs w:val="21"/>
+              </w:rPr>
+              <w:t>notice_required</w:t>
+            </w:r>
+            <w:proofErr w:type="spellEnd"/>
+            <w:r>
+              <w:rPr>
+                <w:b/>
+                <w:bCs/>
+                <w:sz w:val="18"/>
+                <w:szCs w:val="21"/>
+              </w:rPr>
+              <w:t xml:space="preserve"> and </w:t>
+            </w:r>
+            <w:proofErr w:type="spellStart"/>
+            <w:r>
+              <w:rPr>
+                <w:b/>
+                <w:bCs/>
+                <w:sz w:val="20"/>
+              </w:rPr>
+              <w:t>notice_type</w:t>
+            </w:r>
+            <w:proofErr w:type="spellEnd"/>
+            <w:r>
+              <w:rPr>
+                <w:b/>
+                <w:bCs/>
+                <w:sz w:val="20"/>
+              </w:rPr>
+              <w:t xml:space="preserve"> =</w:t>
+            </w:r>
+            <w:proofErr w:type="gramStart"/>
+            <w:r>
+              <w:rPr>
+                <w:b/>
+                <w:bCs/>
+                <w:sz w:val="20"/>
+              </w:rPr>
+              <w:t>=”mail</w:t>
+            </w:r>
+            <w:proofErr w:type="gramEnd"/>
+            <w:r>
+              <w:rPr>
+                <w:b/>
+                <w:bCs/>
+                <w:sz w:val="20"/>
+              </w:rPr>
+              <w:t xml:space="preserve">” </w:t>
+            </w:r>
+            <w:proofErr w:type="gramStart"/>
+            <w:r>
+              <w:rPr>
+                <w:b/>
+                <w:bCs/>
+                <w:sz w:val="20"/>
+              </w:rPr>
+              <w:t xml:space="preserve">%}{{ </w:t>
+            </w:r>
+            <w:proofErr w:type="spellStart"/>
+            <w:r>
+              <w:rPr>
+                <w:b/>
+                <w:bCs/>
+                <w:sz w:val="20"/>
+              </w:rPr>
+              <w:t>service</w:t>
+            </w:r>
+            <w:proofErr w:type="gramEnd"/>
+            <w:r>
+              <w:rPr>
+                <w:b/>
+                <w:bCs/>
+                <w:sz w:val="20"/>
+              </w:rPr>
+              <w:t>_</w:t>
+            </w:r>
+            <w:proofErr w:type="gramStart"/>
+            <w:r>
+              <w:rPr>
+                <w:b/>
+                <w:bCs/>
+                <w:sz w:val="20"/>
+              </w:rPr>
+              <w:t>address</w:t>
+            </w:r>
+            <w:proofErr w:type="spellEnd"/>
+            <w:r>
+              <w:rPr>
+                <w:b/>
+                <w:bCs/>
+                <w:sz w:val="20"/>
+              </w:rPr>
+              <w:t xml:space="preserve"> </w:t>
+            </w:r>
+            <w:r>
+              <w:rPr>
+                <w:b/>
+                <w:bCs/>
+                <w:sz w:val="20"/>
+              </w:rPr>
+              <w:t>}}{</w:t>
+            </w:r>
+            <w:proofErr w:type="gramEnd"/>
+            <w:r>
+              <w:rPr>
+                <w:b/>
+                <w:bCs/>
+                <w:sz w:val="20"/>
+              </w:rPr>
+              <w:t xml:space="preserve">% else </w:t>
+            </w:r>
+            <w:proofErr w:type="gramStart"/>
+            <w:r>
+              <w:rPr>
+                <w:b/>
+                <w:bCs/>
+                <w:sz w:val="20"/>
+              </w:rPr>
+              <w:t>%}_</w:t>
+            </w:r>
+            <w:proofErr w:type="gramEnd"/>
+            <w:r>
+              <w:rPr>
+                <w:b/>
+                <w:bCs/>
+                <w:sz w:val="20"/>
+              </w:rPr>
+              <w:t>_________</w:t>
+            </w:r>
+            <w:proofErr w:type="gramStart"/>
+            <w:r>
+              <w:rPr>
+                <w:b/>
+                <w:bCs/>
+                <w:sz w:val="20"/>
+              </w:rPr>
+              <w:t>_{</w:t>
+            </w:r>
+            <w:proofErr w:type="gramEnd"/>
+            <w:r>
+              <w:rPr>
+                <w:b/>
+                <w:bCs/>
+                <w:sz w:val="20"/>
+              </w:rPr>
+              <w:t>% endif %}</w:t>
             </w:r>
           </w:p>
           <w:p>
@@ -6419,8 +7734,37 @@
                 <w:bCs/>
                 <w:sz w:val="20"/>
               </w:rPr>
-              <w:t>{{output_checkbox(</w:t>
-            </w:r>
+              <w:t>{{</w:t>
+            </w:r>
+            <w:proofErr w:type="spellStart"/>
+            <w:r>
+              <w:rPr>
+                <w:b/>
+                <w:bCs/>
+                <w:sz w:val="20"/>
+              </w:rPr>
+              <w:t>output_</w:t>
+            </w:r>
+            <w:proofErr w:type="gramStart"/>
+            <w:r>
+              <w:rPr>
+                <w:b/>
+                <w:bCs/>
+                <w:sz w:val="20"/>
+              </w:rPr>
+              <w:t>checkbox</w:t>
+            </w:r>
+            <w:proofErr w:type="spellEnd"/>
+            <w:r>
+              <w:rPr>
+                <w:b/>
+                <w:bCs/>
+                <w:sz w:val="20"/>
+              </w:rPr>
+              <w:t>(</w:t>
+            </w:r>
+            <w:proofErr w:type="spellStart"/>
+            <w:proofErr w:type="gramEnd"/>
             <w:r>
               <w:rPr>
                 <w:b/>
@@ -6428,15 +7772,35 @@
                 <w:sz w:val="18"/>
                 <w:szCs w:val="21"/>
               </w:rPr>
-              <w:t xml:space="preserve">notice_required and </w:t>
-            </w:r>
-            <w:r>
-              <w:rPr>
-                <w:b/>
-                <w:bCs/>
-                <w:sz w:val="20"/>
-              </w:rPr>
-              <w:t xml:space="preserve">notice_type == “in person”)}} </w:t>
+              <w:t>notice_required</w:t>
+            </w:r>
+            <w:proofErr w:type="spellEnd"/>
+            <w:r>
+              <w:rPr>
+                <w:b/>
+                <w:bCs/>
+                <w:sz w:val="18"/>
+                <w:szCs w:val="21"/>
+              </w:rPr>
+              <w:t xml:space="preserve"> and </w:t>
+            </w:r>
+            <w:proofErr w:type="spellStart"/>
+            <w:r>
+              <w:rPr>
+                <w:b/>
+                <w:bCs/>
+                <w:sz w:val="20"/>
+              </w:rPr>
+              <w:t>notice_type</w:t>
+            </w:r>
+            <w:proofErr w:type="spellEnd"/>
+            <w:r>
+              <w:rPr>
+                <w:b/>
+                <w:bCs/>
+                <w:sz w:val="20"/>
+              </w:rPr>
+              <w:t xml:space="preserve"> == “in person”)}} </w:t>
             </w:r>
             <w:r>
               <w:rPr>
@@ -6480,8 +7844,37 @@
                 <w:bCs/>
                 <w:sz w:val="20"/>
               </w:rPr>
-              <w:t>{{output_checkbox(</w:t>
-            </w:r>
+              <w:t>{{</w:t>
+            </w:r>
+            <w:proofErr w:type="spellStart"/>
+            <w:r>
+              <w:rPr>
+                <w:b/>
+                <w:bCs/>
+                <w:sz w:val="20"/>
+              </w:rPr>
+              <w:t>output_</w:t>
+            </w:r>
+            <w:proofErr w:type="gramStart"/>
+            <w:r>
+              <w:rPr>
+                <w:b/>
+                <w:bCs/>
+                <w:sz w:val="20"/>
+              </w:rPr>
+              <w:t>checkbox</w:t>
+            </w:r>
+            <w:proofErr w:type="spellEnd"/>
+            <w:r>
+              <w:rPr>
+                <w:b/>
+                <w:bCs/>
+                <w:sz w:val="20"/>
+              </w:rPr>
+              <w:t>(</w:t>
+            </w:r>
+            <w:proofErr w:type="spellStart"/>
+            <w:proofErr w:type="gramEnd"/>
             <w:r>
               <w:rPr>
                 <w:b/>
@@ -6489,80 +7882,9 @@
                 <w:sz w:val="18"/>
                 <w:szCs w:val="21"/>
               </w:rPr>
-              <w:t xml:space="preserve">notice_required and </w:t>
-            </w:r>
-            <w:r>
-              <w:rPr>
-                <w:b/>
-                <w:bCs/>
-                <w:sz w:val="20"/>
-              </w:rPr>
-              <w:t xml:space="preserve">notice_type == “email”)}} </w:t>
-            </w:r>
-            <w:r>
-              <w:rPr>
-                <w:spacing w:val="-2"/>
-                <w:sz w:val="20"/>
-              </w:rPr>
-              <w:t>E-Mail,</w:t>
-            </w:r>
-            <w:r>
-              <w:rPr>
-                <w:spacing w:val="-4"/>
-                <w:sz w:val="20"/>
-              </w:rPr>
-              <w:t xml:space="preserve"> </w:t>
-            </w:r>
-            <w:r>
-              <w:rPr>
-                <w:spacing w:val="-2"/>
-                <w:sz w:val="20"/>
-              </w:rPr>
-              <w:t>to</w:t>
-            </w:r>
-            <w:r>
-              <w:rPr>
-                <w:spacing w:val="-6"/>
-                <w:sz w:val="20"/>
-              </w:rPr>
-              <w:t xml:space="preserve"> </w:t>
-            </w:r>
-            <w:r>
-              <w:rPr>
-                <w:spacing w:val="-2"/>
-                <w:sz w:val="20"/>
-              </w:rPr>
-              <w:t>this e-mail</w:t>
-            </w:r>
-            <w:r>
-              <w:rPr>
-                <w:spacing w:val="-7"/>
-                <w:sz w:val="20"/>
-              </w:rPr>
-              <w:t xml:space="preserve"> </w:t>
-            </w:r>
-            <w:r>
-              <w:rPr>
-                <w:spacing w:val="-2"/>
-                <w:sz w:val="20"/>
-              </w:rPr>
-              <w:t>address:</w:t>
-            </w:r>
-            <w:r>
-              <w:rPr>
-                <w:spacing w:val="-6"/>
-                <w:sz w:val="20"/>
-              </w:rPr>
-              <w:t xml:space="preserve"> </w:t>
-            </w:r>
-            <w:r>
-              <w:rPr>
-                <w:b/>
-                <w:bCs/>
-                <w:sz w:val="20"/>
-              </w:rPr>
-              <w:t xml:space="preserve">{% if </w:t>
-            </w:r>
+              <w:t>notice_required</w:t>
+            </w:r>
+            <w:proofErr w:type="spellEnd"/>
             <w:r>
               <w:rPr>
                 <w:b/>
@@ -6570,15 +7892,217 @@
                 <w:sz w:val="18"/>
                 <w:szCs w:val="21"/>
               </w:rPr>
-              <w:t xml:space="preserve">notice_required and </w:t>
-            </w:r>
-            <w:r>
-              <w:rPr>
-                <w:b/>
-                <w:bCs/>
-                <w:sz w:val="20"/>
-              </w:rPr>
-              <w:t>notice_type == “email” %}{{ service_email_address }}{% else %}___________{% endif %}</w:t>
+              <w:t xml:space="preserve"> and </w:t>
+            </w:r>
+            <w:proofErr w:type="spellStart"/>
+            <w:r>
+              <w:rPr>
+                <w:b/>
+                <w:bCs/>
+                <w:sz w:val="20"/>
+              </w:rPr>
+              <w:t>notice_type</w:t>
+            </w:r>
+            <w:proofErr w:type="spellEnd"/>
+            <w:r>
+              <w:rPr>
+                <w:b/>
+                <w:bCs/>
+                <w:sz w:val="20"/>
+              </w:rPr>
+              <w:t xml:space="preserve"> == “email”)}} </w:t>
+            </w:r>
+            <w:r>
+              <w:rPr>
+                <w:spacing w:val="-2"/>
+                <w:sz w:val="20"/>
+              </w:rPr>
+              <w:t>E-Mail,</w:t>
+            </w:r>
+            <w:r>
+              <w:rPr>
+                <w:spacing w:val="-4"/>
+                <w:sz w:val="20"/>
+              </w:rPr>
+              <w:t xml:space="preserve"> </w:t>
+            </w:r>
+            <w:r>
+              <w:rPr>
+                <w:spacing w:val="-2"/>
+                <w:sz w:val="20"/>
+              </w:rPr>
+              <w:t>to</w:t>
+            </w:r>
+            <w:r>
+              <w:rPr>
+                <w:spacing w:val="-6"/>
+                <w:sz w:val="20"/>
+              </w:rPr>
+              <w:t xml:space="preserve"> </w:t>
+            </w:r>
+            <w:r>
+              <w:rPr>
+                <w:spacing w:val="-2"/>
+                <w:sz w:val="20"/>
+              </w:rPr>
+              <w:t>this e-mail</w:t>
+            </w:r>
+            <w:r>
+              <w:rPr>
+                <w:spacing w:val="-7"/>
+                <w:sz w:val="20"/>
+              </w:rPr>
+              <w:t xml:space="preserve"> </w:t>
+            </w:r>
+            <w:r>
+              <w:rPr>
+                <w:spacing w:val="-2"/>
+                <w:sz w:val="20"/>
+              </w:rPr>
+              <w:t>address:</w:t>
+            </w:r>
+            <w:r>
+              <w:rPr>
+                <w:spacing w:val="-6"/>
+                <w:sz w:val="20"/>
+              </w:rPr>
+              <w:t xml:space="preserve"> </w:t>
+            </w:r>
+            <w:r>
+              <w:rPr>
+                <w:b/>
+                <w:bCs/>
+                <w:sz w:val="20"/>
+              </w:rPr>
+              <w:t xml:space="preserve">{% if </w:t>
+            </w:r>
+            <w:proofErr w:type="spellStart"/>
+            <w:r>
+              <w:rPr>
+                <w:b/>
+                <w:bCs/>
+                <w:sz w:val="18"/>
+                <w:szCs w:val="21"/>
+              </w:rPr>
+              <w:t>notice_required</w:t>
+            </w:r>
+            <w:proofErr w:type="spellEnd"/>
+            <w:r>
+              <w:rPr>
+                <w:b/>
+                <w:bCs/>
+                <w:sz w:val="18"/>
+                <w:szCs w:val="21"/>
+              </w:rPr>
+              <w:t xml:space="preserve"> and </w:t>
+            </w:r>
+            <w:proofErr w:type="spellStart"/>
+            <w:r>
+              <w:rPr>
+                <w:b/>
+                <w:bCs/>
+                <w:sz w:val="20"/>
+              </w:rPr>
+              <w:t>notice_type</w:t>
+            </w:r>
+            <w:proofErr w:type="spellEnd"/>
+            <w:r>
+              <w:rPr>
+                <w:b/>
+                <w:bCs/>
+                <w:sz w:val="20"/>
+              </w:rPr>
+              <w:t xml:space="preserve"> == “email” </w:t>
+            </w:r>
+            <w:proofErr w:type="gramStart"/>
+            <w:r>
+              <w:rPr>
+                <w:b/>
+                <w:bCs/>
+                <w:sz w:val="20"/>
+              </w:rPr>
+              <w:t xml:space="preserve">%}{{ </w:t>
+            </w:r>
+            <w:proofErr w:type="spellStart"/>
+            <w:r>
+              <w:rPr>
+                <w:b/>
+                <w:bCs/>
+                <w:sz w:val="20"/>
+              </w:rPr>
+              <w:t>service</w:t>
+            </w:r>
+            <w:proofErr w:type="gramEnd"/>
+            <w:r>
+              <w:rPr>
+                <w:b/>
+                <w:bCs/>
+                <w:sz w:val="20"/>
+              </w:rPr>
+              <w:t>_email_</w:t>
+            </w:r>
+            <w:proofErr w:type="gramStart"/>
+            <w:r>
+              <w:rPr>
+                <w:b/>
+                <w:bCs/>
+                <w:sz w:val="20"/>
+              </w:rPr>
+              <w:t>address</w:t>
+            </w:r>
+            <w:proofErr w:type="spellEnd"/>
+            <w:r>
+              <w:rPr>
+                <w:b/>
+                <w:bCs/>
+                <w:sz w:val="20"/>
+              </w:rPr>
+              <w:t xml:space="preserve"> }}{</w:t>
+            </w:r>
+            <w:proofErr w:type="gramEnd"/>
+            <w:r>
+              <w:rPr>
+                <w:b/>
+                <w:bCs/>
+                <w:sz w:val="20"/>
+              </w:rPr>
+              <w:t xml:space="preserve">% else </w:t>
+            </w:r>
+            <w:proofErr w:type="gramStart"/>
+            <w:r>
+              <w:rPr>
+                <w:b/>
+                <w:bCs/>
+                <w:sz w:val="20"/>
+              </w:rPr>
+              <w:t>%}_</w:t>
+            </w:r>
+            <w:proofErr w:type="gramEnd"/>
+            <w:r>
+              <w:rPr>
+                <w:b/>
+                <w:bCs/>
+                <w:sz w:val="20"/>
+              </w:rPr>
+              <w:t>_________</w:t>
+            </w:r>
+            <w:proofErr w:type="gramStart"/>
+            <w:r>
+              <w:rPr>
+                <w:b/>
+                <w:bCs/>
+                <w:sz w:val="20"/>
+              </w:rPr>
+              <w:t>_{</w:t>
+            </w:r>
+            <w:proofErr w:type="gramEnd"/>
+            <w:r>
+              <w:rPr>
+                <w:b/>
+                <w:bCs/>
+                <w:sz w:val="20"/>
+              </w:rPr>
+              <w:t>% endif %}</w:t>
             </w:r>
           </w:p>
         </w:tc>
@@ -7048,6 +8572,7 @@
               </w:rPr>
               <w:t xml:space="preserve">Name: </w:t>
             </w:r>
+            <w:proofErr w:type="gramStart"/>
             <w:r>
               <w:rPr>
                 <w:b/>
@@ -7055,7 +8580,57 @@
                 <w:sz w:val="20"/>
                 <w:szCs w:val="20"/>
               </w:rPr>
-              <w:t>{{ users[0].name_full() }}</w:t>
+              <w:t>{{ users</w:t>
+            </w:r>
+            <w:proofErr w:type="gramEnd"/>
+            <w:r>
+              <w:rPr>
+                <w:b/>
+                <w:bCs/>
+                <w:sz w:val="20"/>
+                <w:szCs w:val="20"/>
+              </w:rPr>
+              <w:t>[0].</w:t>
+            </w:r>
+            <w:proofErr w:type="spellStart"/>
+            <w:r>
+              <w:rPr>
+                <w:b/>
+                <w:bCs/>
+                <w:sz w:val="20"/>
+                <w:szCs w:val="20"/>
+              </w:rPr>
+              <w:t>name_</w:t>
+            </w:r>
+            <w:proofErr w:type="gramStart"/>
+            <w:r>
+              <w:rPr>
+                <w:b/>
+                <w:bCs/>
+                <w:sz w:val="20"/>
+                <w:szCs w:val="20"/>
+              </w:rPr>
+              <w:t>full</w:t>
+            </w:r>
+            <w:proofErr w:type="spellEnd"/>
+            <w:r>
+              <w:rPr>
+                <w:b/>
+                <w:bCs/>
+                <w:sz w:val="20"/>
+                <w:szCs w:val="20"/>
+              </w:rPr>
+              <w:t>() }</w:t>
+            </w:r>
+            <w:proofErr w:type="gramEnd"/>
+            <w:r>
+              <w:rPr>
+                <w:b/>
+                <w:bCs/>
+                <w:sz w:val="20"/>
+                <w:szCs w:val="20"/>
+              </w:rPr>
+              <w:t>}</w:t>
             </w:r>
             <w:r>
               <w:rPr>
@@ -7071,6 +8646,7 @@
               </w:rPr>
               <w:t xml:space="preserve">Signature: </w:t>
             </w:r>
+            <w:proofErr w:type="gramStart"/>
             <w:r>
               <w:rPr>
                 <w:b/>
@@ -7078,7 +8654,108 @@
                 <w:sz w:val="20"/>
                 <w:szCs w:val="20"/>
               </w:rPr>
-              <w:t xml:space="preserve">{{ users[0].signature_if_final(i).show(width=”2in”) }} </w:t>
+              <w:t>{{ users</w:t>
+            </w:r>
+            <w:proofErr w:type="gramEnd"/>
+            <w:r>
+              <w:rPr>
+                <w:b/>
+                <w:bCs/>
+                <w:sz w:val="20"/>
+                <w:szCs w:val="20"/>
+              </w:rPr>
+              <w:t>[0</w:t>
+            </w:r>
+            <w:proofErr w:type="gramStart"/>
+            <w:r>
+              <w:rPr>
+                <w:b/>
+                <w:bCs/>
+                <w:sz w:val="20"/>
+                <w:szCs w:val="20"/>
+              </w:rPr>
+              <w:t>].</w:t>
+            </w:r>
+            <w:proofErr w:type="spellStart"/>
+            <w:r>
+              <w:rPr>
+                <w:b/>
+                <w:bCs/>
+                <w:sz w:val="20"/>
+                <w:szCs w:val="20"/>
+              </w:rPr>
+              <w:t>signature</w:t>
+            </w:r>
+            <w:proofErr w:type="gramEnd"/>
+            <w:r>
+              <w:rPr>
+                <w:b/>
+                <w:bCs/>
+                <w:sz w:val="20"/>
+                <w:szCs w:val="20"/>
+              </w:rPr>
+              <w:t>_if_final</w:t>
+            </w:r>
+            <w:proofErr w:type="spellEnd"/>
+            <w:r>
+              <w:rPr>
+                <w:b/>
+                <w:bCs/>
+                <w:sz w:val="20"/>
+                <w:szCs w:val="20"/>
+              </w:rPr>
+              <w:t>(</w:t>
+            </w:r>
+            <w:proofErr w:type="spellStart"/>
+            <w:r>
+              <w:rPr>
+                <w:b/>
+                <w:bCs/>
+                <w:sz w:val="20"/>
+                <w:szCs w:val="20"/>
+              </w:rPr>
+              <w:t>i</w:t>
+            </w:r>
+            <w:proofErr w:type="spellEnd"/>
+            <w:proofErr w:type="gramStart"/>
+            <w:r>
+              <w:rPr>
+                <w:b/>
+                <w:bCs/>
+                <w:sz w:val="20"/>
+                <w:szCs w:val="20"/>
+              </w:rPr>
+              <w:t>).show</w:t>
+            </w:r>
+            <w:proofErr w:type="gramEnd"/>
+            <w:r>
+              <w:rPr>
+                <w:b/>
+                <w:bCs/>
+                <w:sz w:val="20"/>
+                <w:szCs w:val="20"/>
+              </w:rPr>
+              <w:t>(width=”2in”</w:t>
+            </w:r>
+            <w:proofErr w:type="gramStart"/>
+            <w:r>
+              <w:rPr>
+                <w:b/>
+                <w:bCs/>
+                <w:sz w:val="20"/>
+                <w:szCs w:val="20"/>
+              </w:rPr>
+              <w:t>) }</w:t>
+            </w:r>
+            <w:proofErr w:type="gramEnd"/>
+            <w:r>
+              <w:rPr>
+                <w:b/>
+                <w:bCs/>
+                <w:sz w:val="20"/>
+                <w:szCs w:val="20"/>
+              </w:rPr>
+              <w:t xml:space="preserve">} </w:t>
             </w:r>
             <w:r>
               <w:rPr>
@@ -7086,6 +8763,7 @@
               </w:rPr>
               <w:t xml:space="preserve">Date: </w:t>
             </w:r>
+            <w:proofErr w:type="gramStart"/>
             <w:r>
               <w:rPr>
                 <w:b/>
@@ -7093,7 +8771,57 @@
                 <w:sz w:val="20"/>
                 <w:szCs w:val="20"/>
               </w:rPr>
-              <w:t>{{ signature_date }}</w:t>
+              <w:t xml:space="preserve">{{ </w:t>
+            </w:r>
+            <w:proofErr w:type="spellStart"/>
+            <w:r>
+              <w:rPr>
+                <w:b/>
+                <w:bCs/>
+                <w:sz w:val="20"/>
+                <w:szCs w:val="20"/>
+              </w:rPr>
+              <w:t>signature</w:t>
+            </w:r>
+            <w:proofErr w:type="gramEnd"/>
+            <w:r>
+              <w:rPr>
+                <w:b/>
+                <w:bCs/>
+                <w:sz w:val="20"/>
+                <w:szCs w:val="20"/>
+              </w:rPr>
+              <w:t>_</w:t>
+            </w:r>
+            <w:proofErr w:type="gramStart"/>
+            <w:r>
+              <w:rPr>
+                <w:b/>
+                <w:bCs/>
+                <w:sz w:val="20"/>
+                <w:szCs w:val="20"/>
+              </w:rPr>
+              <w:t>date</w:t>
+            </w:r>
+            <w:proofErr w:type="spellEnd"/>
+            <w:r>
+              <w:rPr>
+                <w:b/>
+                <w:bCs/>
+                <w:sz w:val="20"/>
+                <w:szCs w:val="20"/>
+              </w:rPr>
+              <w:t xml:space="preserve"> }</w:t>
+            </w:r>
+            <w:proofErr w:type="gramEnd"/>
+            <w:r>
+              <w:rPr>
+                <w:b/>
+                <w:bCs/>
+                <w:sz w:val="20"/>
+                <w:szCs w:val="20"/>
+              </w:rPr>
+              <w:t>}</w:t>
             </w:r>
           </w:p>
           <w:p>
@@ -7117,6 +8845,7 @@
                 <w:szCs w:val="20"/>
               </w:rPr>
             </w:pPr>
+            <w:proofErr w:type="gramStart"/>
             <w:r>
               <w:rPr>
                 <w:sz w:val="20"/>
@@ -7130,8 +8859,169 @@
                 <w:sz w:val="20"/>
                 <w:szCs w:val="20"/>
               </w:rPr>
-              <w:t>{%if not users[0].address.has_no_address %}{{ users[0].address.on_one_line() }}{% endif %}</w:t>
-            </w:r>
+              <w:t>{</w:t>
+            </w:r>
+            <w:proofErr w:type="gramEnd"/>
+            <w:r>
+              <w:rPr>
+                <w:b/>
+                <w:bCs/>
+                <w:sz w:val="20"/>
+                <w:szCs w:val="20"/>
+              </w:rPr>
+              <w:t xml:space="preserve">%if not </w:t>
+            </w:r>
+            <w:proofErr w:type="gramStart"/>
+            <w:r>
+              <w:rPr>
+                <w:b/>
+                <w:bCs/>
+                <w:sz w:val="20"/>
+                <w:szCs w:val="20"/>
+              </w:rPr>
+              <w:t>users[</w:t>
+            </w:r>
+            <w:proofErr w:type="gramEnd"/>
+            <w:r>
+              <w:rPr>
+                <w:b/>
+                <w:bCs/>
+                <w:sz w:val="20"/>
+                <w:szCs w:val="20"/>
+              </w:rPr>
+              <w:t>0</w:t>
+            </w:r>
+            <w:proofErr w:type="gramStart"/>
+            <w:r>
+              <w:rPr>
+                <w:b/>
+                <w:bCs/>
+                <w:sz w:val="20"/>
+                <w:szCs w:val="20"/>
+              </w:rPr>
+              <w:t>].</w:t>
+            </w:r>
+            <w:proofErr w:type="spellStart"/>
+            <w:r>
+              <w:rPr>
+                <w:b/>
+                <w:bCs/>
+                <w:sz w:val="20"/>
+                <w:szCs w:val="20"/>
+              </w:rPr>
+              <w:t>address.has</w:t>
+            </w:r>
+            <w:proofErr w:type="gramEnd"/>
+            <w:r>
+              <w:rPr>
+                <w:b/>
+                <w:bCs/>
+                <w:sz w:val="20"/>
+                <w:szCs w:val="20"/>
+              </w:rPr>
+              <w:t>_no_address</w:t>
+            </w:r>
+            <w:proofErr w:type="spellEnd"/>
+            <w:r>
+              <w:rPr>
+                <w:b/>
+                <w:bCs/>
+                <w:sz w:val="20"/>
+                <w:szCs w:val="20"/>
+              </w:rPr>
+              <w:t xml:space="preserve"> </w:t>
+            </w:r>
+            <w:proofErr w:type="gramStart"/>
+            <w:r>
+              <w:rPr>
+                <w:b/>
+                <w:bCs/>
+                <w:sz w:val="20"/>
+                <w:szCs w:val="20"/>
+              </w:rPr>
+              <w:t>%}{{ users</w:t>
+            </w:r>
+            <w:proofErr w:type="gramEnd"/>
+            <w:r>
+              <w:rPr>
+                <w:b/>
+                <w:bCs/>
+                <w:sz w:val="20"/>
+                <w:szCs w:val="20"/>
+              </w:rPr>
+              <w:t>[0</w:t>
+            </w:r>
+            <w:proofErr w:type="gramStart"/>
+            <w:r>
+              <w:rPr>
+                <w:b/>
+                <w:bCs/>
+                <w:sz w:val="20"/>
+                <w:szCs w:val="20"/>
+              </w:rPr>
+              <w:t>].</w:t>
+            </w:r>
+            <w:proofErr w:type="spellStart"/>
+            <w:r>
+              <w:rPr>
+                <w:b/>
+                <w:bCs/>
+                <w:sz w:val="20"/>
+                <w:szCs w:val="20"/>
+              </w:rPr>
+              <w:t>address</w:t>
+            </w:r>
+            <w:proofErr w:type="gramEnd"/>
+            <w:r>
+              <w:rPr>
+                <w:b/>
+                <w:bCs/>
+                <w:sz w:val="20"/>
+                <w:szCs w:val="20"/>
+              </w:rPr>
+              <w:t>.on_one_</w:t>
+            </w:r>
+            <w:proofErr w:type="gramStart"/>
+            <w:r>
+              <w:rPr>
+                <w:b/>
+                <w:bCs/>
+                <w:sz w:val="20"/>
+                <w:szCs w:val="20"/>
+              </w:rPr>
+              <w:t>line</w:t>
+            </w:r>
+            <w:proofErr w:type="spellEnd"/>
+            <w:r>
+              <w:rPr>
+                <w:b/>
+                <w:bCs/>
+                <w:sz w:val="20"/>
+                <w:szCs w:val="20"/>
+              </w:rPr>
+              <w:t>() }}{</w:t>
+            </w:r>
+            <w:proofErr w:type="gramEnd"/>
+            <w:r>
+              <w:rPr>
+                <w:b/>
+                <w:bCs/>
+                <w:sz w:val="20"/>
+                <w:szCs w:val="20"/>
+              </w:rPr>
+              <w:t xml:space="preserve">% </w:t>
+            </w:r>
+            <w:proofErr w:type="gramStart"/>
+            <w:r>
+              <w:rPr>
+                <w:b/>
+                <w:bCs/>
+                <w:sz w:val="20"/>
+                <w:szCs w:val="20"/>
+              </w:rPr>
+              <w:t>endif %}</w:t>
+            </w:r>
+            <w:proofErr w:type="gramEnd"/>
           </w:p>
           <w:p>
             <w:pPr>
@@ -7158,13 +9048,77 @@
               </w:rPr>
               <w:t xml:space="preserve">Mobile Phone Number: </w:t>
             </w:r>
-            <w:r>
-              <w:rPr>
-                <w:b/>
-                <w:bCs/>
-                <w:sz w:val="20"/>
-              </w:rPr>
-              <w:t xml:space="preserve">{{ users[0].phone_numbers() }} </w:t>
+            <w:proofErr w:type="gramStart"/>
+            <w:r>
+              <w:rPr>
+                <w:b/>
+                <w:bCs/>
+                <w:sz w:val="20"/>
+              </w:rPr>
+              <w:t>{{ users</w:t>
+            </w:r>
+            <w:proofErr w:type="gramEnd"/>
+            <w:r>
+              <w:rPr>
+                <w:b/>
+                <w:bCs/>
+                <w:sz w:val="20"/>
+              </w:rPr>
+              <w:t>[0</w:t>
+            </w:r>
+            <w:proofErr w:type="gramStart"/>
+            <w:r>
+              <w:rPr>
+                <w:b/>
+                <w:bCs/>
+                <w:sz w:val="20"/>
+              </w:rPr>
+              <w:t>].</w:t>
+            </w:r>
+            <w:proofErr w:type="spellStart"/>
+            <w:r>
+              <w:rPr>
+                <w:b/>
+                <w:bCs/>
+                <w:sz w:val="20"/>
+              </w:rPr>
+              <w:t>phone</w:t>
+            </w:r>
+            <w:proofErr w:type="gramEnd"/>
+            <w:r>
+              <w:rPr>
+                <w:b/>
+                <w:bCs/>
+                <w:sz w:val="20"/>
+              </w:rPr>
+              <w:t>_</w:t>
+            </w:r>
+            <w:proofErr w:type="gramStart"/>
+            <w:r>
+              <w:rPr>
+                <w:b/>
+                <w:bCs/>
+                <w:sz w:val="20"/>
+              </w:rPr>
+              <w:t>numbers</w:t>
+            </w:r>
+            <w:proofErr w:type="spellEnd"/>
+            <w:r>
+              <w:rPr>
+                <w:b/>
+                <w:bCs/>
+                <w:sz w:val="20"/>
+              </w:rPr>
+              <w:t>() }</w:t>
+            </w:r>
+            <w:proofErr w:type="gramEnd"/>
+            <w:r>
+              <w:rPr>
+                <w:b/>
+                <w:bCs/>
+                <w:sz w:val="20"/>
+              </w:rPr>
+              <w:t xml:space="preserve">} </w:t>
             </w:r>
             <w:r>
               <w:rPr>
@@ -7178,7 +9132,43 @@
                 <w:bCs/>
                 <w:sz w:val="20"/>
               </w:rPr>
-              <w:t xml:space="preserve"> {{ users[0].email }}</w:t>
+              <w:t xml:space="preserve"> </w:t>
+            </w:r>
+            <w:proofErr w:type="gramStart"/>
+            <w:r>
+              <w:rPr>
+                <w:b/>
+                <w:bCs/>
+                <w:sz w:val="20"/>
+              </w:rPr>
+              <w:t>{{ users</w:t>
+            </w:r>
+            <w:proofErr w:type="gramEnd"/>
+            <w:r>
+              <w:rPr>
+                <w:b/>
+                <w:bCs/>
+                <w:sz w:val="20"/>
+              </w:rPr>
+              <w:t>[0</w:t>
+            </w:r>
+            <w:proofErr w:type="gramStart"/>
+            <w:r>
+              <w:rPr>
+                <w:b/>
+                <w:bCs/>
+                <w:sz w:val="20"/>
+              </w:rPr>
+              <w:t>].email</w:t>
+            </w:r>
+            <w:proofErr w:type="gramEnd"/>
+            <w:r>
+              <w:rPr>
+                <w:b/>
+                <w:bCs/>
+                <w:sz w:val="20"/>
+              </w:rPr>
+              <w:t xml:space="preserve"> }}</w:t>
             </w:r>
           </w:p>
           <w:p>
@@ -7200,8 +9190,55 @@
                 <w:bCs/>
                 <w:sz w:val="20"/>
               </w:rPr>
-              <w:t>{{output_checkbox(al_person_answering == “</w:t>
-            </w:r>
+              <w:t>{{</w:t>
+            </w:r>
+            <w:proofErr w:type="spellStart"/>
+            <w:r>
+              <w:rPr>
+                <w:b/>
+                <w:bCs/>
+                <w:sz w:val="20"/>
+              </w:rPr>
+              <w:t>output_</w:t>
+            </w:r>
+            <w:proofErr w:type="gramStart"/>
+            <w:r>
+              <w:rPr>
+                <w:b/>
+                <w:bCs/>
+                <w:sz w:val="20"/>
+              </w:rPr>
+              <w:t>checkbox</w:t>
+            </w:r>
+            <w:proofErr w:type="spellEnd"/>
+            <w:r>
+              <w:rPr>
+                <w:b/>
+                <w:bCs/>
+                <w:sz w:val="20"/>
+              </w:rPr>
+              <w:t>(</w:t>
+            </w:r>
+            <w:proofErr w:type="spellStart"/>
+            <w:proofErr w:type="gramEnd"/>
+            <w:r>
+              <w:rPr>
+                <w:b/>
+                <w:bCs/>
+                <w:sz w:val="20"/>
+              </w:rPr>
+              <w:t>al_person_answering</w:t>
+            </w:r>
+            <w:proofErr w:type="spellEnd"/>
+            <w:r>
+              <w:rPr>
+                <w:b/>
+                <w:bCs/>
+                <w:sz w:val="20"/>
+              </w:rPr>
+              <w:t xml:space="preserve"> == “</w:t>
+            </w:r>
+            <w:proofErr w:type="spellStart"/>
             <w:r>
               <w:rPr>
                 <w:b/>
@@ -7209,7 +9246,17 @@
                 <w:sz w:val="18"/>
                 <w:szCs w:val="21"/>
               </w:rPr>
-              <w:t>attorney_ghostwriting”</w:t>
+              <w:t>attorney_ghostwriting</w:t>
+            </w:r>
+            <w:proofErr w:type="spellEnd"/>
+            <w:r>
+              <w:rPr>
+                <w:b/>
+                <w:bCs/>
+                <w:sz w:val="18"/>
+                <w:szCs w:val="21"/>
+              </w:rPr>
+              <w:t>”</w:t>
             </w:r>
             <w:r>
               <w:rPr>
@@ -7542,6 +9589,7 @@
               </w:rPr>
               <w:t xml:space="preserve">Lawyer’s Name: </w:t>
             </w:r>
+            <w:proofErr w:type="gramStart"/>
             <w:r>
               <w:rPr>
                 <w:b/>
@@ -7549,7 +9597,17 @@
                 <w:sz w:val="20"/>
                 <w:szCs w:val="20"/>
               </w:rPr>
-              <w:t>{{ attorneys }}</w:t>
+              <w:t>{{ attorneys</w:t>
+            </w:r>
+            <w:proofErr w:type="gramEnd"/>
+            <w:r>
+              <w:rPr>
+                <w:b/>
+                <w:bCs/>
+                <w:sz w:val="20"/>
+                <w:szCs w:val="20"/>
+              </w:rPr>
+              <w:t xml:space="preserve"> }}</w:t>
             </w:r>
             <w:r>
               <w:rPr>
@@ -7565,6 +9623,7 @@
               </w:rPr>
               <w:t xml:space="preserve">Signature: </w:t>
             </w:r>
+            <w:proofErr w:type="gramStart"/>
             <w:r>
               <w:rPr>
                 <w:b/>
@@ -7572,8 +9631,9 @@
                 <w:sz w:val="20"/>
                 <w:szCs w:val="20"/>
               </w:rPr>
-              <w:t>{{ attorneys[0].signature_if_final(i).show(width=”2in”) }}</w:t>
-            </w:r>
+              <w:t>{{ attorneys</w:t>
+            </w:r>
+            <w:proofErr w:type="gramEnd"/>
             <w:r>
               <w:rPr>
                 <w:b/>
@@ -7581,14 +9641,106 @@
                 <w:sz w:val="20"/>
                 <w:szCs w:val="20"/>
               </w:rPr>
+              <w:t>[0</w:t>
+            </w:r>
+            <w:proofErr w:type="gramStart"/>
+            <w:r>
+              <w:rPr>
+                <w:b/>
+                <w:bCs/>
+                <w:sz w:val="20"/>
+                <w:szCs w:val="20"/>
+              </w:rPr>
+              <w:t>].</w:t>
+            </w:r>
+            <w:proofErr w:type="spellStart"/>
+            <w:r>
+              <w:rPr>
+                <w:b/>
+                <w:bCs/>
+                <w:sz w:val="20"/>
+                <w:szCs w:val="20"/>
+              </w:rPr>
+              <w:t>signature</w:t>
+            </w:r>
+            <w:proofErr w:type="gramEnd"/>
+            <w:r>
+              <w:rPr>
+                <w:b/>
+                <w:bCs/>
+                <w:sz w:val="20"/>
+                <w:szCs w:val="20"/>
+              </w:rPr>
+              <w:t>_if_final</w:t>
+            </w:r>
+            <w:proofErr w:type="spellEnd"/>
+            <w:r>
+              <w:rPr>
+                <w:b/>
+                <w:bCs/>
+                <w:sz w:val="20"/>
+                <w:szCs w:val="20"/>
+              </w:rPr>
+              <w:t>(</w:t>
+            </w:r>
+            <w:proofErr w:type="spellStart"/>
+            <w:r>
+              <w:rPr>
+                <w:b/>
+                <w:bCs/>
+                <w:sz w:val="20"/>
+                <w:szCs w:val="20"/>
+              </w:rPr>
+              <w:t>i</w:t>
+            </w:r>
+            <w:proofErr w:type="spellEnd"/>
+            <w:proofErr w:type="gramStart"/>
+            <w:r>
+              <w:rPr>
+                <w:b/>
+                <w:bCs/>
+                <w:sz w:val="20"/>
+                <w:szCs w:val="20"/>
+              </w:rPr>
+              <w:t>).show</w:t>
+            </w:r>
+            <w:proofErr w:type="gramEnd"/>
+            <w:r>
+              <w:rPr>
+                <w:b/>
+                <w:bCs/>
+                <w:sz w:val="20"/>
+                <w:szCs w:val="20"/>
+              </w:rPr>
+              <w:t>(width=”2in”</w:t>
+            </w:r>
+            <w:proofErr w:type="gramStart"/>
+            <w:r>
+              <w:rPr>
+                <w:b/>
+                <w:bCs/>
+                <w:sz w:val="20"/>
+                <w:szCs w:val="20"/>
+              </w:rPr>
+              <w:t>) }}</w:t>
+            </w:r>
+            <w:r>
+              <w:rPr>
+                <w:b/>
+                <w:bCs/>
+                <w:sz w:val="20"/>
+                <w:szCs w:val="20"/>
+              </w:rPr>
               <w:tab/>
             </w:r>
+            <w:proofErr w:type="gramEnd"/>
             <w:r>
               <w:rPr>
                 <w:sz w:val="20"/>
               </w:rPr>
               <w:t xml:space="preserve">Date: </w:t>
             </w:r>
+            <w:proofErr w:type="gramStart"/>
             <w:r>
               <w:rPr>
                 <w:b/>
@@ -7596,7 +9748,108 @@
                 <w:sz w:val="20"/>
                 <w:szCs w:val="20"/>
               </w:rPr>
-              <w:t>{{ signature_date if attorneys.number_gathered() else “” }}</w:t>
+              <w:t xml:space="preserve">{{ </w:t>
+            </w:r>
+            <w:proofErr w:type="spellStart"/>
+            <w:r>
+              <w:rPr>
+                <w:b/>
+                <w:bCs/>
+                <w:sz w:val="20"/>
+                <w:szCs w:val="20"/>
+              </w:rPr>
+              <w:t>signature</w:t>
+            </w:r>
+            <w:proofErr w:type="gramEnd"/>
+            <w:r>
+              <w:rPr>
+                <w:b/>
+                <w:bCs/>
+                <w:sz w:val="20"/>
+                <w:szCs w:val="20"/>
+              </w:rPr>
+              <w:t>_date</w:t>
+            </w:r>
+            <w:proofErr w:type="spellEnd"/>
+            <w:r>
+              <w:rPr>
+                <w:b/>
+                <w:bCs/>
+                <w:sz w:val="20"/>
+                <w:szCs w:val="20"/>
+              </w:rPr>
+              <w:t xml:space="preserve"> if </w:t>
+            </w:r>
+            <w:proofErr w:type="spellStart"/>
+            <w:proofErr w:type="gramStart"/>
+            <w:r>
+              <w:rPr>
+                <w:b/>
+                <w:bCs/>
+                <w:sz w:val="20"/>
+                <w:szCs w:val="20"/>
+              </w:rPr>
+              <w:t>attorneys.number</w:t>
+            </w:r>
+            <w:proofErr w:type="gramEnd"/>
+            <w:r>
+              <w:rPr>
+                <w:b/>
+                <w:bCs/>
+                <w:sz w:val="20"/>
+                <w:szCs w:val="20"/>
+              </w:rPr>
+              <w:t>_</w:t>
+            </w:r>
+            <w:proofErr w:type="gramStart"/>
+            <w:r>
+              <w:rPr>
+                <w:b/>
+                <w:bCs/>
+                <w:sz w:val="20"/>
+                <w:szCs w:val="20"/>
+              </w:rPr>
+              <w:t>gathered</w:t>
+            </w:r>
+            <w:proofErr w:type="spellEnd"/>
+            <w:r>
+              <w:rPr>
+                <w:b/>
+                <w:bCs/>
+                <w:sz w:val="20"/>
+                <w:szCs w:val="20"/>
+              </w:rPr>
+              <w:t>(</w:t>
+            </w:r>
+            <w:proofErr w:type="gramEnd"/>
+            <w:r>
+              <w:rPr>
+                <w:b/>
+                <w:bCs/>
+                <w:sz w:val="20"/>
+                <w:szCs w:val="20"/>
+              </w:rPr>
+              <w:t>) else “</w:t>
+            </w:r>
+            <w:proofErr w:type="gramStart"/>
+            <w:r>
+              <w:rPr>
+                <w:b/>
+                <w:bCs/>
+                <w:sz w:val="20"/>
+                <w:szCs w:val="20"/>
+              </w:rPr>
+              <w:t>” }</w:t>
+            </w:r>
+            <w:proofErr w:type="gramEnd"/>
+            <w:r>
+              <w:rPr>
+                <w:b/>
+                <w:bCs/>
+                <w:sz w:val="20"/>
+                <w:szCs w:val="20"/>
+              </w:rPr>
+              <w:t>}</w:t>
             </w:r>
           </w:p>
           <w:p>
@@ -7619,6 +9872,7 @@
               </w:rPr>
               <w:t xml:space="preserve">Email Address: </w:t>
             </w:r>
+            <w:proofErr w:type="gramStart"/>
             <w:r>
               <w:rPr>
                 <w:b/>
@@ -7626,7 +9880,37 @@
                 <w:sz w:val="20"/>
                 <w:szCs w:val="20"/>
               </w:rPr>
-              <w:t>{{ attorneys[0].email }}</w:t>
+              <w:t>{{ attorneys</w:t>
+            </w:r>
+            <w:proofErr w:type="gramEnd"/>
+            <w:r>
+              <w:rPr>
+                <w:b/>
+                <w:bCs/>
+                <w:sz w:val="20"/>
+                <w:szCs w:val="20"/>
+              </w:rPr>
+              <w:t>[0</w:t>
+            </w:r>
+            <w:proofErr w:type="gramStart"/>
+            <w:r>
+              <w:rPr>
+                <w:b/>
+                <w:bCs/>
+                <w:sz w:val="20"/>
+                <w:szCs w:val="20"/>
+              </w:rPr>
+              <w:t>].email</w:t>
+            </w:r>
+            <w:proofErr w:type="gramEnd"/>
+            <w:r>
+              <w:rPr>
+                <w:b/>
+                <w:bCs/>
+                <w:sz w:val="20"/>
+                <w:szCs w:val="20"/>
+              </w:rPr>
+              <w:t xml:space="preserve"> }}</w:t>
             </w:r>
             <w:r>
               <w:rPr>
@@ -7648,6 +9932,7 @@
               </w:rPr>
               <w:t xml:space="preserve">): </w:t>
             </w:r>
+            <w:proofErr w:type="gramStart"/>
             <w:r>
               <w:rPr>
                 <w:rFonts w:eastAsia="Segoe UI Emoji"/>
@@ -7655,7 +9940,57 @@
                 <w:sz w:val="20"/>
                 <w:szCs w:val="20"/>
               </w:rPr>
-              <w:t>{{ attorneys[0].bbo_number }}</w:t>
+              <w:t>{{ attorneys</w:t>
+            </w:r>
+            <w:proofErr w:type="gramEnd"/>
+            <w:r>
+              <w:rPr>
+                <w:rFonts w:eastAsia="Segoe UI Emoji"/>
+                <w:b/>
+                <w:sz w:val="20"/>
+                <w:szCs w:val="20"/>
+              </w:rPr>
+              <w:t>[0</w:t>
+            </w:r>
+            <w:proofErr w:type="gramStart"/>
+            <w:r>
+              <w:rPr>
+                <w:rFonts w:eastAsia="Segoe UI Emoji"/>
+                <w:b/>
+                <w:sz w:val="20"/>
+                <w:szCs w:val="20"/>
+              </w:rPr>
+              <w:t>].</w:t>
+            </w:r>
+            <w:proofErr w:type="spellStart"/>
+            <w:r>
+              <w:rPr>
+                <w:rFonts w:eastAsia="Segoe UI Emoji"/>
+                <w:b/>
+                <w:sz w:val="20"/>
+                <w:szCs w:val="20"/>
+              </w:rPr>
+              <w:t>bbo</w:t>
+            </w:r>
+            <w:proofErr w:type="gramEnd"/>
+            <w:r>
+              <w:rPr>
+                <w:rFonts w:eastAsia="Segoe UI Emoji"/>
+                <w:b/>
+                <w:sz w:val="20"/>
+                <w:szCs w:val="20"/>
+              </w:rPr>
+              <w:t>_number</w:t>
+            </w:r>
+            <w:proofErr w:type="spellEnd"/>
+            <w:r>
+              <w:rPr>
+                <w:rFonts w:eastAsia="Segoe UI Emoji"/>
+                <w:b/>
+                <w:sz w:val="20"/>
+                <w:szCs w:val="20"/>
+              </w:rPr>
+              <w:t xml:space="preserve"> }}</w:t>
             </w:r>
           </w:p>
         </w:tc>
@@ -7983,9 +10318,9 @@
       </w:pPr>
     </w:p>
     <w:sectPr>
-      <w:footerReference w:type="even" r:id="rId12"/>
-      <w:footerReference w:type="default" r:id="rId13"/>
-      <w:footerReference w:type="first" r:id="rId14"/>
+      <w:footerReference w:type="even" r:id="rId13"/>
+      <w:footerReference w:type="default" r:id="rId14"/>
+      <w:footerReference w:type="first" r:id="rId15"/>
       <w:pgSz w:w="12240" w:h="15840"/>
       <w:pgMar w:top="640" w:right="180" w:bottom="600" w:left="300" w:header="0" w:footer="417" w:gutter="0"/>
       <w:cols w:space="720"/>
@@ -7997,7 +10332,7 @@
 </file>
 
 <file path=word/endnotes.xml><?xml version="1.0" encoding="utf-8"?>
-<w:endnotes xmlns:wpc="http://schemas.microsoft.com/office/word/2010/wordprocessingCanvas" xmlns:cx="http://schemas.microsoft.com/office/drawing/2014/chartex" xmlns:cx1="http://schemas.microsoft.com/office/drawing/2015/9/8/chartex" xmlns:cx2="http://schemas.microsoft.com/office/drawing/2015/10/21/chartex" xmlns:cx3="http://schemas.microsoft.com/office/drawing/2016/5/9/chartex" xmlns:cx4="http://schemas.microsoft.com/office/drawing/2016/5/10/chartex" xmlns:cx5="http://schemas.microsoft.com/office/drawing/2016/5/11/chartex" xmlns:cx6="http://schemas.microsoft.com/office/drawing/2016/5/12/chartex" xmlns:cx7="http://schemas.microsoft.com/office/drawing/2016/5/13/chartex" xmlns:cx8="http://schemas.microsoft.com/office/drawing/2016/5/14/chartex" xmlns:mc="http://schemas.openxmlformats.org/markup-compatibility/2006" xmlns:aink="http://schemas.microsoft.com/office/drawing/2016/ink" xmlns:am3d="http://schemas.microsoft.com/office/drawing/2017/model3d" xmlns:o="urn:schemas-microsoft-com:office:office" xmlns:oel="http://schemas.microsoft.com/office/2019/extlst" xmlns:r="http://schemas.openxmlformats.org/officeDocument/2006/relationships" xmlns:m="http://schemas.openxmlformats.org/officeDocument/2006/math" xmlns:v="urn:schemas-microsoft-com:vml" xmlns:wp14="http://schemas.microsoft.com/office/word/2010/wordprocessingDrawing" xmlns:wp="http://schemas.openxmlformats.org/drawingml/2006/wordprocessingDrawing" xmlns:w10="urn:schemas-microsoft-com:office:word" xmlns:w="http://schemas.openxmlformats.org/wordprocessingml/2006/main" xmlns:w14="http://schemas.microsoft.com/office/word/2010/wordml" xmlns:w15="http://schemas.microsoft.com/office/word/2012/wordml" xmlns:w16cex="http://schemas.microsoft.com/office/word/2018/wordml/cex" xmlns:w16cid="http://schemas.microsoft.com/office/word/2016/wordml/cid" xmlns:w16="http://schemas.microsoft.com/office/word/2018/wordml" xmlns:w16du="http://schemas.microsoft.com/office/word/2023/wordml/word16du" xmlns:w16sdtdh="http://schemas.microsoft.com/office/word/2020/wordml/sdtdatahash" xmlns:w16se="http://schemas.microsoft.com/office/word/2015/wordml/symex" xmlns:wpg="http://schemas.microsoft.com/office/word/2010/wordprocessingGroup" xmlns:wpi="http://schemas.microsoft.com/office/word/2010/wordprocessingInk" xmlns:wne="http://schemas.microsoft.com/office/word/2006/wordml" xmlns:wps="http://schemas.microsoft.com/office/word/2010/wordprocessingShape" mc:Ignorable="w14 w15 w16se w16cid w16 w16cex w16sdtdh w16du wp14">
+<w:endnotes xmlns:wpc="http://schemas.microsoft.com/office/word/2010/wordprocessingCanvas" xmlns:cx="http://schemas.microsoft.com/office/drawing/2014/chartex" xmlns:cx1="http://schemas.microsoft.com/office/drawing/2015/9/8/chartex" xmlns:cx2="http://schemas.microsoft.com/office/drawing/2015/10/21/chartex" xmlns:cx3="http://schemas.microsoft.com/office/drawing/2016/5/9/chartex" xmlns:cx4="http://schemas.microsoft.com/office/drawing/2016/5/10/chartex" xmlns:cx5="http://schemas.microsoft.com/office/drawing/2016/5/11/chartex" xmlns:cx6="http://schemas.microsoft.com/office/drawing/2016/5/12/chartex" xmlns:cx7="http://schemas.microsoft.com/office/drawing/2016/5/13/chartex" xmlns:cx8="http://schemas.microsoft.com/office/drawing/2016/5/14/chartex" xmlns:mc="http://schemas.openxmlformats.org/markup-compatibility/2006" xmlns:aink="http://schemas.microsoft.com/office/drawing/2016/ink" xmlns:am3d="http://schemas.microsoft.com/office/drawing/2017/model3d" xmlns:o="urn:schemas-microsoft-com:office:office" xmlns:oel="http://schemas.microsoft.com/office/2019/extlst" xmlns:r="http://schemas.openxmlformats.org/officeDocument/2006/relationships" xmlns:m="http://schemas.openxmlformats.org/officeDocument/2006/math" xmlns:v="urn:schemas-microsoft-com:vml" xmlns:wp14="http://schemas.microsoft.com/office/word/2010/wordprocessingDrawing" xmlns:wp="http://schemas.openxmlformats.org/drawingml/2006/wordprocessingDrawing" xmlns:w10="urn:schemas-microsoft-com:office:word" xmlns:w="http://schemas.openxmlformats.org/wordprocessingml/2006/main" xmlns:w14="http://schemas.microsoft.com/office/word/2010/wordml" xmlns:w15="http://schemas.microsoft.com/office/word/2012/wordml" xmlns:w16cex="http://schemas.microsoft.com/office/word/2018/wordml/cex" xmlns:w16cid="http://schemas.microsoft.com/office/word/2016/wordml/cid" xmlns:w16="http://schemas.microsoft.com/office/word/2018/wordml" xmlns:w16du="http://schemas.microsoft.com/office/word/2023/wordml/word16du" xmlns:w16sdtdh="http://schemas.microsoft.com/office/word/2020/wordml/sdtdatahash" xmlns:w16sdtfl="http://schemas.microsoft.com/office/word/2024/wordml/sdtformatlock" xmlns:w16se="http://schemas.microsoft.com/office/word/2015/wordml/symex" xmlns:wpg="http://schemas.microsoft.com/office/word/2010/wordprocessingGroup" xmlns:wpi="http://schemas.microsoft.com/office/word/2010/wordprocessingInk" xmlns:wne="http://schemas.microsoft.com/office/word/2006/wordml" xmlns:wps="http://schemas.microsoft.com/office/word/2010/wordprocessingShape" mc:Ignorable="w14 w15 w16se w16cid w16 w16cex w16sdtdh w16sdtfl w16du wp14">
   <w:endnote w:type="separator" w:id="-1">
     <w:p>
       <w:r>
@@ -8016,7 +10351,7 @@
 </file>
 
 <file path=word/footer1.xml><?xml version="1.0" encoding="utf-8"?>
-<w:ftr xmlns:wpc="http://schemas.microsoft.com/office/word/2010/wordprocessingCanvas" xmlns:cx="http://schemas.microsoft.com/office/drawing/2014/chartex" xmlns:cx1="http://schemas.microsoft.com/office/drawing/2015/9/8/chartex" xmlns:cx2="http://schemas.microsoft.com/office/drawing/2015/10/21/chartex" xmlns:cx3="http://schemas.microsoft.com/office/drawing/2016/5/9/chartex" xmlns:cx4="http://schemas.microsoft.com/office/drawing/2016/5/10/chartex" xmlns:cx5="http://schemas.microsoft.com/office/drawing/2016/5/11/chartex" xmlns:cx6="http://schemas.microsoft.com/office/drawing/2016/5/12/chartex" xmlns:cx7="http://schemas.microsoft.com/office/drawing/2016/5/13/chartex" xmlns:cx8="http://schemas.microsoft.com/office/drawing/2016/5/14/chartex" xmlns:mc="http://schemas.openxmlformats.org/markup-compatibility/2006" xmlns:aink="http://schemas.microsoft.com/office/drawing/2016/ink" xmlns:am3d="http://schemas.microsoft.com/office/drawing/2017/model3d" xmlns:o="urn:schemas-microsoft-com:office:office" xmlns:oel="http://schemas.microsoft.com/office/2019/extlst" xmlns:r="http://schemas.openxmlformats.org/officeDocument/2006/relationships" xmlns:m="http://schemas.openxmlformats.org/officeDocument/2006/math" xmlns:v="urn:schemas-microsoft-com:vml" xmlns:wp14="http://schemas.microsoft.com/office/word/2010/wordprocessingDrawing" xmlns:wp="http://schemas.openxmlformats.org/drawingml/2006/wordprocessingDrawing" xmlns:w10="urn:schemas-microsoft-com:office:word" xmlns:w="http://schemas.openxmlformats.org/wordprocessingml/2006/main" xmlns:w14="http://schemas.microsoft.com/office/word/2010/wordml" xmlns:w15="http://schemas.microsoft.com/office/word/2012/wordml" xmlns:w16cex="http://schemas.microsoft.com/office/word/2018/wordml/cex" xmlns:w16cid="http://schemas.microsoft.com/office/word/2016/wordml/cid" xmlns:w16="http://schemas.microsoft.com/office/word/2018/wordml" xmlns:w16du="http://schemas.microsoft.com/office/word/2023/wordml/word16du" xmlns:w16sdtdh="http://schemas.microsoft.com/office/word/2020/wordml/sdtdatahash" xmlns:w16se="http://schemas.microsoft.com/office/word/2015/wordml/symex" xmlns:wpg="http://schemas.microsoft.com/office/word/2010/wordprocessingGroup" xmlns:wpi="http://schemas.microsoft.com/office/word/2010/wordprocessingInk" xmlns:wne="http://schemas.microsoft.com/office/word/2006/wordml" xmlns:wps="http://schemas.microsoft.com/office/word/2010/wordprocessingShape" mc:Ignorable="w14 w15 w16se w16cid w16 w16cex w16sdtdh w16du wp14">
+<w:ftr xmlns:wpc="http://schemas.microsoft.com/office/word/2010/wordprocessingCanvas" xmlns:cx="http://schemas.microsoft.com/office/drawing/2014/chartex" xmlns:cx1="http://schemas.microsoft.com/office/drawing/2015/9/8/chartex" xmlns:cx2="http://schemas.microsoft.com/office/drawing/2015/10/21/chartex" xmlns:cx3="http://schemas.microsoft.com/office/drawing/2016/5/9/chartex" xmlns:cx4="http://schemas.microsoft.com/office/drawing/2016/5/10/chartex" xmlns:cx5="http://schemas.microsoft.com/office/drawing/2016/5/11/chartex" xmlns:cx6="http://schemas.microsoft.com/office/drawing/2016/5/12/chartex" xmlns:cx7="http://schemas.microsoft.com/office/drawing/2016/5/13/chartex" xmlns:cx8="http://schemas.microsoft.com/office/drawing/2016/5/14/chartex" xmlns:mc="http://schemas.openxmlformats.org/markup-compatibility/2006" xmlns:aink="http://schemas.microsoft.com/office/drawing/2016/ink" xmlns:am3d="http://schemas.microsoft.com/office/drawing/2017/model3d" xmlns:o="urn:schemas-microsoft-com:office:office" xmlns:oel="http://schemas.microsoft.com/office/2019/extlst" xmlns:r="http://schemas.openxmlformats.org/officeDocument/2006/relationships" xmlns:m="http://schemas.openxmlformats.org/officeDocument/2006/math" xmlns:v="urn:schemas-microsoft-com:vml" xmlns:wp14="http://schemas.microsoft.com/office/word/2010/wordprocessingDrawing" xmlns:wp="http://schemas.openxmlformats.org/drawingml/2006/wordprocessingDrawing" xmlns:w10="urn:schemas-microsoft-com:office:word" xmlns:w="http://schemas.openxmlformats.org/wordprocessingml/2006/main" xmlns:w14="http://schemas.microsoft.com/office/word/2010/wordml" xmlns:w15="http://schemas.microsoft.com/office/word/2012/wordml" xmlns:w16cex="http://schemas.microsoft.com/office/word/2018/wordml/cex" xmlns:w16cid="http://schemas.microsoft.com/office/word/2016/wordml/cid" xmlns:w16="http://schemas.microsoft.com/office/word/2018/wordml" xmlns:w16du="http://schemas.microsoft.com/office/word/2023/wordml/word16du" xmlns:w16sdtdh="http://schemas.microsoft.com/office/word/2020/wordml/sdtdatahash" xmlns:w16sdtfl="http://schemas.microsoft.com/office/word/2024/wordml/sdtformatlock" xmlns:w16se="http://schemas.microsoft.com/office/word/2015/wordml/symex" xmlns:wpg="http://schemas.microsoft.com/office/word/2010/wordprocessingGroup" xmlns:wpi="http://schemas.microsoft.com/office/word/2010/wordprocessingInk" xmlns:wne="http://schemas.microsoft.com/office/word/2006/wordml" xmlns:wps="http://schemas.microsoft.com/office/word/2010/wordprocessingShape" mc:Ignorable="w14 w15 w16se w16cid w16 w16cex w16sdtdh w16sdtfl w16du wp14">
   <w:p>
     <w:pPr>
       <w:pStyle w:val="Footer"/>
@@ -8026,7 +10361,7 @@
 </file>
 
 <file path=word/footer2.xml><?xml version="1.0" encoding="utf-8"?>
-<w:ftr xmlns:wpc="http://schemas.microsoft.com/office/word/2010/wordprocessingCanvas" xmlns:cx="http://schemas.microsoft.com/office/drawing/2014/chartex" xmlns:cx1="http://schemas.microsoft.com/office/drawing/2015/9/8/chartex" xmlns:cx2="http://schemas.microsoft.com/office/drawing/2015/10/21/chartex" xmlns:cx3="http://schemas.microsoft.com/office/drawing/2016/5/9/chartex" xmlns:cx4="http://schemas.microsoft.com/office/drawing/2016/5/10/chartex" xmlns:cx5="http://schemas.microsoft.com/office/drawing/2016/5/11/chartex" xmlns:cx6="http://schemas.microsoft.com/office/drawing/2016/5/12/chartex" xmlns:cx7="http://schemas.microsoft.com/office/drawing/2016/5/13/chartex" xmlns:cx8="http://schemas.microsoft.com/office/drawing/2016/5/14/chartex" xmlns:mc="http://schemas.openxmlformats.org/markup-compatibility/2006" xmlns:aink="http://schemas.microsoft.com/office/drawing/2016/ink" xmlns:am3d="http://schemas.microsoft.com/office/drawing/2017/model3d" xmlns:o="urn:schemas-microsoft-com:office:office" xmlns:oel="http://schemas.microsoft.com/office/2019/extlst" xmlns:r="http://schemas.openxmlformats.org/officeDocument/2006/relationships" xmlns:m="http://schemas.openxmlformats.org/officeDocument/2006/math" xmlns:v="urn:schemas-microsoft-com:vml" xmlns:wp14="http://schemas.microsoft.com/office/word/2010/wordprocessingDrawing" xmlns:wp="http://schemas.openxmlformats.org/drawingml/2006/wordprocessingDrawing" xmlns:w10="urn:schemas-microsoft-com:office:word" xmlns:w="http://schemas.openxmlformats.org/wordprocessingml/2006/main" xmlns:w14="http://schemas.microsoft.com/office/word/2010/wordml" xmlns:w15="http://schemas.microsoft.com/office/word/2012/wordml" xmlns:w16cex="http://schemas.microsoft.com/office/word/2018/wordml/cex" xmlns:w16cid="http://schemas.microsoft.com/office/word/2016/wordml/cid" xmlns:w16="http://schemas.microsoft.com/office/word/2018/wordml" xmlns:w16du="http://schemas.microsoft.com/office/word/2023/wordml/word16du" xmlns:w16sdtdh="http://schemas.microsoft.com/office/word/2020/wordml/sdtdatahash" xmlns:w16se="http://schemas.microsoft.com/office/word/2015/wordml/symex" xmlns:wpg="http://schemas.microsoft.com/office/word/2010/wordprocessingGroup" xmlns:wpi="http://schemas.microsoft.com/office/word/2010/wordprocessingInk" xmlns:wne="http://schemas.microsoft.com/office/word/2006/wordml" xmlns:wps="http://schemas.microsoft.com/office/word/2010/wordprocessingShape" mc:Ignorable="w14 w15 w16se w16cid w16 w16cex w16sdtdh w16du wp14">
+<w:ftr xmlns:wpc="http://schemas.microsoft.com/office/word/2010/wordprocessingCanvas" xmlns:cx="http://schemas.microsoft.com/office/drawing/2014/chartex" xmlns:cx1="http://schemas.microsoft.com/office/drawing/2015/9/8/chartex" xmlns:cx2="http://schemas.microsoft.com/office/drawing/2015/10/21/chartex" xmlns:cx3="http://schemas.microsoft.com/office/drawing/2016/5/9/chartex" xmlns:cx4="http://schemas.microsoft.com/office/drawing/2016/5/10/chartex" xmlns:cx5="http://schemas.microsoft.com/office/drawing/2016/5/11/chartex" xmlns:cx6="http://schemas.microsoft.com/office/drawing/2016/5/12/chartex" xmlns:cx7="http://schemas.microsoft.com/office/drawing/2016/5/13/chartex" xmlns:cx8="http://schemas.microsoft.com/office/drawing/2016/5/14/chartex" xmlns:mc="http://schemas.openxmlformats.org/markup-compatibility/2006" xmlns:aink="http://schemas.microsoft.com/office/drawing/2016/ink" xmlns:am3d="http://schemas.microsoft.com/office/drawing/2017/model3d" xmlns:o="urn:schemas-microsoft-com:office:office" xmlns:oel="http://schemas.microsoft.com/office/2019/extlst" xmlns:r="http://schemas.openxmlformats.org/officeDocument/2006/relationships" xmlns:m="http://schemas.openxmlformats.org/officeDocument/2006/math" xmlns:v="urn:schemas-microsoft-com:vml" xmlns:wp14="http://schemas.microsoft.com/office/word/2010/wordprocessingDrawing" xmlns:wp="http://schemas.openxmlformats.org/drawingml/2006/wordprocessingDrawing" xmlns:w10="urn:schemas-microsoft-com:office:word" xmlns:w="http://schemas.openxmlformats.org/wordprocessingml/2006/main" xmlns:w14="http://schemas.microsoft.com/office/word/2010/wordml" xmlns:w15="http://schemas.microsoft.com/office/word/2012/wordml" xmlns:w16cex="http://schemas.microsoft.com/office/word/2018/wordml/cex" xmlns:w16cid="http://schemas.microsoft.com/office/word/2016/wordml/cid" xmlns:w16="http://schemas.microsoft.com/office/word/2018/wordml" xmlns:w16du="http://schemas.microsoft.com/office/word/2023/wordml/word16du" xmlns:w16sdtdh="http://schemas.microsoft.com/office/word/2020/wordml/sdtdatahash" xmlns:w16sdtfl="http://schemas.microsoft.com/office/word/2024/wordml/sdtformatlock" xmlns:w16se="http://schemas.microsoft.com/office/word/2015/wordml/symex" xmlns:wpg="http://schemas.microsoft.com/office/word/2010/wordprocessingGroup" xmlns:wpi="http://schemas.microsoft.com/office/word/2010/wordprocessingInk" xmlns:wne="http://schemas.microsoft.com/office/word/2006/wordml" xmlns:wps="http://schemas.microsoft.com/office/word/2010/wordprocessingShape" mc:Ignorable="w14 w15 w16se w16cid w16 w16cex w16sdtdh w16sdtfl w16du wp14">
   <w:p>
     <w:pPr>
       <w:pStyle w:val="BodyText"/>
@@ -8036,71 +10371,191 @@
       <w:rPr>
         <w:noProof/>
       </w:rPr>
-      <w:pict w14:anchorId="1E5EDFED">
-        <v:rect id="Textbox 1" o:spid="_x0000_s1029" style="position:absolute;margin-left:13.25pt;margin-top:760.15pt;width:168.95pt;height:13.15pt;z-index:-251660800;visibility:visible;mso-wrap-style:square;mso-wrap-distance-left:0;mso-wrap-distance-top:0;mso-wrap-distance-right:0;mso-wrap-distance-bottom:0;mso-position-horizontal:absolute;mso-position-horizontal-relative:page;mso-position-vertical:absolute;mso-position-vertical-relative:page;v-text-anchor:top" o:gfxdata="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" o:allowincell="f" filled="f" stroked="f" strokeweight="0">
-          <v:textbox inset="0,0,0,0">
-            <w:txbxContent>
-              <w:p>
-                <w:pPr>
-                  <w:pStyle w:val="BodyText"/>
-                  <w:spacing w:before="12"/>
-                  <w:ind w:left="20"/>
-                </w:pPr>
-                <w:r>
-                  <w:t>(BMC,</w:t>
-                </w:r>
-                <w:r>
-                  <w:rPr>
-                    <w:spacing w:val="-5"/>
-                  </w:rPr>
-                  <w:t xml:space="preserve"> </w:t>
-                </w:r>
-                <w:r>
-                  <w:t>DC,</w:t>
-                </w:r>
-                <w:r>
-                  <w:rPr>
-                    <w:spacing w:val="-6"/>
-                  </w:rPr>
-                  <w:t xml:space="preserve"> </w:t>
-                </w:r>
-                <w:r>
-                  <w:t>HC)</w:t>
-                </w:r>
-                <w:r>
-                  <w:rPr>
-                    <w:spacing w:val="-5"/>
-                  </w:rPr>
-                  <w:t xml:space="preserve"> </w:t>
-                </w:r>
-                <w:r>
-                  <w:t>-SP-TC0106</w:t>
-                </w:r>
-                <w:r>
-                  <w:rPr>
-                    <w:spacing w:val="-6"/>
-                  </w:rPr>
-                  <w:t xml:space="preserve"> </w:t>
-                </w:r>
-                <w:r>
-                  <w:rPr>
-                    <w:spacing w:val="-2"/>
-                  </w:rPr>
-                  <w:t>(4/2025)</w:t>
-                </w:r>
-              </w:p>
-            </w:txbxContent>
-          </v:textbox>
-          <w10:wrap anchorx="page" anchory="page"/>
-        </v:rect>
-      </w:pict>
+      <mc:AlternateContent>
+        <mc:Choice Requires="wps">
+          <w:drawing>
+            <wp:anchor distT="0" distB="0" distL="0" distR="0" simplePos="0" relativeHeight="251655680" behindDoc="1" locked="0" layoutInCell="0" allowOverlap="1" wp14:anchorId="1E5EDFED" wp14:editId="382820F6">
+              <wp:simplePos x="0" y="0"/>
+              <wp:positionH relativeFrom="page">
+                <wp:posOffset>168275</wp:posOffset>
+              </wp:positionH>
+              <wp:positionV relativeFrom="page">
+                <wp:posOffset>9653905</wp:posOffset>
+              </wp:positionV>
+              <wp:extent cx="2145665" cy="167005"/>
+              <wp:effectExtent l="0" t="0" r="0" b="0"/>
+              <wp:wrapNone/>
+              <wp:docPr id="1989741726" name="Rectangle 7"/>
+              <wp:cNvGraphicFramePr>
+                <a:graphicFrameLocks xmlns:a="http://schemas.openxmlformats.org/drawingml/2006/main"/>
+              </wp:cNvGraphicFramePr>
+              <a:graphic xmlns:a="http://schemas.openxmlformats.org/drawingml/2006/main">
+                <a:graphicData uri="http://schemas.microsoft.com/office/word/2010/wordprocessingShape">
+                  <wps:wsp>
+                    <wps:cNvSpPr>
+                      <a:spLocks/>
+                    </wps:cNvSpPr>
+                    <wps:spPr>
+                      <a:xfrm>
+                        <a:off x="0" y="0"/>
+                        <a:ext cx="2145665" cy="167005"/>
+                      </a:xfrm>
+                      <a:prstGeom prst="rect">
+                        <a:avLst/>
+                      </a:prstGeom>
+                      <a:noFill/>
+                      <a:ln w="0">
+                        <a:noFill/>
+                      </a:ln>
+                    </wps:spPr>
+                    <wps:style>
+                      <a:lnRef idx="0">
+                        <a:scrgbClr r="0" g="0" b="0"/>
+                      </a:lnRef>
+                      <a:fillRef idx="0">
+                        <a:scrgbClr r="0" g="0" b="0"/>
+                      </a:fillRef>
+                      <a:effectRef idx="0">
+                        <a:scrgbClr r="0" g="0" b="0"/>
+                      </a:effectRef>
+                      <a:fontRef idx="minor"/>
+                    </wps:style>
+                    <wps:txbx>
+                      <w:txbxContent>
+                        <w:p>
+                          <w:pPr>
+                            <w:pStyle w:val="BodyText"/>
+                            <w:spacing w:before="12"/>
+                            <w:ind w:left="20"/>
+                          </w:pPr>
+                          <w:r>
+                            <w:t>(BMC,</w:t>
+                          </w:r>
+                          <w:r>
+                            <w:rPr>
+                              <w:spacing w:val="-5"/>
+                            </w:rPr>
+                            <w:t xml:space="preserve"> </w:t>
+                          </w:r>
+                          <w:r>
+                            <w:t>DC,</w:t>
+                          </w:r>
+                          <w:r>
+                            <w:rPr>
+                              <w:spacing w:val="-6"/>
+                            </w:rPr>
+                            <w:t xml:space="preserve"> </w:t>
+                          </w:r>
+                          <w:r>
+                            <w:t>HC)</w:t>
+                          </w:r>
+                          <w:r>
+                            <w:rPr>
+                              <w:spacing w:val="-5"/>
+                            </w:rPr>
+                            <w:t xml:space="preserve"> </w:t>
+                          </w:r>
+                          <w:r>
+                            <w:t>-SP-TC0106</w:t>
+                          </w:r>
+                          <w:r>
+                            <w:rPr>
+                              <w:spacing w:val="-6"/>
+                            </w:rPr>
+                            <w:t xml:space="preserve"> </w:t>
+                          </w:r>
+                          <w:r>
+                            <w:rPr>
+                              <w:spacing w:val="-2"/>
+                            </w:rPr>
+                            <w:t>(4/2025)</w:t>
+                          </w:r>
+                        </w:p>
+                      </w:txbxContent>
+                    </wps:txbx>
+                    <wps:bodyPr lIns="0" tIns="0" rIns="0" bIns="0" anchor="t">
+                      <a:noAutofit/>
+                    </wps:bodyPr>
+                  </wps:wsp>
+                </a:graphicData>
+              </a:graphic>
+              <wp14:sizeRelH relativeFrom="page">
+                <wp14:pctWidth>0</wp14:pctWidth>
+              </wp14:sizeRelH>
+              <wp14:sizeRelV relativeFrom="page">
+                <wp14:pctHeight>0</wp14:pctHeight>
+              </wp14:sizeRelV>
+            </wp:anchor>
+          </w:drawing>
+        </mc:Choice>
+        <mc:Fallback>
+          <w:pict>
+            <v:rect w14:anchorId="1E5EDFED" id="Rectangle 7" o:spid="_x0000_s1026" style="position:absolute;margin-left:13.25pt;margin-top:760.15pt;width:168.95pt;height:13.15pt;z-index:-251660800;visibility:visible;mso-wrap-style:square;mso-width-percent:0;mso-height-percent:0;mso-wrap-distance-left:0;mso-wrap-distance-top:0;mso-wrap-distance-right:0;mso-wrap-distance-bottom:0;mso-position-horizontal:absolute;mso-position-horizontal-relative:page;mso-position-vertical:absolute;mso-position-vertical-relative:page;mso-width-percent:0;mso-height-percent:0;mso-width-relative:page;mso-height-relative:page;v-text-anchor:top" o:gfxdata="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" o:allowincell="f" filled="f" stroked="f" strokeweight="0">
+              <v:textbox inset="0,0,0,0">
+                <w:txbxContent>
+                  <w:p>
+                    <w:pPr>
+                      <w:pStyle w:val="BodyText"/>
+                      <w:spacing w:before="12"/>
+                      <w:ind w:left="20"/>
+                    </w:pPr>
+                    <w:r>
+                      <w:t>(BMC,</w:t>
+                    </w:r>
+                    <w:r>
+                      <w:rPr>
+                        <w:spacing w:val="-5"/>
+                      </w:rPr>
+                      <w:t xml:space="preserve"> </w:t>
+                    </w:r>
+                    <w:r>
+                      <w:t>DC,</w:t>
+                    </w:r>
+                    <w:r>
+                      <w:rPr>
+                        <w:spacing w:val="-6"/>
+                      </w:rPr>
+                      <w:t xml:space="preserve"> </w:t>
+                    </w:r>
+                    <w:r>
+                      <w:t>HC)</w:t>
+                    </w:r>
+                    <w:r>
+                      <w:rPr>
+                        <w:spacing w:val="-5"/>
+                      </w:rPr>
+                      <w:t xml:space="preserve"> </w:t>
+                    </w:r>
+                    <w:r>
+                      <w:t>-SP-TC0106</w:t>
+                    </w:r>
+                    <w:r>
+                      <w:rPr>
+                        <w:spacing w:val="-6"/>
+                      </w:rPr>
+                      <w:t xml:space="preserve"> </w:t>
+                    </w:r>
+                    <w:r>
+                      <w:rPr>
+                        <w:spacing w:val="-2"/>
+                      </w:rPr>
+                      <w:t>(4/2025)</w:t>
+                    </w:r>
+                  </w:p>
+                </w:txbxContent>
+              </v:textbox>
+              <w10:wrap anchorx="page" anchory="page"/>
+            </v:rect>
+          </w:pict>
+        </mc:Fallback>
+      </mc:AlternateContent>
     </w:r>
   </w:p>
 </w:ftr>
 </file>
 
 <file path=word/footer3.xml><?xml version="1.0" encoding="utf-8"?>
-<w:ftr xmlns:wpc="http://schemas.microsoft.com/office/word/2010/wordprocessingCanvas" xmlns:cx="http://schemas.microsoft.com/office/drawing/2014/chartex" xmlns:cx1="http://schemas.microsoft.com/office/drawing/2015/9/8/chartex" xmlns:cx2="http://schemas.microsoft.com/office/drawing/2015/10/21/chartex" xmlns:cx3="http://schemas.microsoft.com/office/drawing/2016/5/9/chartex" xmlns:cx4="http://schemas.microsoft.com/office/drawing/2016/5/10/chartex" xmlns:cx5="http://schemas.microsoft.com/office/drawing/2016/5/11/chartex" xmlns:cx6="http://schemas.microsoft.com/office/drawing/2016/5/12/chartex" xmlns:cx7="http://schemas.microsoft.com/office/drawing/2016/5/13/chartex" xmlns:cx8="http://schemas.microsoft.com/office/drawing/2016/5/14/chartex" xmlns:mc="http://schemas.openxmlformats.org/markup-compatibility/2006" xmlns:aink="http://schemas.microsoft.com/office/drawing/2016/ink" xmlns:am3d="http://schemas.microsoft.com/office/drawing/2017/model3d" xmlns:o="urn:schemas-microsoft-com:office:office" xmlns:oel="http://schemas.microsoft.com/office/2019/extlst" xmlns:r="http://schemas.openxmlformats.org/officeDocument/2006/relationships" xmlns:m="http://schemas.openxmlformats.org/officeDocument/2006/math" xmlns:v="urn:schemas-microsoft-com:vml" xmlns:wp14="http://schemas.microsoft.com/office/word/2010/wordprocessingDrawing" xmlns:wp="http://schemas.openxmlformats.org/drawingml/2006/wordprocessingDrawing" xmlns:w10="urn:schemas-microsoft-com:office:word" xmlns:w="http://schemas.openxmlformats.org/wordprocessingml/2006/main" xmlns:w14="http://schemas.microsoft.com/office/word/2010/wordml" xmlns:w15="http://schemas.microsoft.com/office/word/2012/wordml" xmlns:w16cex="http://schemas.microsoft.com/office/word/2018/wordml/cex" xmlns:w16cid="http://schemas.microsoft.com/office/word/2016/wordml/cid" xmlns:w16="http://schemas.microsoft.com/office/word/2018/wordml" xmlns:w16du="http://schemas.microsoft.com/office/word/2023/wordml/word16du" xmlns:w16sdtdh="http://schemas.microsoft.com/office/word/2020/wordml/sdtdatahash" xmlns:w16se="http://schemas.microsoft.com/office/word/2015/wordml/symex" xmlns:wpg="http://schemas.microsoft.com/office/word/2010/wordprocessingGroup" xmlns:wpi="http://schemas.microsoft.com/office/word/2010/wordprocessingInk" xmlns:wne="http://schemas.microsoft.com/office/word/2006/wordml" xmlns:wps="http://schemas.microsoft.com/office/word/2010/wordprocessingShape" mc:Ignorable="w14 w15 w16se w16cid w16 w16cex w16sdtdh w16du wp14">
+<w:ftr xmlns:wpc="http://schemas.microsoft.com/office/word/2010/wordprocessingCanvas" xmlns:cx="http://schemas.microsoft.com/office/drawing/2014/chartex" xmlns:cx1="http://schemas.microsoft.com/office/drawing/2015/9/8/chartex" xmlns:cx2="http://schemas.microsoft.com/office/drawing/2015/10/21/chartex" xmlns:cx3="http://schemas.microsoft.com/office/drawing/2016/5/9/chartex" xmlns:cx4="http://schemas.microsoft.com/office/drawing/2016/5/10/chartex" xmlns:cx5="http://schemas.microsoft.com/office/drawing/2016/5/11/chartex" xmlns:cx6="http://schemas.microsoft.com/office/drawing/2016/5/12/chartex" xmlns:cx7="http://schemas.microsoft.com/office/drawing/2016/5/13/chartex" xmlns:cx8="http://schemas.microsoft.com/office/drawing/2016/5/14/chartex" xmlns:mc="http://schemas.openxmlformats.org/markup-compatibility/2006" xmlns:aink="http://schemas.microsoft.com/office/drawing/2016/ink" xmlns:am3d="http://schemas.microsoft.com/office/drawing/2017/model3d" xmlns:o="urn:schemas-microsoft-com:office:office" xmlns:oel="http://schemas.microsoft.com/office/2019/extlst" xmlns:r="http://schemas.openxmlformats.org/officeDocument/2006/relationships" xmlns:m="http://schemas.openxmlformats.org/officeDocument/2006/math" xmlns:v="urn:schemas-microsoft-com:vml" xmlns:wp14="http://schemas.microsoft.com/office/word/2010/wordprocessingDrawing" xmlns:wp="http://schemas.openxmlformats.org/drawingml/2006/wordprocessingDrawing" xmlns:w10="urn:schemas-microsoft-com:office:word" xmlns:w="http://schemas.openxmlformats.org/wordprocessingml/2006/main" xmlns:w14="http://schemas.microsoft.com/office/word/2010/wordml" xmlns:w15="http://schemas.microsoft.com/office/word/2012/wordml" xmlns:w16cex="http://schemas.microsoft.com/office/word/2018/wordml/cex" xmlns:w16cid="http://schemas.microsoft.com/office/word/2016/wordml/cid" xmlns:w16="http://schemas.microsoft.com/office/word/2018/wordml" xmlns:w16du="http://schemas.microsoft.com/office/word/2023/wordml/word16du" xmlns:w16sdtdh="http://schemas.microsoft.com/office/word/2020/wordml/sdtdatahash" xmlns:w16sdtfl="http://schemas.microsoft.com/office/word/2024/wordml/sdtformatlock" xmlns:w16se="http://schemas.microsoft.com/office/word/2015/wordml/symex" xmlns:wpg="http://schemas.microsoft.com/office/word/2010/wordprocessingGroup" xmlns:wpi="http://schemas.microsoft.com/office/word/2010/wordprocessingInk" xmlns:wne="http://schemas.microsoft.com/office/word/2006/wordml" xmlns:wps="http://schemas.microsoft.com/office/word/2010/wordprocessingShape" mc:Ignorable="w14 w15 w16se w16cid w16 w16cex w16sdtdh w16sdtfl w16du wp14">
   <w:p>
     <w:pPr>
       <w:pStyle w:val="BodyText"/>
@@ -8110,71 +10565,191 @@
       <w:rPr>
         <w:noProof/>
       </w:rPr>
-      <w:pict w14:anchorId="1FB6E7C5">
-        <v:rect id="_x0000_s1028" style="position:absolute;margin-left:13.25pt;margin-top:760.15pt;width:168.95pt;height:13.15pt;z-index:-251659776;visibility:visible;mso-wrap-style:square;mso-wrap-distance-left:0;mso-wrap-distance-top:0;mso-wrap-distance-right:0;mso-wrap-distance-bottom:0;mso-position-horizontal:absolute;mso-position-horizontal-relative:page;mso-position-vertical:absolute;mso-position-vertical-relative:page;v-text-anchor:top" o:gfxdata="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" o:allowincell="f" filled="f" stroked="f" strokeweight="0">
-          <v:textbox inset="0,0,0,0">
-            <w:txbxContent>
-              <w:p>
-                <w:pPr>
-                  <w:pStyle w:val="BodyText"/>
-                  <w:spacing w:before="12"/>
-                  <w:ind w:left="20"/>
-                </w:pPr>
-                <w:r>
-                  <w:t>(BMC,</w:t>
-                </w:r>
-                <w:r>
-                  <w:rPr>
-                    <w:spacing w:val="-5"/>
-                  </w:rPr>
-                  <w:t xml:space="preserve"> </w:t>
-                </w:r>
-                <w:r>
-                  <w:t>DC,</w:t>
-                </w:r>
-                <w:r>
-                  <w:rPr>
-                    <w:spacing w:val="-6"/>
-                  </w:rPr>
-                  <w:t xml:space="preserve"> </w:t>
-                </w:r>
-                <w:r>
-                  <w:t>HC)</w:t>
-                </w:r>
-                <w:r>
-                  <w:rPr>
-                    <w:spacing w:val="-5"/>
-                  </w:rPr>
-                  <w:t xml:space="preserve"> </w:t>
-                </w:r>
-                <w:r>
-                  <w:t>-SP-TC0106</w:t>
-                </w:r>
-                <w:r>
-                  <w:rPr>
-                    <w:spacing w:val="-6"/>
-                  </w:rPr>
-                  <w:t xml:space="preserve"> </w:t>
-                </w:r>
-                <w:r>
-                  <w:rPr>
-                    <w:spacing w:val="-2"/>
-                  </w:rPr>
-                  <w:t>(4/2025)</w:t>
-                </w:r>
-              </w:p>
-            </w:txbxContent>
-          </v:textbox>
-          <w10:wrap anchorx="page" anchory="page"/>
-        </v:rect>
-      </w:pict>
+      <mc:AlternateContent>
+        <mc:Choice Requires="wps">
+          <w:drawing>
+            <wp:anchor distT="0" distB="0" distL="0" distR="0" simplePos="0" relativeHeight="251656704" behindDoc="1" locked="0" layoutInCell="0" allowOverlap="1" wp14:anchorId="1FB6E7C5" wp14:editId="1D43F44D">
+              <wp:simplePos x="0" y="0"/>
+              <wp:positionH relativeFrom="page">
+                <wp:posOffset>168275</wp:posOffset>
+              </wp:positionH>
+              <wp:positionV relativeFrom="page">
+                <wp:posOffset>9653905</wp:posOffset>
+              </wp:positionV>
+              <wp:extent cx="2145665" cy="167005"/>
+              <wp:effectExtent l="0" t="0" r="0" b="0"/>
+              <wp:wrapNone/>
+              <wp:docPr id="732006795" name="Rectangle 5"/>
+              <wp:cNvGraphicFramePr>
+                <a:graphicFrameLocks xmlns:a="http://schemas.openxmlformats.org/drawingml/2006/main"/>
+              </wp:cNvGraphicFramePr>
+              <a:graphic xmlns:a="http://schemas.openxmlformats.org/drawingml/2006/main">
+                <a:graphicData uri="http://schemas.microsoft.com/office/word/2010/wordprocessingShape">
+                  <wps:wsp>
+                    <wps:cNvSpPr>
+                      <a:spLocks/>
+                    </wps:cNvSpPr>
+                    <wps:spPr>
+                      <a:xfrm>
+                        <a:off x="0" y="0"/>
+                        <a:ext cx="2145665" cy="167005"/>
+                      </a:xfrm>
+                      <a:prstGeom prst="rect">
+                        <a:avLst/>
+                      </a:prstGeom>
+                      <a:noFill/>
+                      <a:ln w="0">
+                        <a:noFill/>
+                      </a:ln>
+                    </wps:spPr>
+                    <wps:style>
+                      <a:lnRef idx="0">
+                        <a:scrgbClr r="0" g="0" b="0"/>
+                      </a:lnRef>
+                      <a:fillRef idx="0">
+                        <a:scrgbClr r="0" g="0" b="0"/>
+                      </a:fillRef>
+                      <a:effectRef idx="0">
+                        <a:scrgbClr r="0" g="0" b="0"/>
+                      </a:effectRef>
+                      <a:fontRef idx="minor"/>
+                    </wps:style>
+                    <wps:txbx>
+                      <w:txbxContent>
+                        <w:p>
+                          <w:pPr>
+                            <w:pStyle w:val="BodyText"/>
+                            <w:spacing w:before="12"/>
+                            <w:ind w:left="20"/>
+                          </w:pPr>
+                          <w:r>
+                            <w:t>(BMC,</w:t>
+                          </w:r>
+                          <w:r>
+                            <w:rPr>
+                              <w:spacing w:val="-5"/>
+                            </w:rPr>
+                            <w:t xml:space="preserve"> </w:t>
+                          </w:r>
+                          <w:r>
+                            <w:t>DC,</w:t>
+                          </w:r>
+                          <w:r>
+                            <w:rPr>
+                              <w:spacing w:val="-6"/>
+                            </w:rPr>
+                            <w:t xml:space="preserve"> </w:t>
+                          </w:r>
+                          <w:r>
+                            <w:t>HC)</w:t>
+                          </w:r>
+                          <w:r>
+                            <w:rPr>
+                              <w:spacing w:val="-5"/>
+                            </w:rPr>
+                            <w:t xml:space="preserve"> </w:t>
+                          </w:r>
+                          <w:r>
+                            <w:t>-SP-TC0106</w:t>
+                          </w:r>
+                          <w:r>
+                            <w:rPr>
+                              <w:spacing w:val="-6"/>
+                            </w:rPr>
+                            <w:t xml:space="preserve"> </w:t>
+                          </w:r>
+                          <w:r>
+                            <w:rPr>
+                              <w:spacing w:val="-2"/>
+                            </w:rPr>
+                            <w:t>(4/2025)</w:t>
+                          </w:r>
+                        </w:p>
+                      </w:txbxContent>
+                    </wps:txbx>
+                    <wps:bodyPr lIns="0" tIns="0" rIns="0" bIns="0" anchor="t">
+                      <a:noAutofit/>
+                    </wps:bodyPr>
+                  </wps:wsp>
+                </a:graphicData>
+              </a:graphic>
+              <wp14:sizeRelH relativeFrom="page">
+                <wp14:pctWidth>0</wp14:pctWidth>
+              </wp14:sizeRelH>
+              <wp14:sizeRelV relativeFrom="page">
+                <wp14:pctHeight>0</wp14:pctHeight>
+              </wp14:sizeRelV>
+            </wp:anchor>
+          </w:drawing>
+        </mc:Choice>
+        <mc:Fallback>
+          <w:pict>
+            <v:rect w14:anchorId="1FB6E7C5" id="Rectangle 5" o:spid="_x0000_s1027" style="position:absolute;margin-left:13.25pt;margin-top:760.15pt;width:168.95pt;height:13.15pt;z-index:-251659776;visibility:visible;mso-wrap-style:square;mso-width-percent:0;mso-height-percent:0;mso-wrap-distance-left:0;mso-wrap-distance-top:0;mso-wrap-distance-right:0;mso-wrap-distance-bottom:0;mso-position-horizontal:absolute;mso-position-horizontal-relative:page;mso-position-vertical:absolute;mso-position-vertical-relative:page;mso-width-percent:0;mso-height-percent:0;mso-width-relative:page;mso-height-relative:page;v-text-anchor:top" o:gfxdata="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" o:allowincell="f" filled="f" stroked="f" strokeweight="0">
+              <v:textbox inset="0,0,0,0">
+                <w:txbxContent>
+                  <w:p>
+                    <w:pPr>
+                      <w:pStyle w:val="BodyText"/>
+                      <w:spacing w:before="12"/>
+                      <w:ind w:left="20"/>
+                    </w:pPr>
+                    <w:r>
+                      <w:t>(BMC,</w:t>
+                    </w:r>
+                    <w:r>
+                      <w:rPr>
+                        <w:spacing w:val="-5"/>
+                      </w:rPr>
+                      <w:t xml:space="preserve"> </w:t>
+                    </w:r>
+                    <w:r>
+                      <w:t>DC,</w:t>
+                    </w:r>
+                    <w:r>
+                      <w:rPr>
+                        <w:spacing w:val="-6"/>
+                      </w:rPr>
+                      <w:t xml:space="preserve"> </w:t>
+                    </w:r>
+                    <w:r>
+                      <w:t>HC)</w:t>
+                    </w:r>
+                    <w:r>
+                      <w:rPr>
+                        <w:spacing w:val="-5"/>
+                      </w:rPr>
+                      <w:t xml:space="preserve"> </w:t>
+                    </w:r>
+                    <w:r>
+                      <w:t>-SP-TC0106</w:t>
+                    </w:r>
+                    <w:r>
+                      <w:rPr>
+                        <w:spacing w:val="-6"/>
+                      </w:rPr>
+                      <w:t xml:space="preserve"> </w:t>
+                    </w:r>
+                    <w:r>
+                      <w:rPr>
+                        <w:spacing w:val="-2"/>
+                      </w:rPr>
+                      <w:t>(4/2025)</w:t>
+                    </w:r>
+                  </w:p>
+                </w:txbxContent>
+              </v:textbox>
+              <w10:wrap anchorx="page" anchory="page"/>
+            </v:rect>
+          </w:pict>
+        </mc:Fallback>
+      </mc:AlternateContent>
     </w:r>
   </w:p>
 </w:ftr>
 </file>
 
 <file path=word/footer4.xml><?xml version="1.0" encoding="utf-8"?>
-<w:ftr xmlns:wpc="http://schemas.microsoft.com/office/word/2010/wordprocessingCanvas" xmlns:cx="http://schemas.microsoft.com/office/drawing/2014/chartex" xmlns:cx1="http://schemas.microsoft.com/office/drawing/2015/9/8/chartex" xmlns:cx2="http://schemas.microsoft.com/office/drawing/2015/10/21/chartex" xmlns:cx3="http://schemas.microsoft.com/office/drawing/2016/5/9/chartex" xmlns:cx4="http://schemas.microsoft.com/office/drawing/2016/5/10/chartex" xmlns:cx5="http://schemas.microsoft.com/office/drawing/2016/5/11/chartex" xmlns:cx6="http://schemas.microsoft.com/office/drawing/2016/5/12/chartex" xmlns:cx7="http://schemas.microsoft.com/office/drawing/2016/5/13/chartex" xmlns:cx8="http://schemas.microsoft.com/office/drawing/2016/5/14/chartex" xmlns:mc="http://schemas.openxmlformats.org/markup-compatibility/2006" xmlns:aink="http://schemas.microsoft.com/office/drawing/2016/ink" xmlns:am3d="http://schemas.microsoft.com/office/drawing/2017/model3d" xmlns:o="urn:schemas-microsoft-com:office:office" xmlns:oel="http://schemas.microsoft.com/office/2019/extlst" xmlns:r="http://schemas.openxmlformats.org/officeDocument/2006/relationships" xmlns:m="http://schemas.openxmlformats.org/officeDocument/2006/math" xmlns:v="urn:schemas-microsoft-com:vml" xmlns:wp14="http://schemas.microsoft.com/office/word/2010/wordprocessingDrawing" xmlns:wp="http://schemas.openxmlformats.org/drawingml/2006/wordprocessingDrawing" xmlns:w10="urn:schemas-microsoft-com:office:word" xmlns:w="http://schemas.openxmlformats.org/wordprocessingml/2006/main" xmlns:w14="http://schemas.microsoft.com/office/word/2010/wordml" xmlns:w15="http://schemas.microsoft.com/office/word/2012/wordml" xmlns:w16cex="http://schemas.microsoft.com/office/word/2018/wordml/cex" xmlns:w16cid="http://schemas.microsoft.com/office/word/2016/wordml/cid" xmlns:w16="http://schemas.microsoft.com/office/word/2018/wordml" xmlns:w16du="http://schemas.microsoft.com/office/word/2023/wordml/word16du" xmlns:w16sdtdh="http://schemas.microsoft.com/office/word/2020/wordml/sdtdatahash" xmlns:w16se="http://schemas.microsoft.com/office/word/2015/wordml/symex" xmlns:wpg="http://schemas.microsoft.com/office/word/2010/wordprocessingGroup" xmlns:wpi="http://schemas.microsoft.com/office/word/2010/wordprocessingInk" xmlns:wne="http://schemas.microsoft.com/office/word/2006/wordml" xmlns:wps="http://schemas.microsoft.com/office/word/2010/wordprocessingShape" mc:Ignorable="w14 w15 w16se w16cid w16 w16cex w16sdtdh w16du wp14">
+<w:ftr xmlns:wpc="http://schemas.microsoft.com/office/word/2010/wordprocessingCanvas" xmlns:cx="http://schemas.microsoft.com/office/drawing/2014/chartex" xmlns:cx1="http://schemas.microsoft.com/office/drawing/2015/9/8/chartex" xmlns:cx2="http://schemas.microsoft.com/office/drawing/2015/10/21/chartex" xmlns:cx3="http://schemas.microsoft.com/office/drawing/2016/5/9/chartex" xmlns:cx4="http://schemas.microsoft.com/office/drawing/2016/5/10/chartex" xmlns:cx5="http://schemas.microsoft.com/office/drawing/2016/5/11/chartex" xmlns:cx6="http://schemas.microsoft.com/office/drawing/2016/5/12/chartex" xmlns:cx7="http://schemas.microsoft.com/office/drawing/2016/5/13/chartex" xmlns:cx8="http://schemas.microsoft.com/office/drawing/2016/5/14/chartex" xmlns:mc="http://schemas.openxmlformats.org/markup-compatibility/2006" xmlns:aink="http://schemas.microsoft.com/office/drawing/2016/ink" xmlns:am3d="http://schemas.microsoft.com/office/drawing/2017/model3d" xmlns:o="urn:schemas-microsoft-com:office:office" xmlns:oel="http://schemas.microsoft.com/office/2019/extlst" xmlns:r="http://schemas.openxmlformats.org/officeDocument/2006/relationships" xmlns:m="http://schemas.openxmlformats.org/officeDocument/2006/math" xmlns:v="urn:schemas-microsoft-com:vml" xmlns:wp14="http://schemas.microsoft.com/office/word/2010/wordprocessingDrawing" xmlns:wp="http://schemas.openxmlformats.org/drawingml/2006/wordprocessingDrawing" xmlns:w10="urn:schemas-microsoft-com:office:word" xmlns:w="http://schemas.openxmlformats.org/wordprocessingml/2006/main" xmlns:w14="http://schemas.microsoft.com/office/word/2010/wordml" xmlns:w15="http://schemas.microsoft.com/office/word/2012/wordml" xmlns:w16cex="http://schemas.microsoft.com/office/word/2018/wordml/cex" xmlns:w16cid="http://schemas.microsoft.com/office/word/2016/wordml/cid" xmlns:w16="http://schemas.microsoft.com/office/word/2018/wordml" xmlns:w16du="http://schemas.microsoft.com/office/word/2023/wordml/word16du" xmlns:w16sdtdh="http://schemas.microsoft.com/office/word/2020/wordml/sdtdatahash" xmlns:w16sdtfl="http://schemas.microsoft.com/office/word/2024/wordml/sdtformatlock" xmlns:w16se="http://schemas.microsoft.com/office/word/2015/wordml/symex" xmlns:wpg="http://schemas.microsoft.com/office/word/2010/wordprocessingGroup" xmlns:wpi="http://schemas.microsoft.com/office/word/2010/wordprocessingInk" xmlns:wne="http://schemas.microsoft.com/office/word/2006/wordml" xmlns:wps="http://schemas.microsoft.com/office/word/2010/wordprocessingShape" mc:Ignorable="w14 w15 w16se w16cid w16 w16cex w16sdtdh w16sdtfl w16du wp14">
   <w:p>
     <w:pPr>
       <w:pStyle w:val="Footer"/>
@@ -8184,7 +10759,7 @@
 </file>
 
 <file path=word/footer5.xml><?xml version="1.0" encoding="utf-8"?>
-<w:ftr xmlns:wpc="http://schemas.microsoft.com/office/word/2010/wordprocessingCanvas" xmlns:cx="http://schemas.microsoft.com/office/drawing/2014/chartex" xmlns:cx1="http://schemas.microsoft.com/office/drawing/2015/9/8/chartex" xmlns:cx2="http://schemas.microsoft.com/office/drawing/2015/10/21/chartex" xmlns:cx3="http://schemas.microsoft.com/office/drawing/2016/5/9/chartex" xmlns:cx4="http://schemas.microsoft.com/office/drawing/2016/5/10/chartex" xmlns:cx5="http://schemas.microsoft.com/office/drawing/2016/5/11/chartex" xmlns:cx6="http://schemas.microsoft.com/office/drawing/2016/5/12/chartex" xmlns:cx7="http://schemas.microsoft.com/office/drawing/2016/5/13/chartex" xmlns:cx8="http://schemas.microsoft.com/office/drawing/2016/5/14/chartex" xmlns:mc="http://schemas.openxmlformats.org/markup-compatibility/2006" xmlns:aink="http://schemas.microsoft.com/office/drawing/2016/ink" xmlns:am3d="http://schemas.microsoft.com/office/drawing/2017/model3d" xmlns:o="urn:schemas-microsoft-com:office:office" xmlns:oel="http://schemas.microsoft.com/office/2019/extlst" xmlns:r="http://schemas.openxmlformats.org/officeDocument/2006/relationships" xmlns:m="http://schemas.openxmlformats.org/officeDocument/2006/math" xmlns:v="urn:schemas-microsoft-com:vml" xmlns:wp14="http://schemas.microsoft.com/office/word/2010/wordprocessingDrawing" xmlns:wp="http://schemas.openxmlformats.org/drawingml/2006/wordprocessingDrawing" xmlns:w10="urn:schemas-microsoft-com:office:word" xmlns:w="http://schemas.openxmlformats.org/wordprocessingml/2006/main" xmlns:w14="http://schemas.microsoft.com/office/word/2010/wordml" xmlns:w15="http://schemas.microsoft.com/office/word/2012/wordml" xmlns:w16cex="http://schemas.microsoft.com/office/word/2018/wordml/cex" xmlns:w16cid="http://schemas.microsoft.com/office/word/2016/wordml/cid" xmlns:w16="http://schemas.microsoft.com/office/word/2018/wordml" xmlns:w16du="http://schemas.microsoft.com/office/word/2023/wordml/word16du" xmlns:w16sdtdh="http://schemas.microsoft.com/office/word/2020/wordml/sdtdatahash" xmlns:w16se="http://schemas.microsoft.com/office/word/2015/wordml/symex" xmlns:wpg="http://schemas.microsoft.com/office/word/2010/wordprocessingGroup" xmlns:wpi="http://schemas.microsoft.com/office/word/2010/wordprocessingInk" xmlns:wne="http://schemas.microsoft.com/office/word/2006/wordml" xmlns:wps="http://schemas.microsoft.com/office/word/2010/wordprocessingShape" mc:Ignorable="w14 w15 w16se w16cid w16 w16cex w16sdtdh w16du wp14">
+<w:ftr xmlns:wpc="http://schemas.microsoft.com/office/word/2010/wordprocessingCanvas" xmlns:cx="http://schemas.microsoft.com/office/drawing/2014/chartex" xmlns:cx1="http://schemas.microsoft.com/office/drawing/2015/9/8/chartex" xmlns:cx2="http://schemas.microsoft.com/office/drawing/2015/10/21/chartex" xmlns:cx3="http://schemas.microsoft.com/office/drawing/2016/5/9/chartex" xmlns:cx4="http://schemas.microsoft.com/office/drawing/2016/5/10/chartex" xmlns:cx5="http://schemas.microsoft.com/office/drawing/2016/5/11/chartex" xmlns:cx6="http://schemas.microsoft.com/office/drawing/2016/5/12/chartex" xmlns:cx7="http://schemas.microsoft.com/office/drawing/2016/5/13/chartex" xmlns:cx8="http://schemas.microsoft.com/office/drawing/2016/5/14/chartex" xmlns:mc="http://schemas.openxmlformats.org/markup-compatibility/2006" xmlns:aink="http://schemas.microsoft.com/office/drawing/2016/ink" xmlns:am3d="http://schemas.microsoft.com/office/drawing/2017/model3d" xmlns:o="urn:schemas-microsoft-com:office:office" xmlns:oel="http://schemas.microsoft.com/office/2019/extlst" xmlns:r="http://schemas.openxmlformats.org/officeDocument/2006/relationships" xmlns:m="http://schemas.openxmlformats.org/officeDocument/2006/math" xmlns:v="urn:schemas-microsoft-com:vml" xmlns:wp14="http://schemas.microsoft.com/office/word/2010/wordprocessingDrawing" xmlns:wp="http://schemas.openxmlformats.org/drawingml/2006/wordprocessingDrawing" xmlns:w10="urn:schemas-microsoft-com:office:word" xmlns:w="http://schemas.openxmlformats.org/wordprocessingml/2006/main" xmlns:w14="http://schemas.microsoft.com/office/word/2010/wordml" xmlns:w15="http://schemas.microsoft.com/office/word/2012/wordml" xmlns:w16cex="http://schemas.microsoft.com/office/word/2018/wordml/cex" xmlns:w16cid="http://schemas.microsoft.com/office/word/2016/wordml/cid" xmlns:w16="http://schemas.microsoft.com/office/word/2018/wordml" xmlns:w16du="http://schemas.microsoft.com/office/word/2023/wordml/word16du" xmlns:w16sdtdh="http://schemas.microsoft.com/office/word/2020/wordml/sdtdatahash" xmlns:w16sdtfl="http://schemas.microsoft.com/office/word/2024/wordml/sdtformatlock" xmlns:w16se="http://schemas.microsoft.com/office/word/2015/wordml/symex" xmlns:wpg="http://schemas.microsoft.com/office/word/2010/wordprocessingGroup" xmlns:wpi="http://schemas.microsoft.com/office/word/2010/wordprocessingInk" xmlns:wne="http://schemas.microsoft.com/office/word/2006/wordml" xmlns:wps="http://schemas.microsoft.com/office/word/2010/wordprocessingShape" mc:Ignorable="w14 w15 w16se w16cid w16 w16cex w16sdtdh w16sdtfl w16du wp14">
   <w:p>
     <w:pPr>
       <w:pStyle w:val="BodyText"/>
@@ -8194,71 +10769,191 @@
       <w:rPr>
         <w:noProof/>
       </w:rPr>
-      <w:pict w14:anchorId="1E32FCF3">
-        <v:rect id="_x0000_s1027" style="position:absolute;margin-left:13.25pt;margin-top:760.15pt;width:168.95pt;height:13.15pt;z-index:-251658752;visibility:visible;mso-wrap-style:square;mso-wrap-distance-left:0;mso-wrap-distance-top:0;mso-wrap-distance-right:0;mso-wrap-distance-bottom:0;mso-position-horizontal:absolute;mso-position-horizontal-relative:page;mso-position-vertical:absolute;mso-position-vertical-relative:page;v-text-anchor:top" o:gfxdata="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" o:allowincell="f" filled="f" stroked="f" strokeweight="0">
-          <v:textbox inset="0,0,0,0">
-            <w:txbxContent>
-              <w:p>
-                <w:pPr>
-                  <w:pStyle w:val="BodyText"/>
-                  <w:spacing w:before="12"/>
-                  <w:ind w:left="20"/>
-                </w:pPr>
-                <w:r>
-                  <w:t>(BMC,</w:t>
-                </w:r>
-                <w:r>
-                  <w:rPr>
-                    <w:spacing w:val="-5"/>
-                  </w:rPr>
-                  <w:t xml:space="preserve"> </w:t>
-                </w:r>
-                <w:r>
-                  <w:t>DC,</w:t>
-                </w:r>
-                <w:r>
-                  <w:rPr>
-                    <w:spacing w:val="-6"/>
-                  </w:rPr>
-                  <w:t xml:space="preserve"> </w:t>
-                </w:r>
-                <w:r>
-                  <w:t>HC)</w:t>
-                </w:r>
-                <w:r>
-                  <w:rPr>
-                    <w:spacing w:val="-5"/>
-                  </w:rPr>
-                  <w:t xml:space="preserve"> </w:t>
-                </w:r>
-                <w:r>
-                  <w:t>-SP-TC0106</w:t>
-                </w:r>
-                <w:r>
-                  <w:rPr>
-                    <w:spacing w:val="-6"/>
-                  </w:rPr>
-                  <w:t xml:space="preserve"> </w:t>
-                </w:r>
-                <w:r>
-                  <w:rPr>
-                    <w:spacing w:val="-2"/>
-                  </w:rPr>
-                  <w:t>(4/2025)</w:t>
-                </w:r>
-              </w:p>
-            </w:txbxContent>
-          </v:textbox>
-          <w10:wrap anchorx="page" anchory="page"/>
-        </v:rect>
-      </w:pict>
+      <mc:AlternateContent>
+        <mc:Choice Requires="wps">
+          <w:drawing>
+            <wp:anchor distT="0" distB="0" distL="0" distR="0" simplePos="0" relativeHeight="251657728" behindDoc="1" locked="0" layoutInCell="0" allowOverlap="1" wp14:anchorId="1E32FCF3" wp14:editId="7980253C">
+              <wp:simplePos x="0" y="0"/>
+              <wp:positionH relativeFrom="page">
+                <wp:posOffset>168275</wp:posOffset>
+              </wp:positionH>
+              <wp:positionV relativeFrom="page">
+                <wp:posOffset>9653905</wp:posOffset>
+              </wp:positionV>
+              <wp:extent cx="2145665" cy="167005"/>
+              <wp:effectExtent l="0" t="0" r="0" b="0"/>
+              <wp:wrapNone/>
+              <wp:docPr id="565984112" name="Rectangle 3"/>
+              <wp:cNvGraphicFramePr>
+                <a:graphicFrameLocks xmlns:a="http://schemas.openxmlformats.org/drawingml/2006/main"/>
+              </wp:cNvGraphicFramePr>
+              <a:graphic xmlns:a="http://schemas.openxmlformats.org/drawingml/2006/main">
+                <a:graphicData uri="http://schemas.microsoft.com/office/word/2010/wordprocessingShape">
+                  <wps:wsp>
+                    <wps:cNvSpPr>
+                      <a:spLocks/>
+                    </wps:cNvSpPr>
+                    <wps:spPr>
+                      <a:xfrm>
+                        <a:off x="0" y="0"/>
+                        <a:ext cx="2145665" cy="167005"/>
+                      </a:xfrm>
+                      <a:prstGeom prst="rect">
+                        <a:avLst/>
+                      </a:prstGeom>
+                      <a:noFill/>
+                      <a:ln w="0">
+                        <a:noFill/>
+                      </a:ln>
+                    </wps:spPr>
+                    <wps:style>
+                      <a:lnRef idx="0">
+                        <a:scrgbClr r="0" g="0" b="0"/>
+                      </a:lnRef>
+                      <a:fillRef idx="0">
+                        <a:scrgbClr r="0" g="0" b="0"/>
+                      </a:fillRef>
+                      <a:effectRef idx="0">
+                        <a:scrgbClr r="0" g="0" b="0"/>
+                      </a:effectRef>
+                      <a:fontRef idx="minor"/>
+                    </wps:style>
+                    <wps:txbx>
+                      <w:txbxContent>
+                        <w:p>
+                          <w:pPr>
+                            <w:pStyle w:val="BodyText"/>
+                            <w:spacing w:before="12"/>
+                            <w:ind w:left="20"/>
+                          </w:pPr>
+                          <w:r>
+                            <w:t>(BMC,</w:t>
+                          </w:r>
+                          <w:r>
+                            <w:rPr>
+                              <w:spacing w:val="-5"/>
+                            </w:rPr>
+                            <w:t xml:space="preserve"> </w:t>
+                          </w:r>
+                          <w:r>
+                            <w:t>DC,</w:t>
+                          </w:r>
+                          <w:r>
+                            <w:rPr>
+                              <w:spacing w:val="-6"/>
+                            </w:rPr>
+                            <w:t xml:space="preserve"> </w:t>
+                          </w:r>
+                          <w:r>
+                            <w:t>HC)</w:t>
+                          </w:r>
+                          <w:r>
+                            <w:rPr>
+                              <w:spacing w:val="-5"/>
+                            </w:rPr>
+                            <w:t xml:space="preserve"> </w:t>
+                          </w:r>
+                          <w:r>
+                            <w:t>-SP-TC0106</w:t>
+                          </w:r>
+                          <w:r>
+                            <w:rPr>
+                              <w:spacing w:val="-6"/>
+                            </w:rPr>
+                            <w:t xml:space="preserve"> </w:t>
+                          </w:r>
+                          <w:r>
+                            <w:rPr>
+                              <w:spacing w:val="-2"/>
+                            </w:rPr>
+                            <w:t>(4/2025)</w:t>
+                          </w:r>
+                        </w:p>
+                      </w:txbxContent>
+                    </wps:txbx>
+                    <wps:bodyPr lIns="0" tIns="0" rIns="0" bIns="0" anchor="t">
+                      <a:noAutofit/>
+                    </wps:bodyPr>
+                  </wps:wsp>
+                </a:graphicData>
+              </a:graphic>
+              <wp14:sizeRelH relativeFrom="page">
+                <wp14:pctWidth>0</wp14:pctWidth>
+              </wp14:sizeRelH>
+              <wp14:sizeRelV relativeFrom="page">
+                <wp14:pctHeight>0</wp14:pctHeight>
+              </wp14:sizeRelV>
+            </wp:anchor>
+          </w:drawing>
+        </mc:Choice>
+        <mc:Fallback>
+          <w:pict>
+            <v:rect w14:anchorId="1E32FCF3" id="Rectangle 3" o:spid="_x0000_s1028" style="position:absolute;margin-left:13.25pt;margin-top:760.15pt;width:168.95pt;height:13.15pt;z-index:-251658752;visibility:visible;mso-wrap-style:square;mso-width-percent:0;mso-height-percent:0;mso-wrap-distance-left:0;mso-wrap-distance-top:0;mso-wrap-distance-right:0;mso-wrap-distance-bottom:0;mso-position-horizontal:absolute;mso-position-horizontal-relative:page;mso-position-vertical:absolute;mso-position-vertical-relative:page;mso-width-percent:0;mso-height-percent:0;mso-width-relative:page;mso-height-relative:page;v-text-anchor:top" o:gfxdata="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" o:allowincell="f" filled="f" stroked="f" strokeweight="0">
+              <v:textbox inset="0,0,0,0">
+                <w:txbxContent>
+                  <w:p>
+                    <w:pPr>
+                      <w:pStyle w:val="BodyText"/>
+                      <w:spacing w:before="12"/>
+                      <w:ind w:left="20"/>
+                    </w:pPr>
+                    <w:r>
+                      <w:t>(BMC,</w:t>
+                    </w:r>
+                    <w:r>
+                      <w:rPr>
+                        <w:spacing w:val="-5"/>
+                      </w:rPr>
+                      <w:t xml:space="preserve"> </w:t>
+                    </w:r>
+                    <w:r>
+                      <w:t>DC,</w:t>
+                    </w:r>
+                    <w:r>
+                      <w:rPr>
+                        <w:spacing w:val="-6"/>
+                      </w:rPr>
+                      <w:t xml:space="preserve"> </w:t>
+                    </w:r>
+                    <w:r>
+                      <w:t>HC)</w:t>
+                    </w:r>
+                    <w:r>
+                      <w:rPr>
+                        <w:spacing w:val="-5"/>
+                      </w:rPr>
+                      <w:t xml:space="preserve"> </w:t>
+                    </w:r>
+                    <w:r>
+                      <w:t>-SP-TC0106</w:t>
+                    </w:r>
+                    <w:r>
+                      <w:rPr>
+                        <w:spacing w:val="-6"/>
+                      </w:rPr>
+                      <w:t xml:space="preserve"> </w:t>
+                    </w:r>
+                    <w:r>
+                      <w:rPr>
+                        <w:spacing w:val="-2"/>
+                      </w:rPr>
+                      <w:t>(4/2025)</w:t>
+                    </w:r>
+                  </w:p>
+                </w:txbxContent>
+              </v:textbox>
+              <w10:wrap anchorx="page" anchory="page"/>
+            </v:rect>
+          </w:pict>
+        </mc:Fallback>
+      </mc:AlternateContent>
     </w:r>
   </w:p>
 </w:ftr>
 </file>
 
 <file path=word/footer6.xml><?xml version="1.0" encoding="utf-8"?>
-<w:ftr xmlns:wpc="http://schemas.microsoft.com/office/word/2010/wordprocessingCanvas" xmlns:cx="http://schemas.microsoft.com/office/drawing/2014/chartex" xmlns:cx1="http://schemas.microsoft.com/office/drawing/2015/9/8/chartex" xmlns:cx2="http://schemas.microsoft.com/office/drawing/2015/10/21/chartex" xmlns:cx3="http://schemas.microsoft.com/office/drawing/2016/5/9/chartex" xmlns:cx4="http://schemas.microsoft.com/office/drawing/2016/5/10/chartex" xmlns:cx5="http://schemas.microsoft.com/office/drawing/2016/5/11/chartex" xmlns:cx6="http://schemas.microsoft.com/office/drawing/2016/5/12/chartex" xmlns:cx7="http://schemas.microsoft.com/office/drawing/2016/5/13/chartex" xmlns:cx8="http://schemas.microsoft.com/office/drawing/2016/5/14/chartex" xmlns:mc="http://schemas.openxmlformats.org/markup-compatibility/2006" xmlns:aink="http://schemas.microsoft.com/office/drawing/2016/ink" xmlns:am3d="http://schemas.microsoft.com/office/drawing/2017/model3d" xmlns:o="urn:schemas-microsoft-com:office:office" xmlns:oel="http://schemas.microsoft.com/office/2019/extlst" xmlns:r="http://schemas.openxmlformats.org/officeDocument/2006/relationships" xmlns:m="http://schemas.openxmlformats.org/officeDocument/2006/math" xmlns:v="urn:schemas-microsoft-com:vml" xmlns:wp14="http://schemas.microsoft.com/office/word/2010/wordprocessingDrawing" xmlns:wp="http://schemas.openxmlformats.org/drawingml/2006/wordprocessingDrawing" xmlns:w10="urn:schemas-microsoft-com:office:word" xmlns:w="http://schemas.openxmlformats.org/wordprocessingml/2006/main" xmlns:w14="http://schemas.microsoft.com/office/word/2010/wordml" xmlns:w15="http://schemas.microsoft.com/office/word/2012/wordml" xmlns:w16cex="http://schemas.microsoft.com/office/word/2018/wordml/cex" xmlns:w16cid="http://schemas.microsoft.com/office/word/2016/wordml/cid" xmlns:w16="http://schemas.microsoft.com/office/word/2018/wordml" xmlns:w16du="http://schemas.microsoft.com/office/word/2023/wordml/word16du" xmlns:w16sdtdh="http://schemas.microsoft.com/office/word/2020/wordml/sdtdatahash" xmlns:w16se="http://schemas.microsoft.com/office/word/2015/wordml/symex" xmlns:wpg="http://schemas.microsoft.com/office/word/2010/wordprocessingGroup" xmlns:wpi="http://schemas.microsoft.com/office/word/2010/wordprocessingInk" xmlns:wne="http://schemas.microsoft.com/office/word/2006/wordml" xmlns:wps="http://schemas.microsoft.com/office/word/2010/wordprocessingShape" mc:Ignorable="w14 w15 w16se w16cid w16 w16cex w16sdtdh w16du wp14">
+<w:ftr xmlns:wpc="http://schemas.microsoft.com/office/word/2010/wordprocessingCanvas" xmlns:cx="http://schemas.microsoft.com/office/drawing/2014/chartex" xmlns:cx1="http://schemas.microsoft.com/office/drawing/2015/9/8/chartex" xmlns:cx2="http://schemas.microsoft.com/office/drawing/2015/10/21/chartex" xmlns:cx3="http://schemas.microsoft.com/office/drawing/2016/5/9/chartex" xmlns:cx4="http://schemas.microsoft.com/office/drawing/2016/5/10/chartex" xmlns:cx5="http://schemas.microsoft.com/office/drawing/2016/5/11/chartex" xmlns:cx6="http://schemas.microsoft.com/office/drawing/2016/5/12/chartex" xmlns:cx7="http://schemas.microsoft.com/office/drawing/2016/5/13/chartex" xmlns:cx8="http://schemas.microsoft.com/office/drawing/2016/5/14/chartex" xmlns:mc="http://schemas.openxmlformats.org/markup-compatibility/2006" xmlns:aink="http://schemas.microsoft.com/office/drawing/2016/ink" xmlns:am3d="http://schemas.microsoft.com/office/drawing/2017/model3d" xmlns:o="urn:schemas-microsoft-com:office:office" xmlns:oel="http://schemas.microsoft.com/office/2019/extlst" xmlns:r="http://schemas.openxmlformats.org/officeDocument/2006/relationships" xmlns:m="http://schemas.openxmlformats.org/officeDocument/2006/math" xmlns:v="urn:schemas-microsoft-com:vml" xmlns:wp14="http://schemas.microsoft.com/office/word/2010/wordprocessingDrawing" xmlns:wp="http://schemas.openxmlformats.org/drawingml/2006/wordprocessingDrawing" xmlns:w10="urn:schemas-microsoft-com:office:word" xmlns:w="http://schemas.openxmlformats.org/wordprocessingml/2006/main" xmlns:w14="http://schemas.microsoft.com/office/word/2010/wordml" xmlns:w15="http://schemas.microsoft.com/office/word/2012/wordml" xmlns:w16cex="http://schemas.microsoft.com/office/word/2018/wordml/cex" xmlns:w16cid="http://schemas.microsoft.com/office/word/2016/wordml/cid" xmlns:w16="http://schemas.microsoft.com/office/word/2018/wordml" xmlns:w16du="http://schemas.microsoft.com/office/word/2023/wordml/word16du" xmlns:w16sdtdh="http://schemas.microsoft.com/office/word/2020/wordml/sdtdatahash" xmlns:w16sdtfl="http://schemas.microsoft.com/office/word/2024/wordml/sdtformatlock" xmlns:w16se="http://schemas.microsoft.com/office/word/2015/wordml/symex" xmlns:wpg="http://schemas.microsoft.com/office/word/2010/wordprocessingGroup" xmlns:wpi="http://schemas.microsoft.com/office/word/2010/wordprocessingInk" xmlns:wne="http://schemas.microsoft.com/office/word/2006/wordml" xmlns:wps="http://schemas.microsoft.com/office/word/2010/wordprocessingShape" mc:Ignorable="w14 w15 w16se w16cid w16 w16cex w16sdtdh w16sdtfl w16du wp14">
   <w:p>
     <w:pPr>
       <w:pStyle w:val="BodyText"/>
@@ -8268,71 +10963,191 @@
       <w:rPr>
         <w:noProof/>
       </w:rPr>
-      <w:pict w14:anchorId="6AECC534">
-        <v:rect id="_x0000_s1026" style="position:absolute;margin-left:13.25pt;margin-top:760.15pt;width:168.95pt;height:13.15pt;z-index:-251657728;visibility:visible;mso-wrap-style:square;mso-wrap-distance-left:0;mso-wrap-distance-top:0;mso-wrap-distance-right:0;mso-wrap-distance-bottom:0;mso-position-horizontal:absolute;mso-position-horizontal-relative:page;mso-position-vertical:absolute;mso-position-vertical-relative:page;v-text-anchor:top" o:gfxdata="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" o:allowincell="f" filled="f" stroked="f" strokeweight="0">
-          <v:textbox inset="0,0,0,0">
-            <w:txbxContent>
-              <w:p>
-                <w:pPr>
-                  <w:pStyle w:val="BodyText"/>
-                  <w:spacing w:before="12"/>
-                  <w:ind w:left="20"/>
-                </w:pPr>
-                <w:r>
-                  <w:t>(BMC,</w:t>
-                </w:r>
-                <w:r>
-                  <w:rPr>
-                    <w:spacing w:val="-5"/>
-                  </w:rPr>
-                  <w:t xml:space="preserve"> </w:t>
-                </w:r>
-                <w:r>
-                  <w:t>DC,</w:t>
-                </w:r>
-                <w:r>
-                  <w:rPr>
-                    <w:spacing w:val="-6"/>
-                  </w:rPr>
-                  <w:t xml:space="preserve"> </w:t>
-                </w:r>
-                <w:r>
-                  <w:t>HC)</w:t>
-                </w:r>
-                <w:r>
-                  <w:rPr>
-                    <w:spacing w:val="-5"/>
-                  </w:rPr>
-                  <w:t xml:space="preserve"> </w:t>
-                </w:r>
-                <w:r>
-                  <w:t>-SP-TC0106</w:t>
-                </w:r>
-                <w:r>
-                  <w:rPr>
-                    <w:spacing w:val="-6"/>
-                  </w:rPr>
-                  <w:t xml:space="preserve"> </w:t>
-                </w:r>
-                <w:r>
-                  <w:rPr>
-                    <w:spacing w:val="-2"/>
-                  </w:rPr>
-                  <w:t>(4/2025)</w:t>
-                </w:r>
-              </w:p>
-            </w:txbxContent>
-          </v:textbox>
-          <w10:wrap anchorx="page" anchory="page"/>
-        </v:rect>
-      </w:pict>
+      <mc:AlternateContent>
+        <mc:Choice Requires="wps">
+          <w:drawing>
+            <wp:anchor distT="0" distB="0" distL="0" distR="0" simplePos="0" relativeHeight="251658752" behindDoc="1" locked="0" layoutInCell="0" allowOverlap="1" wp14:anchorId="6AECC534" wp14:editId="39374647">
+              <wp:simplePos x="0" y="0"/>
+              <wp:positionH relativeFrom="page">
+                <wp:posOffset>168275</wp:posOffset>
+              </wp:positionH>
+              <wp:positionV relativeFrom="page">
+                <wp:posOffset>9653905</wp:posOffset>
+              </wp:positionV>
+              <wp:extent cx="2145665" cy="167005"/>
+              <wp:effectExtent l="0" t="0" r="0" b="0"/>
+              <wp:wrapNone/>
+              <wp:docPr id="1607640802" name="Rectangle 1"/>
+              <wp:cNvGraphicFramePr>
+                <a:graphicFrameLocks xmlns:a="http://schemas.openxmlformats.org/drawingml/2006/main"/>
+              </wp:cNvGraphicFramePr>
+              <a:graphic xmlns:a="http://schemas.openxmlformats.org/drawingml/2006/main">
+                <a:graphicData uri="http://schemas.microsoft.com/office/word/2010/wordprocessingShape">
+                  <wps:wsp>
+                    <wps:cNvSpPr>
+                      <a:spLocks/>
+                    </wps:cNvSpPr>
+                    <wps:spPr>
+                      <a:xfrm>
+                        <a:off x="0" y="0"/>
+                        <a:ext cx="2145665" cy="167005"/>
+                      </a:xfrm>
+                      <a:prstGeom prst="rect">
+                        <a:avLst/>
+                      </a:prstGeom>
+                      <a:noFill/>
+                      <a:ln w="0">
+                        <a:noFill/>
+                      </a:ln>
+                    </wps:spPr>
+                    <wps:style>
+                      <a:lnRef idx="0">
+                        <a:scrgbClr r="0" g="0" b="0"/>
+                      </a:lnRef>
+                      <a:fillRef idx="0">
+                        <a:scrgbClr r="0" g="0" b="0"/>
+                      </a:fillRef>
+                      <a:effectRef idx="0">
+                        <a:scrgbClr r="0" g="0" b="0"/>
+                      </a:effectRef>
+                      <a:fontRef idx="minor"/>
+                    </wps:style>
+                    <wps:txbx>
+                      <w:txbxContent>
+                        <w:p>
+                          <w:pPr>
+                            <w:pStyle w:val="BodyText"/>
+                            <w:spacing w:before="12"/>
+                            <w:ind w:left="20"/>
+                          </w:pPr>
+                          <w:r>
+                            <w:t>(BMC,</w:t>
+                          </w:r>
+                          <w:r>
+                            <w:rPr>
+                              <w:spacing w:val="-5"/>
+                            </w:rPr>
+                            <w:t xml:space="preserve"> </w:t>
+                          </w:r>
+                          <w:r>
+                            <w:t>DC,</w:t>
+                          </w:r>
+                          <w:r>
+                            <w:rPr>
+                              <w:spacing w:val="-6"/>
+                            </w:rPr>
+                            <w:t xml:space="preserve"> </w:t>
+                          </w:r>
+                          <w:r>
+                            <w:t>HC)</w:t>
+                          </w:r>
+                          <w:r>
+                            <w:rPr>
+                              <w:spacing w:val="-5"/>
+                            </w:rPr>
+                            <w:t xml:space="preserve"> </w:t>
+                          </w:r>
+                          <w:r>
+                            <w:t>-SP-TC0106</w:t>
+                          </w:r>
+                          <w:r>
+                            <w:rPr>
+                              <w:spacing w:val="-6"/>
+                            </w:rPr>
+                            <w:t xml:space="preserve"> </w:t>
+                          </w:r>
+                          <w:r>
+                            <w:rPr>
+                              <w:spacing w:val="-2"/>
+                            </w:rPr>
+                            <w:t>(4/2025)</w:t>
+                          </w:r>
+                        </w:p>
+                      </w:txbxContent>
+                    </wps:txbx>
+                    <wps:bodyPr lIns="0" tIns="0" rIns="0" bIns="0" anchor="t">
+                      <a:noAutofit/>
+                    </wps:bodyPr>
+                  </wps:wsp>
+                </a:graphicData>
+              </a:graphic>
+              <wp14:sizeRelH relativeFrom="page">
+                <wp14:pctWidth>0</wp14:pctWidth>
+              </wp14:sizeRelH>
+              <wp14:sizeRelV relativeFrom="page">
+                <wp14:pctHeight>0</wp14:pctHeight>
+              </wp14:sizeRelV>
+            </wp:anchor>
+          </w:drawing>
+        </mc:Choice>
+        <mc:Fallback>
+          <w:pict>
+            <v:rect w14:anchorId="6AECC534" id="Rectangle 1" o:spid="_x0000_s1029" style="position:absolute;margin-left:13.25pt;margin-top:760.15pt;width:168.95pt;height:13.15pt;z-index:-251657728;visibility:visible;mso-wrap-style:square;mso-width-percent:0;mso-height-percent:0;mso-wrap-distance-left:0;mso-wrap-distance-top:0;mso-wrap-distance-right:0;mso-wrap-distance-bottom:0;mso-position-horizontal:absolute;mso-position-horizontal-relative:page;mso-position-vertical:absolute;mso-position-vertical-relative:page;mso-width-percent:0;mso-height-percent:0;mso-width-relative:page;mso-height-relative:page;v-text-anchor:top" o:gfxdata="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" o:allowincell="f" filled="f" stroked="f" strokeweight="0">
+              <v:textbox inset="0,0,0,0">
+                <w:txbxContent>
+                  <w:p>
+                    <w:pPr>
+                      <w:pStyle w:val="BodyText"/>
+                      <w:spacing w:before="12"/>
+                      <w:ind w:left="20"/>
+                    </w:pPr>
+                    <w:r>
+                      <w:t>(BMC,</w:t>
+                    </w:r>
+                    <w:r>
+                      <w:rPr>
+                        <w:spacing w:val="-5"/>
+                      </w:rPr>
+                      <w:t xml:space="preserve"> </w:t>
+                    </w:r>
+                    <w:r>
+                      <w:t>DC,</w:t>
+                    </w:r>
+                    <w:r>
+                      <w:rPr>
+                        <w:spacing w:val="-6"/>
+                      </w:rPr>
+                      <w:t xml:space="preserve"> </w:t>
+                    </w:r>
+                    <w:r>
+                      <w:t>HC)</w:t>
+                    </w:r>
+                    <w:r>
+                      <w:rPr>
+                        <w:spacing w:val="-5"/>
+                      </w:rPr>
+                      <w:t xml:space="preserve"> </w:t>
+                    </w:r>
+                    <w:r>
+                      <w:t>-SP-TC0106</w:t>
+                    </w:r>
+                    <w:r>
+                      <w:rPr>
+                        <w:spacing w:val="-6"/>
+                      </w:rPr>
+                      <w:t xml:space="preserve"> </w:t>
+                    </w:r>
+                    <w:r>
+                      <w:rPr>
+                        <w:spacing w:val="-2"/>
+                      </w:rPr>
+                      <w:t>(4/2025)</w:t>
+                    </w:r>
+                  </w:p>
+                </w:txbxContent>
+              </v:textbox>
+              <w10:wrap anchorx="page" anchory="page"/>
+            </v:rect>
+          </w:pict>
+        </mc:Fallback>
+      </mc:AlternateContent>
     </w:r>
   </w:p>
 </w:ftr>
 </file>
 
 <file path=word/footnotes.xml><?xml version="1.0" encoding="utf-8"?>
-<w:footnotes xmlns:wpc="http://schemas.microsoft.com/office/word/2010/wordprocessingCanvas" xmlns:cx="http://schemas.microsoft.com/office/drawing/2014/chartex" xmlns:cx1="http://schemas.microsoft.com/office/drawing/2015/9/8/chartex" xmlns:cx2="http://schemas.microsoft.com/office/drawing/2015/10/21/chartex" xmlns:cx3="http://schemas.microsoft.com/office/drawing/2016/5/9/chartex" xmlns:cx4="http://schemas.microsoft.com/office/drawing/2016/5/10/chartex" xmlns:cx5="http://schemas.microsoft.com/office/drawing/2016/5/11/chartex" xmlns:cx6="http://schemas.microsoft.com/office/drawing/2016/5/12/chartex" xmlns:cx7="http://schemas.microsoft.com/office/drawing/2016/5/13/chartex" xmlns:cx8="http://schemas.microsoft.com/office/drawing/2016/5/14/chartex" xmlns:mc="http://schemas.openxmlformats.org/markup-compatibility/2006" xmlns:aink="http://schemas.microsoft.com/office/drawing/2016/ink" xmlns:am3d="http://schemas.microsoft.com/office/drawing/2017/model3d" xmlns:o="urn:schemas-microsoft-com:office:office" xmlns:oel="http://schemas.microsoft.com/office/2019/extlst" xmlns:r="http://schemas.openxmlformats.org/officeDocument/2006/relationships" xmlns:m="http://schemas.openxmlformats.org/officeDocument/2006/math" xmlns:v="urn:schemas-microsoft-com:vml" xmlns:wp14="http://schemas.microsoft.com/office/word/2010/wordprocessingDrawing" xmlns:wp="http://schemas.openxmlformats.org/drawingml/2006/wordprocessingDrawing" xmlns:w10="urn:schemas-microsoft-com:office:word" xmlns:w="http://schemas.openxmlformats.org/wordprocessingml/2006/main" xmlns:w14="http://schemas.microsoft.com/office/word/2010/wordml" xmlns:w15="http://schemas.microsoft.com/office/word/2012/wordml" xmlns:w16cex="http://schemas.microsoft.com/office/word/2018/wordml/cex" xmlns:w16cid="http://schemas.microsoft.com/office/word/2016/wordml/cid" xmlns:w16="http://schemas.microsoft.com/office/word/2018/wordml" xmlns:w16du="http://schemas.microsoft.com/office/word/2023/wordml/word16du" xmlns:w16sdtdh="http://schemas.microsoft.com/office/word/2020/wordml/sdtdatahash" xmlns:w16se="http://schemas.microsoft.com/office/word/2015/wordml/symex" xmlns:wpg="http://schemas.microsoft.com/office/word/2010/wordprocessingGroup" xmlns:wpi="http://schemas.microsoft.com/office/word/2010/wordprocessingInk" xmlns:wne="http://schemas.microsoft.com/office/word/2006/wordml" xmlns:wps="http://schemas.microsoft.com/office/word/2010/wordprocessingShape" mc:Ignorable="w14 w15 w16se w16cid w16 w16cex w16sdtdh w16du wp14">
+<w:footnotes xmlns:wpc="http://schemas.microsoft.com/office/word/2010/wordprocessingCanvas" xmlns:cx="http://schemas.microsoft.com/office/drawing/2014/chartex" xmlns:cx1="http://schemas.microsoft.com/office/drawing/2015/9/8/chartex" xmlns:cx2="http://schemas.microsoft.com/office/drawing/2015/10/21/chartex" xmlns:cx3="http://schemas.microsoft.com/office/drawing/2016/5/9/chartex" xmlns:cx4="http://schemas.microsoft.com/office/drawing/2016/5/10/chartex" xmlns:cx5="http://schemas.microsoft.com/office/drawing/2016/5/11/chartex" xmlns:cx6="http://schemas.microsoft.com/office/drawing/2016/5/12/chartex" xmlns:cx7="http://schemas.microsoft.com/office/drawing/2016/5/13/chartex" xmlns:cx8="http://schemas.microsoft.com/office/drawing/2016/5/14/chartex" xmlns:mc="http://schemas.openxmlformats.org/markup-compatibility/2006" xmlns:aink="http://schemas.microsoft.com/office/drawing/2016/ink" xmlns:am3d="http://schemas.microsoft.com/office/drawing/2017/model3d" xmlns:o="urn:schemas-microsoft-com:office:office" xmlns:oel="http://schemas.microsoft.com/office/2019/extlst" xmlns:r="http://schemas.openxmlformats.org/officeDocument/2006/relationships" xmlns:m="http://schemas.openxmlformats.org/officeDocument/2006/math" xmlns:v="urn:schemas-microsoft-com:vml" xmlns:wp14="http://schemas.microsoft.com/office/word/2010/wordprocessingDrawing" xmlns:wp="http://schemas.openxmlformats.org/drawingml/2006/wordprocessingDrawing" xmlns:w10="urn:schemas-microsoft-com:office:word" xmlns:w="http://schemas.openxmlformats.org/wordprocessingml/2006/main" xmlns:w14="http://schemas.microsoft.com/office/word/2010/wordml" xmlns:w15="http://schemas.microsoft.com/office/word/2012/wordml" xmlns:w16cex="http://schemas.microsoft.com/office/word/2018/wordml/cex" xmlns:w16cid="http://schemas.microsoft.com/office/word/2016/wordml/cid" xmlns:w16="http://schemas.microsoft.com/office/word/2018/wordml" xmlns:w16du="http://schemas.microsoft.com/office/word/2023/wordml/word16du" xmlns:w16sdtdh="http://schemas.microsoft.com/office/word/2020/wordml/sdtdatahash" xmlns:w16sdtfl="http://schemas.microsoft.com/office/word/2024/wordml/sdtformatlock" xmlns:w16se="http://schemas.microsoft.com/office/word/2015/wordml/symex" xmlns:wpg="http://schemas.microsoft.com/office/word/2010/wordprocessingGroup" xmlns:wpi="http://schemas.microsoft.com/office/word/2010/wordprocessingInk" xmlns:wne="http://schemas.microsoft.com/office/word/2006/wordml" xmlns:wps="http://schemas.microsoft.com/office/word/2010/wordprocessingShape" mc:Ignorable="w14 w15 w16se w16cid w16 w16cex w16sdtdh w16sdtfl w16du wp14">
   <w:footnote w:type="separator" w:id="-1">
     <w:p>
       <w:r>
@@ -8351,7 +11166,7 @@
 </file>
 
 <file path=word/numbering.xml><?xml version="1.0" encoding="utf-8"?>
-<w:numbering xmlns:wpc="http://schemas.microsoft.com/office/word/2010/wordprocessingCanvas" xmlns:cx="http://schemas.microsoft.com/office/drawing/2014/chartex" xmlns:cx1="http://schemas.microsoft.com/office/drawing/2015/9/8/chartex" xmlns:cx2="http://schemas.microsoft.com/office/drawing/2015/10/21/chartex" xmlns:cx3="http://schemas.microsoft.com/office/drawing/2016/5/9/chartex" xmlns:cx4="http://schemas.microsoft.com/office/drawing/2016/5/10/chartex" xmlns:cx5="http://schemas.microsoft.com/office/drawing/2016/5/11/chartex" xmlns:cx6="http://schemas.microsoft.com/office/drawing/2016/5/12/chartex" xmlns:cx7="http://schemas.microsoft.com/office/drawing/2016/5/13/chartex" xmlns:cx8="http://schemas.microsoft.com/office/drawing/2016/5/14/chartex" xmlns:mc="http://schemas.openxmlformats.org/markup-compatibility/2006" xmlns:aink="http://schemas.microsoft.com/office/drawing/2016/ink" xmlns:am3d="http://schemas.microsoft.com/office/drawing/2017/model3d" xmlns:o="urn:schemas-microsoft-com:office:office" xmlns:oel="http://schemas.microsoft.com/office/2019/extlst" xmlns:r="http://schemas.openxmlformats.org/officeDocument/2006/relationships" xmlns:m="http://schemas.openxmlformats.org/officeDocument/2006/math" xmlns:v="urn:schemas-microsoft-com:vml" xmlns:wp14="http://schemas.microsoft.com/office/word/2010/wordprocessingDrawing" xmlns:wp="http://schemas.openxmlformats.org/drawingml/2006/wordprocessingDrawing" xmlns:w10="urn:schemas-microsoft-com:office:word" xmlns:w="http://schemas.openxmlformats.org/wordprocessingml/2006/main" xmlns:w14="http://schemas.microsoft.com/office/word/2010/wordml" xmlns:w15="http://schemas.microsoft.com/office/word/2012/wordml" xmlns:w16cex="http://schemas.microsoft.com/office/word/2018/wordml/cex" xmlns:w16cid="http://schemas.microsoft.com/office/word/2016/wordml/cid" xmlns:w16="http://schemas.microsoft.com/office/word/2018/wordml" xmlns:w16du="http://schemas.microsoft.com/office/word/2023/wordml/word16du" xmlns:w16sdtdh="http://schemas.microsoft.com/office/word/2020/wordml/sdtdatahash" xmlns:w16se="http://schemas.microsoft.com/office/word/2015/wordml/symex" xmlns:wpg="http://schemas.microsoft.com/office/word/2010/wordprocessingGroup" xmlns:wpi="http://schemas.microsoft.com/office/word/2010/wordprocessingInk" xmlns:wne="http://schemas.microsoft.com/office/word/2006/wordml" xmlns:wps="http://schemas.microsoft.com/office/word/2010/wordprocessingShape" mc:Ignorable="w14 w15 w16se w16cid w16 w16cex w16sdtdh w16du wp14">
+<w:numbering xmlns:wpc="http://schemas.microsoft.com/office/word/2010/wordprocessingCanvas" xmlns:cx="http://schemas.microsoft.com/office/drawing/2014/chartex" xmlns:cx1="http://schemas.microsoft.com/office/drawing/2015/9/8/chartex" xmlns:cx2="http://schemas.microsoft.com/office/drawing/2015/10/21/chartex" xmlns:cx3="http://schemas.microsoft.com/office/drawing/2016/5/9/chartex" xmlns:cx4="http://schemas.microsoft.com/office/drawing/2016/5/10/chartex" xmlns:cx5="http://schemas.microsoft.com/office/drawing/2016/5/11/chartex" xmlns:cx6="http://schemas.microsoft.com/office/drawing/2016/5/12/chartex" xmlns:cx7="http://schemas.microsoft.com/office/drawing/2016/5/13/chartex" xmlns:cx8="http://schemas.microsoft.com/office/drawing/2016/5/14/chartex" xmlns:mc="http://schemas.openxmlformats.org/markup-compatibility/2006" xmlns:aink="http://schemas.microsoft.com/office/drawing/2016/ink" xmlns:am3d="http://schemas.microsoft.com/office/drawing/2017/model3d" xmlns:o="urn:schemas-microsoft-com:office:office" xmlns:oel="http://schemas.microsoft.com/office/2019/extlst" xmlns:r="http://schemas.openxmlformats.org/officeDocument/2006/relationships" xmlns:m="http://schemas.openxmlformats.org/officeDocument/2006/math" xmlns:v="urn:schemas-microsoft-com:vml" xmlns:wp14="http://schemas.microsoft.com/office/word/2010/wordprocessingDrawing" xmlns:wp="http://schemas.openxmlformats.org/drawingml/2006/wordprocessingDrawing" xmlns:w10="urn:schemas-microsoft-com:office:word" xmlns:w="http://schemas.openxmlformats.org/wordprocessingml/2006/main" xmlns:w14="http://schemas.microsoft.com/office/word/2010/wordml" xmlns:w15="http://schemas.microsoft.com/office/word/2012/wordml" xmlns:w16cex="http://schemas.microsoft.com/office/word/2018/wordml/cex" xmlns:w16cid="http://schemas.microsoft.com/office/word/2016/wordml/cid" xmlns:w16="http://schemas.microsoft.com/office/word/2018/wordml" xmlns:w16du="http://schemas.microsoft.com/office/word/2023/wordml/word16du" xmlns:w16sdtdh="http://schemas.microsoft.com/office/word/2020/wordml/sdtdatahash" xmlns:w16sdtfl="http://schemas.microsoft.com/office/word/2024/wordml/sdtformatlock" xmlns:w16se="http://schemas.microsoft.com/office/word/2015/wordml/symex" xmlns:wpg="http://schemas.microsoft.com/office/word/2010/wordprocessingGroup" xmlns:wpi="http://schemas.microsoft.com/office/word/2010/wordprocessingInk" xmlns:wne="http://schemas.microsoft.com/office/word/2006/wordml" xmlns:wps="http://schemas.microsoft.com/office/word/2010/wordprocessingShape" mc:Ignorable="w14 w15 w16se w16cid w16 w16cex w16sdtdh w16sdtfl w16du wp14">
   <w:abstractNum w:abstractNumId="0" w15:restartNumberingAfterBreak="0">
     <w:nsid w:val="12E8780B"/>
     <w:multiLevelType w:val="multilevel"/>
@@ -8608,7 +11423,7 @@
 </file>
 
 <file path=word/styles.xml><?xml version="1.0" encoding="utf-8"?>
-<w:styles xmlns:mc="http://schemas.openxmlformats.org/markup-compatibility/2006" xmlns:r="http://schemas.openxmlformats.org/officeDocument/2006/relationships" xmlns:w="http://schemas.openxmlformats.org/wordprocessingml/2006/main" xmlns:w14="http://schemas.microsoft.com/office/word/2010/wordml" xmlns:w15="http://schemas.microsoft.com/office/word/2012/wordml" xmlns:w16cex="http://schemas.microsoft.com/office/word/2018/wordml/cex" xmlns:w16cid="http://schemas.microsoft.com/office/word/2016/wordml/cid" xmlns:w16="http://schemas.microsoft.com/office/word/2018/wordml" xmlns:w16du="http://schemas.microsoft.com/office/word/2023/wordml/word16du" xmlns:w16sdtdh="http://schemas.microsoft.com/office/word/2020/wordml/sdtdatahash" xmlns:w16se="http://schemas.microsoft.com/office/word/2015/wordml/symex" mc:Ignorable="w14 w15 w16se w16cid w16 w16cex w16sdtdh w16du">
+<w:styles xmlns:mc="http://schemas.openxmlformats.org/markup-compatibility/2006" xmlns:r="http://schemas.openxmlformats.org/officeDocument/2006/relationships" xmlns:w="http://schemas.openxmlformats.org/wordprocessingml/2006/main" xmlns:w14="http://schemas.microsoft.com/office/word/2010/wordml" xmlns:w15="http://schemas.microsoft.com/office/word/2012/wordml" xmlns:w16cex="http://schemas.microsoft.com/office/word/2018/wordml/cex" xmlns:w16cid="http://schemas.microsoft.com/office/word/2016/wordml/cid" xmlns:w16="http://schemas.microsoft.com/office/word/2018/wordml" xmlns:w16du="http://schemas.microsoft.com/office/word/2023/wordml/word16du" xmlns:w16sdtdh="http://schemas.microsoft.com/office/word/2020/wordml/sdtdatahash" xmlns:w16sdtfl="http://schemas.microsoft.com/office/word/2024/wordml/sdtformatlock" xmlns:w16se="http://schemas.microsoft.com/office/word/2015/wordml/symex" mc:Ignorable="w14 w15 w16se w16cid w16 w16cex w16sdtdh w16sdtfl w16du">
   <w:docDefaults>
     <w:rPrDefault>
       <w:rPr>

</xml_diff>